<commit_message>
report: bench breadboard wiring figure, corrected OS-T3/T4, glossary, proofreading
- Breadboard wiring figure (Fritzing parts, signed Nhom 3 Stars): Pi 5 UART
  pins 8/10 <-> PA10/PA9 at 921600 baud, LEDs D4/D5/D6/D9 = PB5/PB4/PB10/PC7,
  MPU6050 I2C1 PB6/PB7 (wired, unused by OS firmware), Camera v2 on CAM/DISP 0.
- OS-T3/T4: report the deadline-miss fraction and time-average/peak AoI that
  the summaries do contain; state the FAIL causes.
- Glossary additions, Vietnamese proofreading, table renumbering.
- Raw Pi results for OS-T2 (29/10), OS-T1, OS-T3, OS-T4.
- Presentation split for the 2/11 talk.

Co-Authored-By: Claude Opus 5.5 <noreply@anthropic.com>
</commit_message>
<xml_diff>
--- a/report_vi/BaoCao_HDH_Nhom3Stars_GiuaKy.docx
+++ b/report_vi/BaoCao_HDH_Nhom3Stars_GiuaKy.docx
@@ -335,7 +335,7 @@
       <w:pPr/>
       <w:r>
         <w:rPr/>
-        <w:t xml:space="preserve">Báo cáo giữa kỳ cập nhật đến ngày 31/10/2026, trình bày nền tảng thực thi Edge-AI không đồng nhất đang trong quá trình triển khai cho học phần Hệ điều hành. Nhóm dùng Raspberry Pi chạy Ubuntu để xử lý inference, trong khi STM32 chạy FreeRTOS giám sát độc lập qua UART. Nhóm khảo sát ảnh hưởng của scheduler, tranh chấp tài nguyên và queue tới freshness. Các câu hỏi xoay quanh tải, cấu hình, queue và phản ứng khi Linux lỗi. Kết quả sơ bộ ghi nhận priority real-time cải thiện tail latency đánh thức, nhưng tranh chấp bộ nhớ vẫn còn và thay kết quả tại bridge chưa giải quyết được tồn đọng trước inference. UART và GPIO giúp đối chiếu log, phân biệt mất heartbeat với kết quả cũ dù heartbeat vẫn đến. Hai lượt camera 30 fps và 10 fps ngày 30–31/10 đáp ứng tiêu chí OS-T1, còn lượt inference hợp lệ với governor performance đạt OS-T2 ở cấu hình 2 luồng. OS-T3/OS-T4 giữ trạng thái FAIL; dữ liệu T3 cho thấy hồi quy P1 khi tải băng thông nhớ, còn T4 chưa đo trực tiếp AoI trung bình theo thời gian.</w:t>
+        <w:t xml:space="preserve">Báo cáo giữa kỳ cập nhật đến ngày 31/10/2026, trình bày nền tảng thực thi Edge-AI không đồng nhất đang trong quá trình triển khai cho học phần Hệ điều hành. Nhóm dùng Raspberry Pi chạy Ubuntu để xử lý inference, trong khi STM32 chạy FreeRTOS giám sát độc lập qua UART. Nhóm khảo sát ảnh hưởng của scheduler, tranh chấp tài nguyên và queue tới freshness. Các câu hỏi xoay quanh tải, cấu hình, queue và phản ứng khi Linux lỗi. Kết quả sơ bộ ghi nhận priority real-time cải thiện tail latency đánh thức, nhưng tranh chấp bộ nhớ vẫn còn và việc thay kết quả tại bridge chưa giải quyết được tồn đọng trước inference. UART và GPIO giúp đối chiếu log, phân biệt mất heartbeat với kết quả cũ dù heartbeat vẫn đến. Hai lượt camera 30 fps và 10 fps ngày 30–31/10 đáp ứng tiêu chí OS-T1, còn lượt inference hợp lệ với governor performance đạt OS-T2 ở cấu hình 2 luồng. OS-T3/OS-T4 giữ trạng thái FAIL; dữ liệu T3 cho thấy hồi quy P1 khi tải băng thông nhớ, còn T4 giảm AoI trung bình theo thời gian ở mọi lượt nhưng chưa chứng minh hàng đợi FIFO tăng không giới hạn.</w:t>
       </w:r>
     </w:p>
     <w:p>
@@ -532,6 +532,15 @@
       <w:r>
         <w:rPr/>
         <w:t xml:space="preserve">4.4 Công cụ đo và miền đồng hồ</w:t>
+      </w:r>
+    </w:p>
+    <w:p>
+      <w:pPr>
+        <w:pStyle w:val="TOC1"/>
+      </w:pPr>
+      <w:r>
+        <w:rPr/>
+        <w:t xml:space="preserve">4.5 Bố trí bàn thử và pinout</w:t>
       </w:r>
     </w:p>
     <w:p>
@@ -761,7 +770,7 @@
               <w:rPr>
                 <w:b/>
               </w:rPr>
-              <w:t xml:space="preserve">Thuật ngữ / Viết tắt</w:t>
+              <w:t xml:space="preserve">Viết tắt</w:t>
             </w:r>
           </w:p>
         </w:tc>
@@ -779,7 +788,7 @@
               <w:rPr>
                 <w:b/>
               </w:rPr>
-              <w:t xml:space="preserve">Tiếng Anh đầy đủ</w:t>
+              <w:t xml:space="preserve">English full form</w:t>
             </w:r>
           </w:p>
         </w:tc>
@@ -797,7 +806,7 @@
               <w:rPr>
                 <w:b/>
               </w:rPr>
-              <w:t xml:space="preserve">Giải thích</w:t>
+              <w:t xml:space="preserve">short Vietnamese meaning</w:t>
             </w:r>
           </w:p>
         </w:tc>
@@ -1145,6 +1154,53 @@
             </w:pPr>
             <w:r>
               <w:rPr/>
+              <w:t xml:space="preserve">CAM</w:t>
+            </w:r>
+          </w:p>
+        </w:tc>
+        <w:tc>
+          <w:tcPr>
+            <w:tcW w:w="3175" w:type="dxa"/>
+          </w:tcPr>
+          <w:p>
+            <w:pPr>
+              <w:pStyle w:val="GlossaryText"/>
+            </w:pPr>
+            <w:r>
+              <w:rPr/>
+              <w:t xml:space="preserve">Camera</w:t>
+            </w:r>
+          </w:p>
+        </w:tc>
+        <w:tc>
+          <w:tcPr>
+            <w:tcW w:w="3628" w:type="dxa"/>
+          </w:tcPr>
+          <w:p>
+            <w:pPr>
+              <w:pStyle w:val="GlossaryText"/>
+            </w:pPr>
+            <w:r>
+              <w:rPr/>
+              <w:t xml:space="preserve">Đầu nối camera trên Raspberry Pi.</w:t>
+            </w:r>
+          </w:p>
+        </w:tc>
+      </w:tr>
+      <w:tr>
+        <w:trPr>
+          <w:cantSplit/>
+        </w:trPr>
+        <w:tc>
+          <w:tcPr>
+            <w:tcW w:w="2268" w:type="dxa"/>
+          </w:tcPr>
+          <w:p>
+            <w:pPr>
+              <w:pStyle w:val="GlossaryText"/>
+            </w:pPr>
+            <w:r>
+              <w:rPr/>
               <w:t xml:space="preserve">CAN</w:t>
             </w:r>
           </w:p>
@@ -1709,6 +1765,53 @@
             </w:pPr>
             <w:r>
               <w:rPr/>
+              <w:t xml:space="preserve">CSI</w:t>
+            </w:r>
+          </w:p>
+        </w:tc>
+        <w:tc>
+          <w:tcPr>
+            <w:tcW w:w="3175" w:type="dxa"/>
+          </w:tcPr>
+          <w:p>
+            <w:pPr>
+              <w:pStyle w:val="GlossaryText"/>
+            </w:pPr>
+            <w:r>
+              <w:rPr/>
+              <w:t xml:space="preserve">Camera Serial Interface</w:t>
+            </w:r>
+          </w:p>
+        </w:tc>
+        <w:tc>
+          <w:tcPr>
+            <w:tcW w:w="3628" w:type="dxa"/>
+          </w:tcPr>
+          <w:p>
+            <w:pPr>
+              <w:pStyle w:val="GlossaryText"/>
+            </w:pPr>
+            <w:r>
+              <w:rPr/>
+              <w:t xml:space="preserve">Giao tiếp nối tiếp dành cho camera.</w:t>
+            </w:r>
+          </w:p>
+        </w:tc>
+      </w:tr>
+      <w:tr>
+        <w:trPr>
+          <w:cantSplit/>
+        </w:trPr>
+        <w:tc>
+          <w:tcPr>
+            <w:tcW w:w="2268" w:type="dxa"/>
+          </w:tcPr>
+          <w:p>
+            <w:pPr>
+              <w:pStyle w:val="GlossaryText"/>
+            </w:pPr>
+            <w:r>
+              <w:rPr/>
               <w:t xml:space="preserve">Deadline / timeout</w:t>
             </w:r>
           </w:p>
@@ -1756,6 +1859,53 @@
             </w:pPr>
             <w:r>
               <w:rPr/>
+              <w:t xml:space="preserve">DISP</w:t>
+            </w:r>
+          </w:p>
+        </w:tc>
+        <w:tc>
+          <w:tcPr>
+            <w:tcW w:w="3175" w:type="dxa"/>
+          </w:tcPr>
+          <w:p>
+            <w:pPr>
+              <w:pStyle w:val="GlossaryText"/>
+            </w:pPr>
+            <w:r>
+              <w:rPr/>
+              <w:t xml:space="preserve">Display</w:t>
+            </w:r>
+          </w:p>
+        </w:tc>
+        <w:tc>
+          <w:tcPr>
+            <w:tcW w:w="3628" w:type="dxa"/>
+          </w:tcPr>
+          <w:p>
+            <w:pPr>
+              <w:pStyle w:val="GlossaryText"/>
+            </w:pPr>
+            <w:r>
+              <w:rPr/>
+              <w:t xml:space="preserve">Đầu nối màn hình, dùng chung nhãn CAM/DISP trên Pi.</w:t>
+            </w:r>
+          </w:p>
+        </w:tc>
+      </w:tr>
+      <w:tr>
+        <w:trPr>
+          <w:cantSplit/>
+        </w:trPr>
+        <w:tc>
+          <w:tcPr>
+            <w:tcW w:w="2268" w:type="dxa"/>
+          </w:tcPr>
+          <w:p>
+            <w:pPr>
+              <w:pStyle w:val="GlossaryText"/>
+            </w:pPr>
+            <w:r>
+              <w:rPr/>
               <w:t xml:space="preserve">DMA</w:t>
             </w:r>
           </w:p>
@@ -1944,6 +2094,100 @@
             </w:pPr>
             <w:r>
               <w:rPr/>
+              <w:t xml:space="preserve">FAIL</w:t>
+            </w:r>
+          </w:p>
+        </w:tc>
+        <w:tc>
+          <w:tcPr>
+            <w:tcW w:w="3175" w:type="dxa"/>
+          </w:tcPr>
+          <w:p>
+            <w:pPr>
+              <w:pStyle w:val="GlossaryText"/>
+            </w:pPr>
+            <w:r>
+              <w:rPr/>
+              <w:t xml:space="preserve">Fail</w:t>
+            </w:r>
+          </w:p>
+        </w:tc>
+        <w:tc>
+          <w:tcPr>
+            <w:tcW w:w="3628" w:type="dxa"/>
+          </w:tcPr>
+          <w:p>
+            <w:pPr>
+              <w:pStyle w:val="GlossaryText"/>
+            </w:pPr>
+            <w:r>
+              <w:rPr/>
+              <w:t xml:space="preserve">Kết quả kiểm thử chưa đạt tiêu chí.</w:t>
+            </w:r>
+          </w:p>
+        </w:tc>
+      </w:tr>
+      <w:tr>
+        <w:trPr>
+          <w:cantSplit/>
+        </w:trPr>
+        <w:tc>
+          <w:tcPr>
+            <w:tcW w:w="2268" w:type="dxa"/>
+          </w:tcPr>
+          <w:p>
+            <w:pPr>
+              <w:pStyle w:val="GlossaryText"/>
+            </w:pPr>
+            <w:r>
+              <w:rPr/>
+              <w:t xml:space="preserve">FAILSAFE</w:t>
+            </w:r>
+          </w:p>
+        </w:tc>
+        <w:tc>
+          <w:tcPr>
+            <w:tcW w:w="3175" w:type="dxa"/>
+          </w:tcPr>
+          <w:p>
+            <w:pPr>
+              <w:pStyle w:val="GlossaryText"/>
+            </w:pPr>
+            <w:r>
+              <w:rPr/>
+              <w:t xml:space="preserve">Fail-safe</w:t>
+            </w:r>
+          </w:p>
+        </w:tc>
+        <w:tc>
+          <w:tcPr>
+            <w:tcW w:w="3628" w:type="dxa"/>
+          </w:tcPr>
+          <w:p>
+            <w:pPr>
+              <w:pStyle w:val="GlossaryText"/>
+            </w:pPr>
+            <w:r>
+              <w:rPr/>
+              <w:t xml:space="preserve">Trạng thái an toàn mô phỏng khi lỗi, chốt đến khi rearm.</w:t>
+            </w:r>
+          </w:p>
+        </w:tc>
+      </w:tr>
+      <w:tr>
+        <w:trPr>
+          <w:cantSplit/>
+        </w:trPr>
+        <w:tc>
+          <w:tcPr>
+            <w:tcW w:w="2268" w:type="dxa"/>
+          </w:tcPr>
+          <w:p>
+            <w:pPr>
+              <w:pStyle w:val="GlossaryText"/>
+            </w:pPr>
+            <w:r>
+              <w:rPr/>
               <w:t xml:space="preserve">FIFO</w:t>
             </w:r>
           </w:p>
@@ -2085,6 +2329,53 @@
             </w:pPr>
             <w:r>
               <w:rPr/>
+              <w:t xml:space="preserve">FRESH</w:t>
+            </w:r>
+          </w:p>
+        </w:tc>
+        <w:tc>
+          <w:tcPr>
+            <w:tcW w:w="3175" w:type="dxa"/>
+          </w:tcPr>
+          <w:p>
+            <w:pPr>
+              <w:pStyle w:val="GlossaryText"/>
+            </w:pPr>
+            <w:r>
+              <w:rPr/>
+              <w:t xml:space="preserve">Fresh</w:t>
+            </w:r>
+          </w:p>
+        </w:tc>
+        <w:tc>
+          <w:tcPr>
+            <w:tcW w:w="3628" w:type="dxa"/>
+          </w:tcPr>
+          <w:p>
+            <w:pPr>
+              <w:pStyle w:val="GlossaryText"/>
+            </w:pPr>
+            <w:r>
+              <w:rPr/>
+              <w:t xml:space="preserve">Trạng thái dữ liệu còn đủ mới để cập nhật đầu ra.</w:t>
+            </w:r>
+          </w:p>
+        </w:tc>
+      </w:tr>
+      <w:tr>
+        <w:trPr>
+          <w:cantSplit/>
+        </w:trPr>
+        <w:tc>
+          <w:tcPr>
+            <w:tcW w:w="2268" w:type="dxa"/>
+          </w:tcPr>
+          <w:p>
+            <w:pPr>
+              <w:pStyle w:val="GlossaryText"/>
+            </w:pPr>
+            <w:r>
+              <w:rPr/>
               <w:t xml:space="preserve">GB</w:t>
             </w:r>
           </w:p>
@@ -2132,6 +2423,53 @@
             </w:pPr>
             <w:r>
               <w:rPr/>
+              <w:t xml:space="preserve">GND</w:t>
+            </w:r>
+          </w:p>
+        </w:tc>
+        <w:tc>
+          <w:tcPr>
+            <w:tcW w:w="3175" w:type="dxa"/>
+          </w:tcPr>
+          <w:p>
+            <w:pPr>
+              <w:pStyle w:val="GlossaryText"/>
+            </w:pPr>
+            <w:r>
+              <w:rPr/>
+              <w:t xml:space="preserve">Ground</w:t>
+            </w:r>
+          </w:p>
+        </w:tc>
+        <w:tc>
+          <w:tcPr>
+            <w:tcW w:w="3628" w:type="dxa"/>
+          </w:tcPr>
+          <w:p>
+            <w:pPr>
+              <w:pStyle w:val="GlossaryText"/>
+            </w:pPr>
+            <w:r>
+              <w:rPr/>
+              <w:t xml:space="preserve">Mass chung, mốc điện áp tham chiếu của mạch.</w:t>
+            </w:r>
+          </w:p>
+        </w:tc>
+      </w:tr>
+      <w:tr>
+        <w:trPr>
+          <w:cantSplit/>
+        </w:trPr>
+        <w:tc>
+          <w:tcPr>
+            <w:tcW w:w="2268" w:type="dxa"/>
+          </w:tcPr>
+          <w:p>
+            <w:pPr>
+              <w:pStyle w:val="GlossaryText"/>
+            </w:pPr>
+            <w:r>
+              <w:rPr/>
               <w:t xml:space="preserve">GPIO</w:t>
             </w:r>
           </w:p>
@@ -2226,6 +2564,53 @@
             </w:pPr>
             <w:r>
               <w:rPr/>
+              <w:t xml:space="preserve">HEARTBEAT</w:t>
+            </w:r>
+          </w:p>
+        </w:tc>
+        <w:tc>
+          <w:tcPr>
+            <w:tcW w:w="3175" w:type="dxa"/>
+          </w:tcPr>
+          <w:p>
+            <w:pPr>
+              <w:pStyle w:val="GlossaryText"/>
+            </w:pPr>
+            <w:r>
+              <w:rPr/>
+              <w:t xml:space="preserve">Heartbeat</w:t>
+            </w:r>
+          </w:p>
+        </w:tc>
+        <w:tc>
+          <w:tcPr>
+            <w:tcW w:w="3628" w:type="dxa"/>
+          </w:tcPr>
+          <w:p>
+            <w:pPr>
+              <w:pStyle w:val="GlossaryText"/>
+            </w:pPr>
+            <w:r>
+              <w:rPr/>
+              <w:t xml:space="preserve">Bản tin sống mang thông tin phiên của bridge.</w:t>
+            </w:r>
+          </w:p>
+        </w:tc>
+      </w:tr>
+      <w:tr>
+        <w:trPr>
+          <w:cantSplit/>
+        </w:trPr>
+        <w:tc>
+          <w:tcPr>
+            <w:tcW w:w="2268" w:type="dxa"/>
+          </w:tcPr>
+          <w:p>
+            <w:pPr>
+              <w:pStyle w:val="GlossaryText"/>
+            </w:pPr>
+            <w:r>
+              <w:rPr/>
               <w:t xml:space="preserve">Heartbeat / liveness / freshness</w:t>
             </w:r>
           </w:p>
@@ -2273,6 +2658,53 @@
             </w:pPr>
             <w:r>
               <w:rPr/>
+              <w:t xml:space="preserve">HOLD</w:t>
+            </w:r>
+          </w:p>
+        </w:tc>
+        <w:tc>
+          <w:tcPr>
+            <w:tcW w:w="3175" w:type="dxa"/>
+          </w:tcPr>
+          <w:p>
+            <w:pPr>
+              <w:pStyle w:val="GlossaryText"/>
+            </w:pPr>
+            <w:r>
+              <w:rPr/>
+              <w:t xml:space="preserve">Hold</w:t>
+            </w:r>
+          </w:p>
+        </w:tc>
+        <w:tc>
+          <w:tcPr>
+            <w:tcW w:w="3628" w:type="dxa"/>
+          </w:tcPr>
+          <w:p>
+            <w:pPr>
+              <w:pStyle w:val="GlossaryText"/>
+            </w:pPr>
+            <w:r>
+              <w:rPr/>
+              <w:t xml:space="preserve">Trạng thái giữ đầu ra khi dữ liệu vượt ngưỡng tuổi.</w:t>
+            </w:r>
+          </w:p>
+        </w:tc>
+      </w:tr>
+      <w:tr>
+        <w:trPr>
+          <w:cantSplit/>
+        </w:trPr>
+        <w:tc>
+          <w:tcPr>
+            <w:tcW w:w="2268" w:type="dxa"/>
+          </w:tcPr>
+          <w:p>
+            <w:pPr>
+              <w:pStyle w:val="GlossaryText"/>
+            </w:pPr>
+            <w:r>
+              <w:rPr/>
               <w:t xml:space="preserve">HUST</w:t>
             </w:r>
           </w:p>
@@ -2555,6 +2987,53 @@
             </w:pPr>
             <w:r>
               <w:rPr/>
+              <w:t xml:space="preserve">INFERENCE</w:t>
+            </w:r>
+          </w:p>
+        </w:tc>
+        <w:tc>
+          <w:tcPr>
+            <w:tcW w:w="3175" w:type="dxa"/>
+          </w:tcPr>
+          <w:p>
+            <w:pPr>
+              <w:pStyle w:val="GlossaryText"/>
+            </w:pPr>
+            <w:r>
+              <w:rPr/>
+              <w:t xml:space="preserve">Inference</w:t>
+            </w:r>
+          </w:p>
+        </w:tc>
+        <w:tc>
+          <w:tcPr>
+            <w:tcW w:w="3628" w:type="dxa"/>
+          </w:tcPr>
+          <w:p>
+            <w:pPr>
+              <w:pStyle w:val="GlossaryText"/>
+            </w:pPr>
+            <w:r>
+              <w:rPr/>
+              <w:t xml:space="preserve">Bản tin kết quả suy luận để kiểm tra độ mới.</w:t>
+            </w:r>
+          </w:p>
+        </w:tc>
+      </w:tr>
+      <w:tr>
+        <w:trPr>
+          <w:cantSplit/>
+        </w:trPr>
+        <w:tc>
+          <w:tcPr>
+            <w:tcW w:w="2268" w:type="dxa"/>
+          </w:tcPr>
+          <w:p>
+            <w:pPr>
+              <w:pStyle w:val="GlossaryText"/>
+            </w:pPr>
+            <w:r>
+              <w:rPr/>
               <w:t xml:space="preserve">Inference / workload / MobileNetV2</w:t>
             </w:r>
           </w:p>
@@ -3730,6 +4209,53 @@
             </w:pPr>
             <w:r>
               <w:rPr/>
+              <w:t xml:space="preserve">PASS</w:t>
+            </w:r>
+          </w:p>
+        </w:tc>
+        <w:tc>
+          <w:tcPr>
+            <w:tcW w:w="3175" w:type="dxa"/>
+          </w:tcPr>
+          <w:p>
+            <w:pPr>
+              <w:pStyle w:val="GlossaryText"/>
+            </w:pPr>
+            <w:r>
+              <w:rPr/>
+              <w:t xml:space="preserve">Pass</w:t>
+            </w:r>
+          </w:p>
+        </w:tc>
+        <w:tc>
+          <w:tcPr>
+            <w:tcW w:w="3628" w:type="dxa"/>
+          </w:tcPr>
+          <w:p>
+            <w:pPr>
+              <w:pStyle w:val="GlossaryText"/>
+            </w:pPr>
+            <w:r>
+              <w:rPr/>
+              <w:t xml:space="preserve">Kết quả kiểm thử đạt tiêu chí.</w:t>
+            </w:r>
+          </w:p>
+        </w:tc>
+      </w:tr>
+      <w:tr>
+        <w:trPr>
+          <w:cantSplit/>
+        </w:trPr>
+        <w:tc>
+          <w:tcPr>
+            <w:tcW w:w="2268" w:type="dxa"/>
+          </w:tcPr>
+          <w:p>
+            <w:pPr>
+              <w:pStyle w:val="GlossaryText"/>
+            </w:pPr>
+            <w:r>
+              <w:rPr/>
               <w:t xml:space="preserve">payload</w:t>
             </w:r>
           </w:p>
@@ -4388,6 +4914,53 @@
             </w:pPr>
             <w:r>
               <w:rPr/>
+              <w:t xml:space="preserve">RUN</w:t>
+            </w:r>
+          </w:p>
+        </w:tc>
+        <w:tc>
+          <w:tcPr>
+            <w:tcW w:w="3175" w:type="dxa"/>
+          </w:tcPr>
+          <w:p>
+            <w:pPr>
+              <w:pStyle w:val="GlossaryText"/>
+            </w:pPr>
+            <w:r>
+              <w:rPr/>
+              <w:t xml:space="preserve">Run</w:t>
+            </w:r>
+          </w:p>
+        </w:tc>
+        <w:tc>
+          <w:tcPr>
+            <w:tcW w:w="3628" w:type="dxa"/>
+          </w:tcPr>
+          <w:p>
+            <w:pPr>
+              <w:pStyle w:val="GlossaryText"/>
+            </w:pPr>
+            <w:r>
+              <w:rPr/>
+              <w:t xml:space="preserve">Trạng thái hoạt động khi liveness và dữ liệu đều hợp lệ.</w:t>
+            </w:r>
+          </w:p>
+        </w:tc>
+      </w:tr>
+      <w:tr>
+        <w:trPr>
+          <w:cantSplit/>
+        </w:trPr>
+        <w:tc>
+          <w:tcPr>
+            <w:tcW w:w="2268" w:type="dxa"/>
+          </w:tcPr>
+          <w:p>
+            <w:pPr>
+              <w:pStyle w:val="GlossaryText"/>
+            </w:pPr>
+            <w:r>
+              <w:rPr/>
               <w:t xml:space="preserve">runtime</w:t>
             </w:r>
           </w:p>
@@ -4482,6 +5055,53 @@
             </w:pPr>
             <w:r>
               <w:rPr/>
+              <w:t xml:space="preserve">RXD</w:t>
+            </w:r>
+          </w:p>
+        </w:tc>
+        <w:tc>
+          <w:tcPr>
+            <w:tcW w:w="3175" w:type="dxa"/>
+          </w:tcPr>
+          <w:p>
+            <w:pPr>
+              <w:pStyle w:val="GlossaryText"/>
+            </w:pPr>
+            <w:r>
+              <w:rPr/>
+              <w:t xml:space="preserve">Receive Data</w:t>
+            </w:r>
+          </w:p>
+        </w:tc>
+        <w:tc>
+          <w:tcPr>
+            <w:tcW w:w="3628" w:type="dxa"/>
+          </w:tcPr>
+          <w:p>
+            <w:pPr>
+              <w:pStyle w:val="GlossaryText"/>
+            </w:pPr>
+            <w:r>
+              <w:rPr/>
+              <w:t xml:space="preserve">Tín hiệu dữ liệu nối tiếp chiều nhận.</w:t>
+            </w:r>
+          </w:p>
+        </w:tc>
+      </w:tr>
+      <w:tr>
+        <w:trPr>
+          <w:cantSplit/>
+        </w:trPr>
+        <w:tc>
+          <w:tcPr>
+            <w:tcW w:w="2268" w:type="dxa"/>
+          </w:tcPr>
+          <w:p>
+            <w:pPr>
+              <w:pStyle w:val="GlossaryText"/>
+            </w:pPr>
+            <w:r>
+              <w:rPr/>
               <w:t xml:space="preserve">s</w:t>
             </w:r>
           </w:p>
@@ -4670,6 +5290,100 @@
             </w:pPr>
             <w:r>
               <w:rPr/>
+              <w:t xml:space="preserve">SCL</w:t>
+            </w:r>
+          </w:p>
+        </w:tc>
+        <w:tc>
+          <w:tcPr>
+            <w:tcW w:w="3175" w:type="dxa"/>
+          </w:tcPr>
+          <w:p>
+            <w:pPr>
+              <w:pStyle w:val="GlossaryText"/>
+            </w:pPr>
+            <w:r>
+              <w:rPr/>
+              <w:t xml:space="preserve">Serial Clock Line</w:t>
+            </w:r>
+          </w:p>
+        </w:tc>
+        <w:tc>
+          <w:tcPr>
+            <w:tcW w:w="3628" w:type="dxa"/>
+          </w:tcPr>
+          <w:p>
+            <w:pPr>
+              <w:pStyle w:val="GlossaryText"/>
+            </w:pPr>
+            <w:r>
+              <w:rPr/>
+              <w:t xml:space="preserve">Đường xung nhịp của giao tiếp I2C.</w:t>
+            </w:r>
+          </w:p>
+        </w:tc>
+      </w:tr>
+      <w:tr>
+        <w:trPr>
+          <w:cantSplit/>
+        </w:trPr>
+        <w:tc>
+          <w:tcPr>
+            <w:tcW w:w="2268" w:type="dxa"/>
+          </w:tcPr>
+          <w:p>
+            <w:pPr>
+              <w:pStyle w:val="GlossaryText"/>
+            </w:pPr>
+            <w:r>
+              <w:rPr/>
+              <w:t xml:space="preserve">SDA</w:t>
+            </w:r>
+          </w:p>
+        </w:tc>
+        <w:tc>
+          <w:tcPr>
+            <w:tcW w:w="3175" w:type="dxa"/>
+          </w:tcPr>
+          <w:p>
+            <w:pPr>
+              <w:pStyle w:val="GlossaryText"/>
+            </w:pPr>
+            <w:r>
+              <w:rPr/>
+              <w:t xml:space="preserve">Serial Data Line</w:t>
+            </w:r>
+          </w:p>
+        </w:tc>
+        <w:tc>
+          <w:tcPr>
+            <w:tcW w:w="3628" w:type="dxa"/>
+          </w:tcPr>
+          <w:p>
+            <w:pPr>
+              <w:pStyle w:val="GlossaryText"/>
+            </w:pPr>
+            <w:r>
+              <w:rPr/>
+              <w:t xml:space="preserve">Đường dữ liệu của giao tiếp I2C.</w:t>
+            </w:r>
+          </w:p>
+        </w:tc>
+      </w:tr>
+      <w:tr>
+        <w:trPr>
+          <w:cantSplit/>
+        </w:trPr>
+        <w:tc>
+          <w:tcPr>
+            <w:tcW w:w="2268" w:type="dxa"/>
+          </w:tcPr>
+          <w:p>
+            <w:pPr>
+              <w:pStyle w:val="GlossaryText"/>
+            </w:pPr>
+            <w:r>
+              <w:rPr/>
               <w:t xml:space="preserve">sec.</w:t>
             </w:r>
           </w:p>
@@ -5046,6 +5760,53 @@
             </w:pPr>
             <w:r>
               <w:rPr/>
+              <w:t xml:space="preserve">TB</w:t>
+            </w:r>
+          </w:p>
+        </w:tc>
+        <w:tc>
+          <w:tcPr>
+            <w:tcW w:w="3175" w:type="dxa"/>
+          </w:tcPr>
+          <w:p>
+            <w:pPr>
+              <w:pStyle w:val="GlossaryText"/>
+            </w:pPr>
+            <w:r>
+              <w:rPr/>
+              <w:t xml:space="preserve">Mean (Vietnamese abbreviation: trung bình)</w:t>
+            </w:r>
+          </w:p>
+        </w:tc>
+        <w:tc>
+          <w:tcPr>
+            <w:tcW w:w="3628" w:type="dxa"/>
+          </w:tcPr>
+          <w:p>
+            <w:pPr>
+              <w:pStyle w:val="GlossaryText"/>
+            </w:pPr>
+            <w:r>
+              <w:rPr/>
+              <w:t xml:space="preserve">Giá trị trung bình của phép đo.</w:t>
+            </w:r>
+          </w:p>
+        </w:tc>
+      </w:tr>
+      <w:tr>
+        <w:trPr>
+          <w:cantSplit/>
+        </w:trPr>
+        <w:tc>
+          <w:tcPr>
+            <w:tcW w:w="2268" w:type="dxa"/>
+          </w:tcPr>
+          <w:p>
+            <w:pPr>
+              <w:pStyle w:val="GlossaryText"/>
+            </w:pPr>
+            <w:r>
+              <w:rPr/>
               <w:t xml:space="preserve">TS.</w:t>
             </w:r>
           </w:p>
@@ -5140,6 +5901,53 @@
             </w:pPr>
             <w:r>
               <w:rPr/>
+              <w:t xml:space="preserve">TXD</w:t>
+            </w:r>
+          </w:p>
+        </w:tc>
+        <w:tc>
+          <w:tcPr>
+            <w:tcW w:w="3175" w:type="dxa"/>
+          </w:tcPr>
+          <w:p>
+            <w:pPr>
+              <w:pStyle w:val="GlossaryText"/>
+            </w:pPr>
+            <w:r>
+              <w:rPr/>
+              <w:t xml:space="preserve">Transmit Data</w:t>
+            </w:r>
+          </w:p>
+        </w:tc>
+        <w:tc>
+          <w:tcPr>
+            <w:tcW w:w="3628" w:type="dxa"/>
+          </w:tcPr>
+          <w:p>
+            <w:pPr>
+              <w:pStyle w:val="GlossaryText"/>
+            </w:pPr>
+            <w:r>
+              <w:rPr/>
+              <w:t xml:space="preserve">Tín hiệu dữ liệu nối tiếp chiều phát.</w:t>
+            </w:r>
+          </w:p>
+        </w:tc>
+      </w:tr>
+      <w:tr>
+        <w:trPr>
+          <w:cantSplit/>
+        </w:trPr>
+        <w:tc>
+          <w:tcPr>
+            <w:tcW w:w="2268" w:type="dxa"/>
+          </w:tcPr>
+          <w:p>
+            <w:pPr>
+              <w:pStyle w:val="GlossaryText"/>
+            </w:pPr>
+            <w:r>
+              <w:rPr/>
               <w:t xml:space="preserve">UART</w:t>
             </w:r>
           </w:p>
@@ -5187,6 +5995,53 @@
             </w:pPr>
             <w:r>
               <w:rPr/>
+              <w:t xml:space="preserve">USART</w:t>
+            </w:r>
+          </w:p>
+        </w:tc>
+        <w:tc>
+          <w:tcPr>
+            <w:tcW w:w="3175" w:type="dxa"/>
+          </w:tcPr>
+          <w:p>
+            <w:pPr>
+              <w:pStyle w:val="GlossaryText"/>
+            </w:pPr>
+            <w:r>
+              <w:rPr/>
+              <w:t xml:space="preserve">Universal Synchronous/Asynchronous Receiver-Transmitter</w:t>
+            </w:r>
+          </w:p>
+        </w:tc>
+        <w:tc>
+          <w:tcPr>
+            <w:tcW w:w="3628" w:type="dxa"/>
+          </w:tcPr>
+          <w:p>
+            <w:pPr>
+              <w:pStyle w:val="GlossaryText"/>
+            </w:pPr>
+            <w:r>
+              <w:rPr/>
+              <w:t xml:space="preserve">Bộ thu phát nối tiếp đồng bộ hoặc bất đồng bộ.</w:t>
+            </w:r>
+          </w:p>
+        </w:tc>
+      </w:tr>
+      <w:tr>
+        <w:trPr>
+          <w:cantSplit/>
+        </w:trPr>
+        <w:tc>
+          <w:tcPr>
+            <w:tcW w:w="2268" w:type="dxa"/>
+          </w:tcPr>
+          <w:p>
+            <w:pPr>
+              <w:pStyle w:val="GlossaryText"/>
+            </w:pPr>
+            <w:r>
+              <w:rPr/>
               <w:t xml:space="preserve">V</w:t>
             </w:r>
           </w:p>
@@ -5234,6 +6089,53 @@
             </w:pPr>
             <w:r>
               <w:rPr/>
+              <w:t xml:space="preserve">VCC</w:t>
+            </w:r>
+          </w:p>
+        </w:tc>
+        <w:tc>
+          <w:tcPr>
+            <w:tcW w:w="3175" w:type="dxa"/>
+          </w:tcPr>
+          <w:p>
+            <w:pPr>
+              <w:pStyle w:val="GlossaryText"/>
+            </w:pPr>
+            <w:r>
+              <w:rPr/>
+              <w:t xml:space="preserve">Supply voltage</w:t>
+            </w:r>
+          </w:p>
+        </w:tc>
+        <w:tc>
+          <w:tcPr>
+            <w:tcW w:w="3628" w:type="dxa"/>
+          </w:tcPr>
+          <w:p>
+            <w:pPr>
+              <w:pStyle w:val="GlossaryText"/>
+            </w:pPr>
+            <w:r>
+              <w:rPr/>
+              <w:t xml:space="preserve">Điện áp cấp nguồn cho mạch.</w:t>
+            </w:r>
+          </w:p>
+        </w:tc>
+      </w:tr>
+      <w:tr>
+        <w:trPr>
+          <w:cantSplit/>
+        </w:trPr>
+        <w:tc>
+          <w:tcPr>
+            <w:tcW w:w="2268" w:type="dxa"/>
+          </w:tcPr>
+          <w:p>
+            <w:pPr>
+              <w:pStyle w:val="GlossaryText"/>
+            </w:pPr>
+            <w:r>
+              <w:rPr/>
               <w:t xml:space="preserve">µs</w:t>
             </w:r>
           </w:p>
@@ -5290,7 +6192,7 @@
       <w:pPr/>
       <w:r>
         <w:rPr/>
-        <w:t xml:space="preserve">Trong hệ thống Edge-AI, kết quả đúng đã cũ khi tới nơi sử dụng, bởi đầu vào tiếp tục thay đổi trong lúc Pi xử lý hoặc chờ bridge. Linux có thư viện chạy mô hình nhưng process phải chia sẻ CPU, bộ nhớ và queue, nên throughput cao chưa bảo đảm đầu ra theo kịp hiện tại. Đây là bài toán của nhóm. Raspberry Pi 5 chạy Ubuntu Server 24.04 ARM64 xử lý workload, còn STM32F446RE chạy FreeRTOS giám sát qua UART; MCU không chạy inference vì mục tiêu là nghiên cứu OS.</w:t>
+        <w:t xml:space="preserve">Trong hệ thống Edge-AI, kết quả đúng đã cũ khi tới nơi sử dụng, bởi đầu vào tiếp tục thay đổi trong lúc Pi xử lý hoặc chờ bridge. Linux có thư viện chạy mô hình nhưng process phải chia sẻ CPU, bộ nhớ và queue, nên throughput cao chưa bảo đảm đầu ra theo kịp hiện tại. Đây là bài toán nhóm hướng tới. Raspberry Pi 5 chạy Ubuntu Server 24.04 ARM64 xử lý workload, còn STM32F446RE chạy FreeRTOS giám sát qua UART; MCU không chạy inference vì mục tiêu là nghiên cứu OS.</w:t>
       </w:r>
     </w:p>
     <w:p>
@@ -5361,7 +6263,7 @@
       <w:pPr/>
       <w:r>
         <w:rPr/>
-        <w:t xml:space="preserve">Nhóm gắn timestamp để lần theo dữ liệu từ Pi tới MCU và tìm chỗ chờ, trong khi supervisor giữ quyền điều khiển dựa trên cả hoạt động của bridge lẫn độ mới của kết quả. Kết quả sơ bộ hướng việc phân tích về thời gian đầu vào đã chờ trước inference, vì thay dữ liệu ở bridge chỉ tác động tới đoạn sau.</w:t>
+        <w:t xml:space="preserve">Nhóm gắn timestamp để lần theo dữ liệu từ Pi tới MCU và tìm điểm chờ, trong khi supervisor giữ quyền điều khiển dựa trên cả hoạt động của bridge lẫn độ mới của kết quả. Kết quả sơ bộ hướng phân tích vào thời gian chờ trước inference, vì việc thay dữ liệu ở bridge chỉ tác động tới đoạn sau.</w:t>
       </w:r>
     </w:p>
     <w:p>
@@ -5386,7 +6288,7 @@
       <w:pPr/>
       <w:r>
         <w:rPr/>
-        <w:t xml:space="preserve">CFS phân chia CPU theo trọng số và lịch sử sử dụng, còn EEVDF xét điều kiện đủ tư cách cùng deadline ảo để tiếp tục mục tiêu công bằng. Tuy nhiên, bridge vẫn có thể chờ dù dữ liệu đã sẵn sàng. SCHED_FIFO cho thread sẵn sàng có priority cao preemption công việc thấp hơn, nên phù hợp với đoạn chuyển giao ngắn nhưng có nguy cơ làm task khác thiếu CPU; vì thế nhóm phải ghi kernel, chính sách thread, quyền đặt priority và giới hạn băng thông real-time khi phân tích [1]. CPU pinning giảm di chuyển thread nhưng không cô lập shared memory, nên CPU riêng vẫn chịu tải đọc ghi từ lõi khác. MemGuard nghiên cứu cô lập băng thông nhớ [2]; nhóm chỉ vận dụng để giải thích, không cài cơ chế kernel. cgroups giới hạn workload nhưng quota thấp gây throttling. mlockall giữ trang trong RAM nhằm giảm page fault, song không loại được cache miss hay tranh chấp nhớ, vì vậy trạng thái memory locking thực tế vẫn phải ghi lại.</w:t>
+        <w:t xml:space="preserve">CFS phân chia CPU theo trọng số và lịch sử sử dụng, còn EEVDF xét điều kiện đủ tư cách cùng deadline ảo để duy trì công bằng. Tuy nhiên, bridge vẫn có thể chờ dù dữ liệu đã sẵn sàng. SCHED_FIFO cho phép thread sẵn sàng có priority cao chiếm quyền (preempt) công việc thấp hơn, nên phù hợp với đoạn chuyển giao ngắn nhưng có nguy cơ làm task khác thiếu CPU; nên nhóm phải ghi kernel, chính sách thread, quyền đặt priority và giới hạn băng thông real-time khi phân tích [1]. CPU pinning giảm dịch chuyển thread giữa các CPU nhưng không cô lập shared memory, nên CPU riêng vẫn chịu tải đọc ghi từ lõi khác. MemGuard nghiên cứu cô lập băng thông nhớ [2]; nhóm chỉ vận dụng để giải thích, không cài đặt cơ chế trong kernel. cgroups giới hạn workload nhưng quota thấp gây throttling. mlockall giữ trang trong RAM nhằm giảm page fault, song không loại được cache miss hay tranh chấp nhớ, nên vẫn phải ghi trạng thái memory locking thực tế.</w:t>
       </w:r>
     </w:p>
     <w:p>
@@ -5402,7 +6304,7 @@
       <w:pPr/>
       <w:r>
         <w:rPr/>
-        <w:t xml:space="preserve">PREEMPT_RT giảm những vùng không thể bị preemption và thay đổi cách xử lý một công việc trong kernel. Nhóm chỉ dự kiến thử kernel Real-time Ubuntu đóng gói ở cấu hình P3, không sửa hoặc tự biên dịch kernel. Vì kết quả sơ bộ đều được thu trên kernel tiêu chuẩn, nhóm chưa thể dùng chúng để kết luận về PREEMPT_RT hoặc lợi ích của P3 với bridge trên Pi.</w:t>
+        <w:t xml:space="preserve">PREEMPT_RT giảm những vùng không thể bị chiếm quyền (preempt) và thay đổi cách xử lý một công việc trong kernel. Nhóm dự kiến thử kernel Real-time Ubuntu đóng gói ở cấu hình P3, không sửa hoặc tự biên dịch kernel. Vì kết quả sơ bộ đều thu trên kernel tiêu chuẩn, nhóm chưa thể dùng chúng để kết luận về PREEMPT_RT hoặc lợi ích của P3 với bridge trên Pi.</w:t>
       </w:r>
     </w:p>
     <w:p>
@@ -5418,7 +6320,7 @@
       <w:pPr/>
       <w:r>
         <w:rPr/>
-        <w:t xml:space="preserve">Age of Information (AoI) là tuổi dữ liệu hữu ích mới nhất bên nhận giữ [3], [4]. Khi chưa có cập nhật, tuổi vẫn tăng dù không có gói đang truyền, nên latency một gói không thay được AoI trung bình. Hình 2.1 biểu diễn tuổi tăng rồi giảm khi nhận cập nhật, nhưng không về không vì dữ liệu đã chờ và truyền. Phép tích phân phải tính cả khoảng ngừng cập nhật và hai đầu cửa sổ.</w:t>
+        <w:t xml:space="preserve">Age of Information (AoI) là tuổi dữ liệu hữu ích mới nhất bên nhận giữ [3], [4]. Khi chưa có cập nhật, tuổi vẫn tăng dù không có gói đang truyền, nên latency một gói không thay được AoI trung bình. Hình 2.1 biểu diễn tuổi tăng rồi giảm khi nhận cập nhật, nhưng không giảm về 0 vì dữ liệu đã chờ và truyền. Tích phân phải tính cả khoảng ngừng cập nhật và hai đầu cửa sổ.</w:t>
       </w:r>
     </w:p>
     <w:p>
@@ -5484,7 +6386,7 @@
       <w:pPr/>
       <w:r>
         <w:rPr/>
-        <w:t xml:space="preserve">Simplex phân quyền giữa khối tính toán phức tạp và bộ điều khiển đáng tin cậy [5], [6], nên Pi chỉ đề xuất còn MCU quyết định output. Tuy nhiên, timeout và FAILSAFE chưa tạo thành chứng minh an toàn hình thức. Mô hình đối tượng và giả thiết lỗi vẫn cần xác định. Với FreeRTOS, priority cố định scheduler hỗ trợ preemption nhưng task vẫn trễ khi ISR bị che hoặc công việc trước kéo dài; cấp phát tĩnh chỉ giảm biến thiên, không thay phép đo stack và execution time.</w:t>
+        <w:t xml:space="preserve">Simplex phân quyền giữa khối tính toán phức tạp và bộ điều khiển đáng tin cậy [5], [6], nên Pi chỉ đề xuất còn MCU quyết định output. Tuy nhiên, timeout và FAILSAFE chưa tạo thành chứng minh an toàn hình thức. Cần xác định mô hình đối tượng và giả thiết lỗi. Với FreeRTOS, scheduler với priority cố định hỗ trợ preemption nhưng task vẫn trễ khi ngắt bị che hoặc công việc trước kéo dài; cấp phát tĩnh chỉ giảm biến thiên, không thay phép đo stack và execution time.</w:t>
       </w:r>
     </w:p>
     <w:p>
@@ -5509,7 +6411,7 @@
       <w:pPr/>
       <w:r>
         <w:rPr/>
-        <w:t xml:space="preserve">Hình 3.1 mô tả Linux workload (ONNX Runtime, MobileNetV2) → bridge trên Pi, qua UART tới UART ISR → bounded buffer → RX task → supervisor → output/LED trên STM32. Logger ghi timestamp để tái dựng hành trình dưới tải, nhưng thiếu log có thể khiến nhóm chưa đủ bằng chứng dù MCU vẫn giám sát. Supervisor độc quyền ghi output; heartbeat xác nhận bridge hoạt động, còn INFERENCE cung cấp kết quả để kiểm tra freshness. Đầu ra mới là GPIO. Hệ thống chưa có cơ cấu chấp hành hoặc watchdog phần cứng độc lập.</w:t>
+        <w:t xml:space="preserve">Hình 3.1 mô tả Linux workload (ONNX Runtime, MobileNetV2) → bridge trên Pi, qua UART tới UART ISR → bounded buffer → RX task → supervisor → output/LED trên STM32. Logger ghi timestamp để tái dựng hành trình dưới tải, nhưng thiếu log có thể khiến nhóm chưa đủ bằng chứng dù MCU vẫn giám sát. Supervisor độc quyền ghi output; heartbeat xác nhận bridge hoạt động, còn INFERENCE cung cấp kết quả để kiểm tra freshness. Đầu ra hiện chỉ là GPIO. Hệ thống chưa có cơ cấu chấp hành hoặc watchdog phần cứng độc lập.</w:t>
       </w:r>
     </w:p>
     <w:p>
@@ -5862,7 +6764,7 @@
             </w:pPr>
             <w:r>
               <w:rPr/>
-              <w:t xml:space="preserve">2 byte CRC-16/CCITT-FALSE; phủ version đến payload</w:t>
+              <w:t xml:space="preserve">2 byte CRC-16/CCITT-FALSE; phủ từ version đến payload</w:t>
             </w:r>
           </w:p>
         </w:tc>
@@ -5872,7 +6774,7 @@
       <w:pPr/>
       <w:r>
         <w:rPr/>
-        <w:t xml:space="preserve">HEARTBEAT mang thông tin sống còn và định danh phiên, trong khi INFERENCE mang kết quả, thứ tự đầu vào và tuổi lúc gửi để kiểm tra freshness. Để đối chiếu hoạt động hai bên, nhóm dùng ECHO_REQ/ECHO_RESP ước lượng quan hệ đồng hồ, nhận MCU_STATUS chứa trạng thái và bộ đếm của supervisor. STATE_EVENT ghi chuyển trạng thái còn INF_RX ghi timestamp nhận inference.</w:t>
+        <w:t xml:space="preserve">HEARTBEAT mang thông tin sống còn và định danh phiên, trong khi INFERENCE mang kết quả, thứ tự đầu vào và tuổi lúc gửi để kiểm tra freshness. Để đối chiếu hai bên, nhóm dùng ECHO_REQ/ECHO_RESP ước lượng quan hệ đồng hồ, nhận MCU_STATUS chứa trạng thái và bộ đếm của supervisor. STATE_EVENT ghi sự kiện chuyển trạng thái, còn INF_RX ghi timestamp nhận inference.</w:t>
       </w:r>
     </w:p>
     <w:p>
@@ -5888,14 +6790,14 @@
       <w:pPr/>
       <w:r>
         <w:rPr/>
-        <w:t xml:space="preserve">MCU có INIT, RUN, HOLD và FAILSAFE; RUN còn gọi FRESH khi dữ liệu đủ mới. INIT giữ output an toàn mô phỏng, còn RUN đòi hỏi cả liveness và kết quả hợp lệ. Khi tuổi vượt ngưỡng, HOLD ngăn cập nhật output. FAILSAFE được chốt, nên lưu lượng tốt trở lại chưa tự khôi phục hoạt động.</w:t>
+        <w:t xml:space="preserve">MCU có INIT, RUN, HOLD và FAILSAFE; RUN còn được gọi là FRESH khi dữ liệu đủ mới. INIT giữ output an toàn mô phỏng, còn RUN đòi hỏi cả liveness và kết quả hợp lệ. Khi tuổi vượt ngưỡng, HOLD ngăn cập nhật output. FAILSAFE được chốt, nên dù lưu lượng tốt trở lại, hệ thống vẫn chưa tự khôi phục hoạt động.</w:t>
       </w:r>
     </w:p>
     <w:p>
       <w:pPr/>
       <w:r>
         <w:rPr/>
-        <w:t xml:space="preserve">Session phân biệt lần bridge khởi động, còn generation gắn vào dữ liệu chờ để loại dữ liệu cũ khi đổi phiên hoặc tái kích hoạt. Supervisor kiểm hết hạn trước khi xử lý bản tin mới, tránh bỏ sót timeout sát hạn. Lõi portable hỗ trợ rearm. Firmware trên bo chưa hoàn tất chức năng này và chưa cung cấp tự động rearm từ xa.</w:t>
+        <w:t xml:space="preserve">Session phân biệt lần bridge khởi động, còn generation gắn vào dữ liệu chờ để loại dữ liệu cũ khi đổi phiên hoặc tái kích hoạt. Supervisor kiểm tra timeout trước khi xử lý bản tin mới, tránh bỏ sót timeout sát hạn. Lõi portable hỗ trợ rearm. Firmware trên bo chưa hoàn tất chức năng này và chưa hỗ trợ tự động rearm từ xa.</w:t>
       </w:r>
     </w:p>
     <w:p>
@@ -5911,7 +6813,7 @@
       <w:pPr/>
       <w:r>
         <w:rPr/>
-        <w:t xml:space="preserve">FIFO giữ thứ tự dữ liệu đến, nhưng tuổi có thể tăng dần nếu nguồn sinh nhanh hơn khả năng phục vụ. Với nhiệm vụ cần biết trạng thái hiện tại, latest-value thay dữ liệu đang chờ bằng dữ liệu mới nhất để tránh tiếp tục xử lý đầu vào đã cũ. Sự khác nhau trong Hình 3.3 chỉ nằm ở phần dữ liệu chờ, bởi inference đang chạy vẫn được hoàn tất thay vì bị hủy khi có đầu vào mới [4].</w:t>
+        <w:t xml:space="preserve">FIFO giữ thứ tự dữ liệu đến, nhưng tuổi có thể tăng dần nếu nguồn sinh nhanh hơn khả năng phục vụ. Với nhiệm vụ cần biết trạng thái hiện tại, latest-value thay dữ liệu đang chờ bằng dữ liệu mới nhất để tránh tiếp tục xử lý đầu vào đã cũ. Hình 3.3 chỉ khác ở dữ liệu chờ, bởi inference đang chạy vẫn được hoàn tất thay vì bị hủy khi có đầu vào mới [4].</w:t>
       </w:r>
     </w:p>
     <w:p>
@@ -5968,7 +6870,7 @@
       <w:pPr/>
       <w:r>
         <w:rPr/>
-        <w:t xml:space="preserve">Nếu chỉ đặt latest-value tại bridge, nhóm chỉ thay được kết quả đã inference xong và đang chờ gửi, trong khi đầu vào của kết quả vừa hoàn tất đã chờ lâu trước MobileNetV2. Vì vậy, nhóm thử rút các datagram sẵn có trước inference, giữ đầu vào hợp lệ mới nhất và đếm số bỏ, giữ cùng tải, nguồn và scheduler để tách tác động của vị trí queue.</w:t>
+        <w:t xml:space="preserve">Nếu chỉ đặt latest-value tại bridge, nhóm chỉ thay được kết quả inference đang chờ gửi, nhưng đầu vào của kết quả đó đã chờ lâu trước MobileNetV2. Vì vậy, nhóm thử rút các datagram sẵn có trước inference, giữ đầu vào hợp lệ mới nhất và đếm số đầu vào bị bỏ, giữ cùng tải, nguồn và scheduler để tách tác động của vị trí queue.</w:t>
       </w:r>
     </w:p>
     <w:p>
@@ -5993,14 +6895,14 @@
       <w:pPr/>
       <w:r>
         <w:rPr/>
-        <w:t xml:space="preserve">Source, inference, bridge và receiver trao đổi qua IPC Unix datagram, nhờ đó mỗi process đảm nhận một đoạn trong pipeline. Source đánh dấu đầu vào trước khi inference nhận dữ liệu, tiền xử lý rồi gọi ONNX Runtime với MobileNetV2; kết quả sau đó được đưa sang bridge để đóng frame UART. Khi kiểm tra logic trên host, chúng em có thể dùng workload tổng hợp thay cho runtime và mô hình thật.</w:t>
+        <w:t xml:space="preserve">Source, inference, bridge và receiver trao đổi qua IPC Unix datagram, mỗi process phụ trách một đoạn pipeline. Source đánh dấu đầu vào trước khi inference nhận dữ liệu, tiền xử lý rồi gọi ONNX Runtime với MobileNetV2; kết quả sau đó được đưa sang bridge để đóng frame UART. Khi kiểm tra logic trên host, nhóm có thể dùng workload tổng hợp thay runtime và mô hình thật.</w:t>
       </w:r>
     </w:p>
     <w:p>
       <w:pPr/>
       <w:r>
         <w:rPr/>
-        <w:t xml:space="preserve">Với phiên đo nền dùng MobileNetV2-12 và ONNX Runtime 1.31.0, nhóm giữ cùng mô hình, đầu vào, số thread và thiết lập runtime để so sánh. Thêm luồng có thể tận dụng CPU khi Pi nhàn rỗi, nhưng cũng làm inference cạnh tranh với process tạo tải. Khi hệ thống bận, nhóm tách service time khỏi call time inference [7]. Bridge xuất nối tiếp không chặn, hỗ trợ FIFO hoặc latest-value, phát heartbeat và trao đổi echo. Khi UART mới ghi được một phần frame, bridge phải hoàn tất frame đang phát rồi mới thay dữ liệu chờ, bởi thay ngay giữa chừng sẽ khiến bên nhận thấy một frame bị ghép sai. Logger nối đầu vào với kết quả bằng timestamp và bộ đếm, nên dù log ghi chậm, nhóm vẫn dùng timestamp sự kiện để phân tích thay vì lúc ghi ra đĩa.</w:t>
+        <w:t xml:space="preserve">Khi đo nền bằng MobileNetV2-12 và ONNX Runtime 1.31.0, nhóm so sánh với cùng mô hình, đầu vào, số luồng và thiết lập runtime. Thêm luồng có thể tận dụng CPU khi Pi nhàn rỗi, nhưng cũng làm inference cạnh tranh với process tạo tải. Khi hệ thống bận, nhóm tách service time khỏi call time inference [7]. Bridge xuất nối tiếp không chặn, hỗ trợ FIFO hoặc latest-value, phát heartbeat và trao đổi echo. Khi UART ghi chưa hết frame, bridge phải hoàn tất frame đang phát rồi mới thay dữ liệu chờ, vì thay giữa chừng khiến bên nhận thấy frame ghép sai. Logger nối đầu vào với kết quả bằng timestamp và bộ đếm. Dù log ghi chậm, nhóm vẫn phân tích theo timestamp sự kiện thay vì thời điểm ghi đĩa.</w:t>
       </w:r>
     </w:p>
     <w:p>
@@ -6016,7 +6918,7 @@
       <w:pPr/>
       <w:r>
         <w:rPr/>
-        <w:t xml:space="preserve">Host macOS dùng biên soạn, kiểm tra portable và biên dịch chéo; Linux workload chạy trên Pi, còn firmware FreeRTOS chạy trên STM32. Test parser trên host chưa xác nhận latency UART vật lý. Nhóm so sánh P0 mặc định với P1 điều chỉnh real-time; trong thử phần mềm, source dùng FIFO priority 60 và bridge dùng FIFO priority 70 trên CPU 1, còn inference giữ SCHED_OTHER trên CPU 0. Bridge được ưu tiên để chuyển giao; phương án đầu dùng priority 50. P2 giới hạn quota CPU và P3 chưa có kết quả sơ bộ được chấp nhận.</w:t>
+        <w:t xml:space="preserve">Host macOS dùng biên soạn, kiểm tra portable và biên dịch chéo; Linux workload chạy trên Pi, còn firmware FreeRTOS chạy trên STM32. Test parser trên host chưa xác nhận latency UART vật lý. Nhóm so sánh P0 mặc định với P1 điều chỉnh real-time; trong thử nghiệm phần mềm, source dùng FIFO priority 60 và bridge dùng FIFO priority 70 trên CPU 1, còn inference giữ SCHED_OTHER trên CPU 0. Bridge được ưu tiên để chuyển giao; phương án đầu dùng priority 50. P2 giới hạn quota CPU và P3 chưa có kết quả sơ bộ được chấp nhận.</w:t>
       </w:r>
     </w:p>
     <w:p>
@@ -6032,7 +6934,7 @@
       <w:pPr/>
       <w:r>
         <w:rPr/>
-        <w:t xml:space="preserve">Thiết kế ban đầu đi theo ISR → buffer hữu hạn → RX task → supervisor → output. Để dễ kiểm soát thời gian, ngắt chỉ nhận byte rồi bàn giao phần phân tích frame và quyết định đầu ra cho task; firmware mặc định hiện đã chuyển sang nhận DMA vòng. Chế độ IRQ vẫn được giữ để đối chiếu với DMA, bởi cả hai cách đều phải bàn giao dữ liệu ngoại vi sang task trước khi thực hiện giám sát. RX task lấy dữ liệu để dựng frame và kiểm CRC, rồi chuyển sự kiện kèm timestamp và generation cho supervisor. Khi buffer đầy, bộ đếm mất hoặc dấu gián đoạn phải phản ánh được sự thiếu hụt, vì dữ liệu bị mất không được làm mới liveness. Supervisor giữ quyền sở hữu trạng thái, còn task trạng thái truyền các bản ghi đã chụp để UART TX không chặn quyết định. Bộ nhớ được cấp phát tĩnh. Với DMA, log ghi timestamp RX đọc byte CRC cuối sau khi byte đã tới chân UART, nên chu kỳ đánh thức, jitter scheduler và thời gian rút cả lô dữ liệu khiến timestamp log khác thời gian đến phần cứng. Nếu bỏ lỡ cả vòng DMA hoặc có lỗi UART, firmware phải xử lý bảo thủ thay vì tiếp tục coi dữ liệu là liên tục.</w:t>
+        <w:t xml:space="preserve">Thiết kế ban đầu đi theo ISR → buffer hữu hạn → RX task → supervisor → output. Để kiểm soát thời gian, ngắt chỉ nhận byte rồi bàn giao phần phân tích frame và quyết định đầu ra cho task; firmware mặc định hiện đã chuyển sang nhận DMA vòng. Chế độ IRQ vẫn được giữ để đối chiếu với DMA, bởi cả hai cách đều phải bàn giao dữ liệu ngoại vi sang task trước khi thực hiện giám sát. RX task lấy dữ liệu để dựng frame và kiểm CRC, rồi chuyển sự kiện kèm timestamp và generation cho supervisor. Khi buffer đầy, bộ đếm dữ liệu mất hoặc dấu gián đoạn phải phản ánh được sự thiếu hụt, vì dữ liệu mất không được làm mới liveness. Supervisor giữ quyền sở hữu trạng thái, còn task trạng thái truyền các bản ghi đã chụp để UART TX không chặn quyết định. Bộ nhớ cấp phát tĩnh. Với DMA, log ghi timestamp RX đọc byte CRC cuối sau khi byte đã tới chân UART, nên chu kỳ đánh thức, jitter scheduler và thời gian rút cả lô dữ liệu khiến timestamp log khác thời gian đến phần cứng. Nếu bỏ lỡ cả vòng DMA hoặc có lỗi UART, firmware phải xử lý thận trọng thay vì tiếp tục coi dữ liệu là liên tục.</w:t>
       </w:r>
     </w:p>
     <w:p>
@@ -6048,16 +6950,7 @@
       <w:pPr/>
       <w:r>
         <w:rPr/>
-        <w:t xml:space="preserve">Nhóm dùng cyclictest đo đánh thức, stress-ng tạo tải và log pipeline theo dõi kết quả. Echo ánh xạ đồng hồ Pi với TIM2, còn logic analyzer đối chiếu UART/GPIO; phép trừ khác miền phải nêu bất định [8]. Tuổi nguồn ước lượng gồm tuổi lúc gửi, thời gian sau nhận và dự phòng truyền chưa được chứng minh là cận trên. MONOTONIC và MONOTONIC_RAW phải được kiểm tra riêng. Độ dư echo nhỏ chưa chứng minh đường truyền đối xứng hoặc ánh xạ chính xác tuyệt đối.</w:t>
-      </w:r>
-    </w:p>
-    <w:p>
-      <w:pPr>
-        <w:pStyle w:val="Heading1"/>
-      </w:pPr>
-      <w:r>
-        <w:rPr/>
-        <w:t xml:space="preserve">PHẦN 5. NGUỒN CAMERA VÀ PIPELINE ƯU TIÊN ĐỘ MỚI</w:t>
+        <w:t xml:space="preserve">Nhóm dùng cyclictest đo đánh thức, stress-ng tạo tải và log pipeline theo dõi kết quả. Echo ánh xạ đồng hồ Pi với TIM2, còn logic analyzer đối chiếu UART/GPIO; phép trừ giữa hai miền đồng hồ phải nêu rõ độ bất định [8]. Tuổi nguồn ước lượng gồm tuổi lúc gửi, thời gian sau khi nhận và dự phòng truyền chưa được chứng minh là cận trên. MONOTONIC và MONOTONIC_RAW phải được kiểm tra riêng. Sai số dư echo nhỏ chưa chứng minh đường truyền đối xứng hoặc ánh xạ chính xác tuyệt đối.</w:t>
       </w:r>
     </w:p>
     <w:p>
@@ -6066,92 +6959,64 @@
       </w:pPr>
       <w:r>
         <w:rPr/>
-        <w:t xml:space="preserve">5.1 Động cơ và capture</w:t>
+        <w:t xml:space="preserve">4.5 Bố trí bàn thử và pinout</w:t>
       </w:r>
     </w:p>
     <w:p>
       <w:pPr/>
       <w:r>
         <w:rPr/>
-        <w:t xml:space="preserve">Nguồn tổng hợp trước đây chỉ tạo frame_id và timestamp, nên chưa phản ánh thời điểm cảnh được phơi sáng; nguồn Pi Camera v2 (IMX219) bổ sung pixel thật để khảo sát scheduling, IPC và queue trên workload thực tế; nhóm không đánh giá độ chính xác mô hình. Chương này rút gọn từ bản tiếng Việt của chương camera trong đợt cập nhật. Lượt 30 fps ngày 30/10 ghi nhận 9.000 khung, khoảng cách trung bình 33,3229 ms, jitter P99 0,0303 ms, không có sequence gap và offset sensor→receive P99 12,157 ms. Lượt 10 fps ngày 31/10 ghi nhận 3.000 khung, khoảng cách trung bình 99,957 ms, jitter P99 0,359 ms, không rơi khung và offset sensor→receive P99 10,54 ms. Cả hai lượt đáp ứng các ngưỡng timing; cặp BOOTTIME/MONOTONIC đầu và cuối lượt 10 fps giữ offset đọc lần lượt khoảng −1,09 và −1,02 µs, phù hợp với clock stability đã kiểm tra.</w:t>
-      </w:r>
-    </w:p>
-    <w:p>
-      <w:pPr/>
-      <w:r>
-        <w:rPr/>
-        <w:t xml:space="preserve">hea_cam nhận frame qua callback hoàn tất request của libcamera, dùng sequence của buffer làm frame_id và ghi t_recv_mono_ns bằng CLOCK_MONOTONIC ngay đầu callback; pixel RGB được sao chép sau khi đồng bộ đọc DMA buffer và loại padding theo stride. SensorTimestamp đánh dấu bắt đầu phơi sáng dòng đầu tiên, được giữ nguyên trong t_sensor_ns và truyền làm t_input_ns. Timestamp này thuộc CLOCK_BOOTTIME; chỉ giả định ánh xạ đồng nhất sang MONOTONIC khi Pi không suspend. Cần ghi cặp BOOTTIME/MONOTONIC đầu và cuối lượt, vì một cặp đầu lượt chưa chứng minh quan hệ hai clock ổn định.</w:t>
-      </w:r>
-    </w:p>
-    <w:p>
-      <w:pPr>
-        <w:pStyle w:val="Heading2"/>
-      </w:pPr>
-      <w:r>
-        <w:rPr/>
-        <w:t xml:space="preserve">5.2 Ring pixel và chính sách đầu vào</w:t>
-      </w:r>
-    </w:p>
-    <w:p>
-      <w:pPr/>
-      <w:r>
-        <w:rPr/>
-        <w:t xml:space="preserve">Pixel nằm trong shared-memory ring hữu hạn, mặc định bốn slot; Unix datagram vẫn chỉ mang frame_id 4 byte và t_input_ns 8 byte, little-endian. Tách pixel khỏi notification giữ nguyên record IPC, đồng thời tránh đưa cả ảnh vào socket queue. Reader chọn slot theo frame_id modulo số slot. Writer duy nhất chuyển sequence counter từ chẵn sang lẻ, ghi dữ liệu rồi công bố counter chẵn. Reader sao chép một lần có giới hạn và kiểm tra lại counter để tránh dùng ảnh không nhất quán.</w:t>
-      </w:r>
-    </w:p>
-    <w:p>
-      <w:pPr/>
-      <w:r>
-        <w:rPr/>
-        <w:t xml:space="preserve">Counter lẻ hoặc thay đổi được đếm là torn; slot ổn định nhưng chứa frame_id khác được đếm là overwritten và bỏ qua. Với input-policy latest, inference rút các notification đang chờ, chọn đầu vào hợp lệ mới nhất và đếm skipped_stale. Bridge có latest-value riêng cho kết quả chờ gửi. Đường đi là camera → ring và notification → inference → bridge → UART → supervisor. Cơ chế này giới hạn dữ liệu cũ bằng cách bỏ công việc, nhưng không làm inference nhanh hơn hoặc bảo đảm deadline.</w:t>
-      </w:r>
-    </w:p>
-    <w:p>
-      <w:pPr>
-        <w:pStyle w:val="Heading2"/>
-      </w:pPr>
-      <w:r>
-        <w:rPr/>
-        <w:t xml:space="preserve">5.3 Mốc AoI và điều kiện kiểm chứng</w:t>
-      </w:r>
-    </w:p>
-    <w:p>
-      <w:pPr/>
-      <w:r>
-        <w:rPr/>
-        <w:t xml:space="preserve">Gọi g_i là thời điểm phơi sáng đã ánh xạ sang đồng hồ consumer và r_i là thời điểm nhận kết quả. Ngay sau cập nhật, tuổi dữ liệu bằng r_i − g_i; trước cập nhật kế tiếp, tuổi tăng tuyến tính theo thời gian. AoI trung bình phải lấy diện tích dưới đường tuổi chia cho thời lượng cửa sổ đã khởi tạo, kể cả khoảng ngừng nhận. Không dùng latency trung bình của gói để thay thế phép tính này. Cách tính giữ nguyên ý nghĩa AoI đã nêu ở Phần 2.</w:t>
-      </w:r>
-    </w:p>
-    <w:p>
-      <w:pPr/>
-      <w:r>
-        <w:rPr/>
-        <w:t xml:space="preserve">Trong hai lượt OS-T1, offset t_recv − t_sensor luôn dương và P99 nhỏ hơn chu kỳ tương ứng cộng 10 ms: lượt 30 fps có P50/P99/cực đại 10,411/12,157/14,676 ms; lượt 10 fps có P99 10,54 ms. Lượt 10 fps ghi cặp BOOTTIME/MONOTONIC ở đầu và cuối, offset đọc lần lượt −1,093 và −1,018 µs; throttling bằng 0x0 trước/sau. Cùng với chu kỳ, jitter và số khung rơi đạt ngưỡng, OS-T1 đáp ứng đầy đủ tiêu chí. Camera/inference dùng MONOTONIC, trong khi bridge hiện dùng MONOTONIC_RAW để kiểm tuổi và đồng bộ, nên chưa được trừ trực tiếp các mốc này khi diễn giải AoI camera đầu-cuối trên MCU.</w:t>
-      </w:r>
-    </w:p>
-    <w:p>
-      <w:pPr>
-        <w:pStyle w:val="Heading1"/>
-      </w:pPr>
-      <w:r>
-        <w:rPr/>
-        <w:t xml:space="preserve">PHẦN 6. ĐÁNH GIÁ SƠ BỘ</w:t>
-      </w:r>
-    </w:p>
-    <w:p>
-      <w:pPr>
-        <w:pStyle w:val="Heading2"/>
-      </w:pPr>
-      <w:r>
-        <w:rPr/>
-        <w:t xml:space="preserve">6.1 Tiến độ kiểm thử camera đến giữa kỳ</w:t>
-      </w:r>
-    </w:p>
-    <w:p>
-      <w:pPr/>
-      <w:r>
-        <w:rPr/>
-        <w:t xml:space="preserve">Bảng 2 tổng hợp số đo Pi ngày 29–31/10 và đối chiếu tiêu chí kiểm thử đã định trước. PASS/FAIL xét cả chỉ số lẫn điều kiện hợp lệ của lượt chạy. OS-T1 đạt ở cả 30 fps và 10 fps. OS-T2 đạt với governor performance ở cấu hình 2 luồng; các lượt ondemand ngày 29/10 vẫn được giữ và đánh dấu không hợp lệ. Một lần thử ngày 31/10 không chạy được do thiếu onnxruntime trong Python hệ thống và đã bị xóa trước khi lưu trữ. T3/T4 giữ FAIL theo kết quả và giới hạn metric đã ghi; số liệu AoI tại RX không đồng nghĩa với AoI trung bình theo thời gian.</w:t>
+        <w:t xml:space="preserve">Hình 4.1 ghi lại các kết nối bench đã xác nhận giữa Raspberry Pi 5 và NUCLEO-F446RE. UART dùng mức logic 3,3 V, đấu chéo TX/RX và nối mass chung. Camera v2 dùng cáp ribbon 22-to-15 pin tới CAM/DISP 0. MPU6050 đã nối trên bàn thử qua I2C1, nhưng firmware OS hiện chưa sử dụng; phần lấy mẫu thuộc kế hoạch OS-T7.</w:t>
+      </w:r>
+    </w:p>
+    <w:p>
+      <w:pPr>
+        <w:keepNext/>
+        <w:ind w:firstLine="0"/>
+        <w:jc w:val="center"/>
+      </w:pPr>
+      <w:r>
+        <w:drawing>
+          <wp:inline xmlns:wp="http://schemas.openxmlformats.org/drawingml/2006/wordprocessingDrawing" distT="0" distB="0" distL="0" distR="0">
+            <wp:extent cx="5759952" cy="4772531"/>
+            <wp:docPr id="6" name="Hình 6" descr="Hình 4.1. Sơ đồ đấu nối bàn thử OS (hình vẽ breadboard; vị trí bo minh họa, kết nối theo bảng pinout). Hình bo mạch: Fritzing parts, CC-BY-SA 3.0."/>
+            <a:graphic xmlns:a="http://schemas.openxmlformats.org/drawingml/2006/main">
+              <a:graphicData uri="http://schemas.openxmlformats.org/drawingml/2006/picture">
+                <pic:pic xmlns:pic="http://schemas.openxmlformats.org/drawingml/2006/picture">
+                  <pic:nvPicPr>
+                    <pic:cNvPr id="6" name="image6.png"/>
+                    <pic:cNvPicPr/>
+                  </pic:nvPicPr>
+                  <pic:blipFill>
+                    <a:blip r:embed="rIdImage6"/>
+                    <a:stretch>
+                      <a:fillRect/>
+                    </a:stretch>
+                  </pic:blipFill>
+                  <pic:spPr>
+                    <a:xfrm>
+                      <a:off x="0" y="0"/>
+                      <a:ext cx="5759952" cy="4772531"/>
+                    </a:xfrm>
+                    <a:prstGeom prst="rect">
+                      <a:avLst/>
+                    </a:prstGeom>
+                  </pic:spPr>
+                </pic:pic>
+              </a:graphicData>
+            </a:graphic>
+          </wp:inline>
+        </w:drawing>
+      </w:r>
+    </w:p>
+    <w:p>
+      <w:pPr>
+        <w:pStyle w:val="Caption"/>
+        <w:jc w:val="center"/>
+      </w:pPr>
+      <w:r>
+        <w:rPr/>
+        <w:t xml:space="preserve">Hình 4.1. Sơ đồ đấu nối bàn thử OS (hình vẽ breadboard; vị trí bo minh họa, kết nối theo bảng pinout). Hình bo mạch: Fritzing parts, CC-BY-SA 3.0.</w:t>
       </w:r>
     </w:p>
     <w:p>
@@ -6160,7 +7025,7 @@
       </w:pPr>
       <w:r>
         <w:rPr/>
-        <w:t xml:space="preserve">Bảng 2. Số đo và đối chiếu tiêu chí OS-T1–OS-T4 trên Raspberry Pi 5.</w:t>
+        <w:t xml:space="preserve">Bảng 2. Pinout kết nối bàn thử OS.</w:t>
       </w:r>
     </w:p>
     <w:tbl>
@@ -6206,6 +7071,800 @@
               <w:rPr>
                 <w:b/>
               </w:rPr>
+              <w:t xml:space="preserve">Phía Pi / ngoại vi</w:t>
+            </w:r>
+          </w:p>
+        </w:tc>
+        <w:tc>
+          <w:tcPr>
+            <w:tcW w:w="3023" w:type="dxa"/>
+            <w:shd w:fill="E8EEF4"/>
+            <w:vAlign w:val="center"/>
+          </w:tcPr>
+          <w:p>
+            <w:pPr>
+              <w:pStyle w:val="TableText"/>
+            </w:pPr>
+            <w:r>
+              <w:rPr>
+                <w:b/>
+              </w:rPr>
+              <w:t xml:space="preserve">Tín hiệu và vai trò</w:t>
+            </w:r>
+          </w:p>
+        </w:tc>
+        <w:tc>
+          <w:tcPr>
+            <w:tcW w:w="3023" w:type="dxa"/>
+            <w:shd w:fill="E8EEF4"/>
+            <w:vAlign w:val="center"/>
+          </w:tcPr>
+          <w:p>
+            <w:pPr>
+              <w:pStyle w:val="TableText"/>
+            </w:pPr>
+            <w:r>
+              <w:rPr>
+                <w:b/>
+              </w:rPr>
+              <w:t xml:space="preserve">Chân Nucleo</w:t>
+            </w:r>
+          </w:p>
+        </w:tc>
+      </w:tr>
+      <w:tr>
+        <w:trPr>
+          <w:cantSplit/>
+        </w:trPr>
+        <w:tc>
+          <w:tcPr>
+            <w:tcW w:w="3023" w:type="dxa"/>
+          </w:tcPr>
+          <w:p>
+            <w:pPr>
+              <w:pStyle w:val="TableText"/>
+            </w:pPr>
+            <w:r>
+              <w:rPr/>
+              <w:t xml:space="preserve">Pi 8 / GPIO14</w:t>
+            </w:r>
+          </w:p>
+        </w:tc>
+        <w:tc>
+          <w:tcPr>
+            <w:tcW w:w="3023" w:type="dxa"/>
+          </w:tcPr>
+          <w:p>
+            <w:pPr>
+              <w:pStyle w:val="TableText"/>
+            </w:pPr>
+            <w:r>
+              <w:rPr/>
+              <w:t xml:space="preserve">TXD → USART1 RX, 921600 baud</w:t>
+            </w:r>
+          </w:p>
+        </w:tc>
+        <w:tc>
+          <w:tcPr>
+            <w:tcW w:w="3023" w:type="dxa"/>
+          </w:tcPr>
+          <w:p>
+            <w:pPr>
+              <w:pStyle w:val="TableText"/>
+            </w:pPr>
+            <w:r>
+              <w:rPr/>
+              <w:t xml:space="preserve">PA10 / D2</w:t>
+            </w:r>
+          </w:p>
+        </w:tc>
+      </w:tr>
+      <w:tr>
+        <w:trPr>
+          <w:cantSplit/>
+        </w:trPr>
+        <w:tc>
+          <w:tcPr>
+            <w:tcW w:w="3023" w:type="dxa"/>
+          </w:tcPr>
+          <w:p>
+            <w:pPr>
+              <w:pStyle w:val="TableText"/>
+            </w:pPr>
+            <w:r>
+              <w:rPr/>
+              <w:t xml:space="preserve">Pi 10 / GPIO15</w:t>
+            </w:r>
+          </w:p>
+        </w:tc>
+        <w:tc>
+          <w:tcPr>
+            <w:tcW w:w="3023" w:type="dxa"/>
+          </w:tcPr>
+          <w:p>
+            <w:pPr>
+              <w:pStyle w:val="TableText"/>
+            </w:pPr>
+            <w:r>
+              <w:rPr/>
+              <w:t xml:space="preserve">RXD ← USART1 TX, 921600 baud</w:t>
+            </w:r>
+          </w:p>
+        </w:tc>
+        <w:tc>
+          <w:tcPr>
+            <w:tcW w:w="3023" w:type="dxa"/>
+          </w:tcPr>
+          <w:p>
+            <w:pPr>
+              <w:pStyle w:val="TableText"/>
+            </w:pPr>
+            <w:r>
+              <w:rPr/>
+              <w:t xml:space="preserve">PA9 / D8</w:t>
+            </w:r>
+          </w:p>
+        </w:tc>
+      </w:tr>
+      <w:tr>
+        <w:trPr>
+          <w:cantSplit/>
+        </w:trPr>
+        <w:tc>
+          <w:tcPr>
+            <w:tcW w:w="3023" w:type="dxa"/>
+          </w:tcPr>
+          <w:p>
+            <w:pPr>
+              <w:pStyle w:val="TableText"/>
+            </w:pPr>
+            <w:r>
+              <w:rPr/>
+              <w:t xml:space="preserve">6</w:t>
+            </w:r>
+          </w:p>
+        </w:tc>
+        <w:tc>
+          <w:tcPr>
+            <w:tcW w:w="3023" w:type="dxa"/>
+          </w:tcPr>
+          <w:p>
+            <w:pPr>
+              <w:pStyle w:val="TableText"/>
+            </w:pPr>
+            <w:r>
+              <w:rPr/>
+              <w:t xml:space="preserve">GND chung</w:t>
+            </w:r>
+          </w:p>
+        </w:tc>
+        <w:tc>
+          <w:tcPr>
+            <w:tcW w:w="3023" w:type="dxa"/>
+          </w:tcPr>
+          <w:p>
+            <w:pPr>
+              <w:pStyle w:val="TableText"/>
+            </w:pPr>
+            <w:r>
+              <w:rPr/>
+              <w:t xml:space="preserve">GND</w:t>
+            </w:r>
+          </w:p>
+        </w:tc>
+      </w:tr>
+      <w:tr>
+        <w:trPr>
+          <w:cantSplit/>
+        </w:trPr>
+        <w:tc>
+          <w:tcPr>
+            <w:tcW w:w="3023" w:type="dxa"/>
+          </w:tcPr>
+          <w:p>
+            <w:pPr>
+              <w:pStyle w:val="TableText"/>
+            </w:pPr>
+            <w:r>
+              <w:rPr/>
+              <w:t xml:space="preserve">CAM/DISP 0</w:t>
+            </w:r>
+          </w:p>
+        </w:tc>
+        <w:tc>
+          <w:tcPr>
+            <w:tcW w:w="3023" w:type="dxa"/>
+          </w:tcPr>
+          <w:p>
+            <w:pPr>
+              <w:pStyle w:val="TableText"/>
+            </w:pPr>
+            <w:r>
+              <w:rPr/>
+              <w:t xml:space="preserve">Camera v2 IMX219 qua ribbon 22-to-15 pin</w:t>
+            </w:r>
+          </w:p>
+        </w:tc>
+        <w:tc>
+          <w:tcPr>
+            <w:tcW w:w="3023" w:type="dxa"/>
+          </w:tcPr>
+          <w:p>
+            <w:pPr>
+              <w:pStyle w:val="TableText"/>
+            </w:pPr>
+            <w:r>
+              <w:rPr/>
+              <w:t xml:space="preserve">—</w:t>
+            </w:r>
+          </w:p>
+        </w:tc>
+      </w:tr>
+      <w:tr>
+        <w:trPr>
+          <w:cantSplit/>
+        </w:trPr>
+        <w:tc>
+          <w:tcPr>
+            <w:tcW w:w="3023" w:type="dxa"/>
+          </w:tcPr>
+          <w:p>
+            <w:pPr>
+              <w:pStyle w:val="TableText"/>
+            </w:pPr>
+            <w:r>
+              <w:rPr/>
+              <w:t xml:space="preserve">LED xanh lá</w:t>
+            </w:r>
+          </w:p>
+        </w:tc>
+        <w:tc>
+          <w:tcPr>
+            <w:tcW w:w="3023" w:type="dxa"/>
+          </w:tcPr>
+          <w:p>
+            <w:pPr>
+              <w:pStyle w:val="TableText"/>
+            </w:pPr>
+            <w:r>
+              <w:rPr/>
+              <w:t xml:space="preserve">FRESH</w:t>
+            </w:r>
+          </w:p>
+        </w:tc>
+        <w:tc>
+          <w:tcPr>
+            <w:tcW w:w="3023" w:type="dxa"/>
+          </w:tcPr>
+          <w:p>
+            <w:pPr>
+              <w:pStyle w:val="TableText"/>
+            </w:pPr>
+            <w:r>
+              <w:rPr/>
+              <w:t xml:space="preserve">D4 / PB5</w:t>
+            </w:r>
+          </w:p>
+        </w:tc>
+      </w:tr>
+      <w:tr>
+        <w:trPr>
+          <w:cantSplit/>
+        </w:trPr>
+        <w:tc>
+          <w:tcPr>
+            <w:tcW w:w="3023" w:type="dxa"/>
+          </w:tcPr>
+          <w:p>
+            <w:pPr>
+              <w:pStyle w:val="TableText"/>
+            </w:pPr>
+            <w:r>
+              <w:rPr/>
+              <w:t xml:space="preserve">LED vàng</w:t>
+            </w:r>
+          </w:p>
+        </w:tc>
+        <w:tc>
+          <w:tcPr>
+            <w:tcW w:w="3023" w:type="dxa"/>
+          </w:tcPr>
+          <w:p>
+            <w:pPr>
+              <w:pStyle w:val="TableText"/>
+            </w:pPr>
+            <w:r>
+              <w:rPr/>
+              <w:t xml:space="preserve">HOLD</w:t>
+            </w:r>
+          </w:p>
+        </w:tc>
+        <w:tc>
+          <w:tcPr>
+            <w:tcW w:w="3023" w:type="dxa"/>
+          </w:tcPr>
+          <w:p>
+            <w:pPr>
+              <w:pStyle w:val="TableText"/>
+            </w:pPr>
+            <w:r>
+              <w:rPr/>
+              <w:t xml:space="preserve">D5 / PB4</w:t>
+            </w:r>
+          </w:p>
+        </w:tc>
+      </w:tr>
+      <w:tr>
+        <w:trPr>
+          <w:cantSplit/>
+        </w:trPr>
+        <w:tc>
+          <w:tcPr>
+            <w:tcW w:w="3023" w:type="dxa"/>
+          </w:tcPr>
+          <w:p>
+            <w:pPr>
+              <w:pStyle w:val="TableText"/>
+            </w:pPr>
+            <w:r>
+              <w:rPr/>
+              <w:t xml:space="preserve">LED đỏ</w:t>
+            </w:r>
+          </w:p>
+        </w:tc>
+        <w:tc>
+          <w:tcPr>
+            <w:tcW w:w="3023" w:type="dxa"/>
+          </w:tcPr>
+          <w:p>
+            <w:pPr>
+              <w:pStyle w:val="TableText"/>
+            </w:pPr>
+            <w:r>
+              <w:rPr/>
+              <w:t xml:space="preserve">FAILSAFE, chốt đến khi rearm</w:t>
+            </w:r>
+          </w:p>
+        </w:tc>
+        <w:tc>
+          <w:tcPr>
+            <w:tcW w:w="3023" w:type="dxa"/>
+          </w:tcPr>
+          <w:p>
+            <w:pPr>
+              <w:pStyle w:val="TableText"/>
+            </w:pPr>
+            <w:r>
+              <w:rPr/>
+              <w:t xml:space="preserve">D6 / PB10</w:t>
+            </w:r>
+          </w:p>
+        </w:tc>
+      </w:tr>
+      <w:tr>
+        <w:trPr>
+          <w:cantSplit/>
+        </w:trPr>
+        <w:tc>
+          <w:tcPr>
+            <w:tcW w:w="3023" w:type="dxa"/>
+          </w:tcPr>
+          <w:p>
+            <w:pPr>
+              <w:pStyle w:val="TableText"/>
+            </w:pPr>
+            <w:r>
+              <w:rPr/>
+              <w:t xml:space="preserve">LED xanh dương</w:t>
+            </w:r>
+          </w:p>
+        </w:tc>
+        <w:tc>
+          <w:tcPr>
+            <w:tcW w:w="3023" w:type="dxa"/>
+          </w:tcPr>
+          <w:p>
+            <w:pPr>
+              <w:pStyle w:val="TableText"/>
+            </w:pPr>
+            <w:r>
+              <w:rPr/>
+              <w:t xml:space="preserve">Đảo mức mỗi frame được chấp nhận</w:t>
+            </w:r>
+          </w:p>
+        </w:tc>
+        <w:tc>
+          <w:tcPr>
+            <w:tcW w:w="3023" w:type="dxa"/>
+          </w:tcPr>
+          <w:p>
+            <w:pPr>
+              <w:pStyle w:val="TableText"/>
+            </w:pPr>
+            <w:r>
+              <w:rPr/>
+              <w:t xml:space="preserve">D9 / PC7</w:t>
+            </w:r>
+          </w:p>
+        </w:tc>
+      </w:tr>
+      <w:tr>
+        <w:trPr>
+          <w:cantSplit/>
+        </w:trPr>
+        <w:tc>
+          <w:tcPr>
+            <w:tcW w:w="3023" w:type="dxa"/>
+          </w:tcPr>
+          <w:p>
+            <w:pPr>
+              <w:pStyle w:val="TableText"/>
+            </w:pPr>
+            <w:r>
+              <w:rPr/>
+              <w:t xml:space="preserve">LD2 trên bo</w:t>
+            </w:r>
+          </w:p>
+        </w:tc>
+        <w:tc>
+          <w:tcPr>
+            <w:tcW w:w="3023" w:type="dxa"/>
+          </w:tcPr>
+          <w:p>
+            <w:pPr>
+              <w:pStyle w:val="TableText"/>
+            </w:pPr>
+            <w:r>
+              <w:rPr/>
+              <w:t xml:space="preserve">FRESH</w:t>
+            </w:r>
+          </w:p>
+        </w:tc>
+        <w:tc>
+          <w:tcPr>
+            <w:tcW w:w="3023" w:type="dxa"/>
+          </w:tcPr>
+          <w:p>
+            <w:pPr>
+              <w:pStyle w:val="TableText"/>
+            </w:pPr>
+            <w:r>
+              <w:rPr/>
+              <w:t xml:space="preserve">PA5</w:t>
+            </w:r>
+          </w:p>
+        </w:tc>
+      </w:tr>
+      <w:tr>
+        <w:trPr>
+          <w:cantSplit/>
+        </w:trPr>
+        <w:tc>
+          <w:tcPr>
+            <w:tcW w:w="3023" w:type="dxa"/>
+          </w:tcPr>
+          <w:p>
+            <w:pPr>
+              <w:pStyle w:val="TableText"/>
+            </w:pPr>
+            <w:r>
+              <w:rPr/>
+              <w:t xml:space="preserve">MPU6050 SCL</w:t>
+            </w:r>
+          </w:p>
+        </w:tc>
+        <w:tc>
+          <w:tcPr>
+            <w:tcW w:w="3023" w:type="dxa"/>
+          </w:tcPr>
+          <w:p>
+            <w:pPr>
+              <w:pStyle w:val="TableText"/>
+            </w:pPr>
+            <w:r>
+              <w:rPr/>
+              <w:t xml:space="preserve">I2C1, đã nối; OS-T7 dự kiến</w:t>
+            </w:r>
+          </w:p>
+        </w:tc>
+        <w:tc>
+          <w:tcPr>
+            <w:tcW w:w="3023" w:type="dxa"/>
+          </w:tcPr>
+          <w:p>
+            <w:pPr>
+              <w:pStyle w:val="TableText"/>
+            </w:pPr>
+            <w:r>
+              <w:rPr/>
+              <w:t xml:space="preserve">PB6 / D10</w:t>
+            </w:r>
+          </w:p>
+        </w:tc>
+      </w:tr>
+      <w:tr>
+        <w:trPr>
+          <w:cantSplit/>
+        </w:trPr>
+        <w:tc>
+          <w:tcPr>
+            <w:tcW w:w="3023" w:type="dxa"/>
+          </w:tcPr>
+          <w:p>
+            <w:pPr>
+              <w:pStyle w:val="TableText"/>
+            </w:pPr>
+            <w:r>
+              <w:rPr/>
+              <w:t xml:space="preserve">MPU6050 SDA</w:t>
+            </w:r>
+          </w:p>
+        </w:tc>
+        <w:tc>
+          <w:tcPr>
+            <w:tcW w:w="3023" w:type="dxa"/>
+          </w:tcPr>
+          <w:p>
+            <w:pPr>
+              <w:pStyle w:val="TableText"/>
+            </w:pPr>
+            <w:r>
+              <w:rPr/>
+              <w:t xml:space="preserve">I2C1, đã nối; firmware OS chưa dùng</w:t>
+            </w:r>
+          </w:p>
+        </w:tc>
+        <w:tc>
+          <w:tcPr>
+            <w:tcW w:w="3023" w:type="dxa"/>
+          </w:tcPr>
+          <w:p>
+            <w:pPr>
+              <w:pStyle w:val="TableText"/>
+            </w:pPr>
+            <w:r>
+              <w:rPr/>
+              <w:t xml:space="preserve">PB7 / CN7 chân 21</w:t>
+            </w:r>
+          </w:p>
+        </w:tc>
+      </w:tr>
+      <w:tr>
+        <w:trPr>
+          <w:cantSplit/>
+        </w:trPr>
+        <w:tc>
+          <w:tcPr>
+            <w:tcW w:w="3023" w:type="dxa"/>
+          </w:tcPr>
+          <w:p>
+            <w:pPr>
+              <w:pStyle w:val="TableText"/>
+            </w:pPr>
+            <w:r>
+              <w:rPr/>
+              <w:t xml:space="preserve">MPU6050 VCC/GND</w:t>
+            </w:r>
+          </w:p>
+        </w:tc>
+        <w:tc>
+          <w:tcPr>
+            <w:tcW w:w="3023" w:type="dxa"/>
+          </w:tcPr>
+          <w:p>
+            <w:pPr>
+              <w:pStyle w:val="TableText"/>
+            </w:pPr>
+            <w:r>
+              <w:rPr/>
+              <w:t xml:space="preserve">VCC/GND; chưa ghi vị trí chân header nguồn</w:t>
+            </w:r>
+          </w:p>
+        </w:tc>
+        <w:tc>
+          <w:tcPr>
+            <w:tcW w:w="3023" w:type="dxa"/>
+          </w:tcPr>
+          <w:p>
+            <w:pPr>
+              <w:pStyle w:val="TableText"/>
+            </w:pPr>
+            <w:r>
+              <w:rPr/>
+              <w:t xml:space="preserve">VCC/GND</w:t>
+            </w:r>
+          </w:p>
+        </w:tc>
+      </w:tr>
+    </w:tbl>
+    <w:p>
+      <w:pPr/>
+      <w:r>
+        <w:rPr/>
+        <w:t xml:space="preserve">Hai vị trí dưới đây dành cho ảnh thực tế của bàn thử.</w:t>
+      </w:r>
+    </w:p>
+    <w:p>
+      <w:pPr/>
+      <w:r>
+        <w:rPr>
+          <w:b/>
+        </w:rPr>
+        <w:t xml:space="preserve">Ảnh bàn thử: toàn cảnh</w:t>
+      </w:r>
+      <w:r>
+        <w:rPr/>
+        <w:t xml:space="preserve"> — [Chừa vị trí để chủ bench chèn ảnh toàn cảnh.]</w:t>
+      </w:r>
+    </w:p>
+    <w:p>
+      <w:pPr/>
+      <w:r>
+        <w:rPr>
+          <w:b/>
+        </w:rPr>
+        <w:t xml:space="preserve">Ảnh cận cảnh module camera</w:t>
+      </w:r>
+      <w:r>
+        <w:rPr/>
+        <w:t xml:space="preserve"> — [Chừa vị trí để chủ bench chèn ảnh cận camera và đầu ribbon.]</w:t>
+      </w:r>
+    </w:p>
+    <w:p>
+      <w:pPr>
+        <w:pStyle w:val="Heading1"/>
+      </w:pPr>
+      <w:r>
+        <w:rPr/>
+        <w:t xml:space="preserve">PHẦN 5. NGUỒN CAMERA VÀ PIPELINE ƯU TIÊN ĐỘ MỚI</w:t>
+      </w:r>
+    </w:p>
+    <w:p>
+      <w:pPr>
+        <w:pStyle w:val="Heading2"/>
+      </w:pPr>
+      <w:r>
+        <w:rPr/>
+        <w:t xml:space="preserve">5.1 Động cơ và capture</w:t>
+      </w:r>
+    </w:p>
+    <w:p>
+      <w:pPr/>
+      <w:r>
+        <w:rPr/>
+        <w:t xml:space="preserve">Nguồn tổng hợp trước đây chỉ tạo frame_id và timestamp, nên chưa phản ánh thời điểm cảnh được phơi sáng; nguồn Pi Camera v2 (IMX219) bổ sung pixel thật để khảo sát scheduling, IPC và queue trên workload thực tế; nhóm không đánh giá độ chính xác mô hình. Phần này tóm lược nội dung camera tiếng Việt của đợt cập nhật. Lượt 30 fps ngày 30/10 ghi nhận 9.000 khung, khoảng cách trung bình 33,3229 ms, jitter P99 0,0303 ms, không có sequence gap và offset sensor→receive P99 12,157 ms. Lượt 10 fps ngày 31/10 ghi nhận 3.000 khung, khoảng cách trung bình 99,957 ms, jitter P99 0,359 ms, không rơi khung và offset sensor→receive P99 10,54 ms. Cả hai lượt đáp ứng các ngưỡng timing; cặp BOOTTIME/MONOTONIC đầu và cuối lượt 10 fps giữ offset đọc lần lượt khoảng −1,09 và −1,02 µs, phù hợp với clock stability đã kiểm tra.</w:t>
+      </w:r>
+    </w:p>
+    <w:p>
+      <w:pPr/>
+      <w:r>
+        <w:rPr/>
+        <w:t xml:space="preserve">hea_cam nhận frame qua callback hoàn tất request của libcamera, dùng sequence của buffer làm frame_id và ghi t_recv_mono_ns bằng CLOCK_MONOTONIC ngay đầu callback; pixel RGB được sao chép sau khi đồng bộ đọc DMA buffer và loại padding theo stride. SensorTimestamp đánh dấu bắt đầu phơi sáng dòng đầu tiên, được giữ nguyên trong t_sensor_ns và truyền làm t_input_ns. Timestamp này thuộc CLOCK_BOOTTIME; chỉ giả định ánh xạ đồng nhất sang MONOTONIC khi Pi không suspend. Cần ghi cặp BOOTTIME/MONOTONIC đầu và cuối lượt, vì cặp đầu lượt chưa chứng minh quan hệ hai clock ổn định.</w:t>
+      </w:r>
+    </w:p>
+    <w:p>
+      <w:pPr>
+        <w:pStyle w:val="Heading2"/>
+      </w:pPr>
+      <w:r>
+        <w:rPr/>
+        <w:t xml:space="preserve">5.2 Ring pixel và chính sách đầu vào</w:t>
+      </w:r>
+    </w:p>
+    <w:p>
+      <w:pPr/>
+      <w:r>
+        <w:rPr/>
+        <w:t xml:space="preserve">Pixel nằm trong shared-memory ring hữu hạn, mặc định bốn slot; Unix datagram vẫn chỉ mang frame_id 4 byte và t_input_ns 8 byte, little-endian. Tách pixel khỏi notification giữ nguyên record IPC, đồng thời tránh đưa cả ảnh vào socket queue. Reader chọn slot theo frame_id modulo số slot. Writer duy nhất chuyển sequence counter từ chẵn sang lẻ, ghi dữ liệu rồi công bố counter chẵn. Reader sao chép một lần có giới hạn và kiểm tra lại counter để tránh dùng ảnh không nhất quán.</w:t>
+      </w:r>
+    </w:p>
+    <w:p>
+      <w:pPr/>
+      <w:r>
+        <w:rPr/>
+        <w:t xml:space="preserve">Counter lẻ hoặc thay đổi được đếm là torn; slot ổn định nhưng chứa frame_id khác được đếm là overwritten và bỏ qua. Với input-policy latest, inference rút các notification đang chờ, chọn đầu vào hợp lệ mới nhất và đếm skipped_stale. Bridge có latest-value riêng cho kết quả chờ gửi. Đường đi là camera → ring và notification → inference → bridge → UART → supervisor. Cơ chế này hạn chế dữ liệu cũ bằng cách bỏ đầu vào cũ, nhưng không làm inference nhanh hơn hoặc bảo đảm deadline.</w:t>
+      </w:r>
+    </w:p>
+    <w:p>
+      <w:pPr>
+        <w:pStyle w:val="Heading2"/>
+      </w:pPr>
+      <w:r>
+        <w:rPr/>
+        <w:t xml:space="preserve">5.3 Mốc AoI và điều kiện kiểm chứng</w:t>
+      </w:r>
+    </w:p>
+    <w:p>
+      <w:pPr/>
+      <w:r>
+        <w:rPr/>
+        <w:t xml:space="preserve">Gọi g_i là thời điểm phơi sáng đã ánh xạ sang đồng hồ consumer và r_i là thời điểm nhận kết quả. Ngay sau cập nhật, tuổi dữ liệu bằng r_i − g_i; trước cập nhật kế tiếp, tuổi tăng tuyến tính theo thời gian. AoI trung bình phải lấy diện tích dưới đường tuổi chia cho thời lượng cửa sổ đã khởi tạo, kể cả khoảng ngừng nhận. Không dùng latency trung bình của gói để thay thế phép tính này. Cách tính giữ nguyên ý nghĩa AoI đã nêu ở Phần 2.</w:t>
+      </w:r>
+    </w:p>
+    <w:p>
+      <w:pPr/>
+      <w:r>
+        <w:rPr/>
+        <w:t xml:space="preserve">Trong hai lượt OS-T1, offset t_recv − t_sensor luôn dương và P99 nhỏ hơn chu kỳ tương ứng cộng 10 ms: lượt 30 fps có P50/P99/cực đại 10,411/12,157/14,676 ms; lượt 10 fps có P99 10,54 ms. Lượt 10 fps ghi cặp BOOTTIME/MONOTONIC ở đầu và cuối, offset đọc lần lượt −1,093 và −1,018 µs; throttling bằng 0x0 trước/sau. Cùng với chu kỳ, jitter và số khung rơi (drops) đạt ngưỡng, OS-T1 đáp ứng đầy đủ tiêu chí. Camera/inference dùng MONOTONIC, trong khi bridge hiện dùng MONOTONIC_RAW để kiểm tuổi và đồng bộ, nên chưa được trừ trực tiếp các mốc này khi diễn giải AoI camera đầu-cuối trên MCU.</w:t>
+      </w:r>
+    </w:p>
+    <w:p>
+      <w:pPr>
+        <w:pStyle w:val="Heading1"/>
+      </w:pPr>
+      <w:r>
+        <w:rPr/>
+        <w:t xml:space="preserve">PHẦN 6. ĐÁNH GIÁ SƠ BỘ</w:t>
+      </w:r>
+    </w:p>
+    <w:p>
+      <w:pPr>
+        <w:pStyle w:val="Heading2"/>
+      </w:pPr>
+      <w:r>
+        <w:rPr/>
+        <w:t xml:space="preserve">6.1 Tiến độ kiểm thử camera đến giữa kỳ</w:t>
+      </w:r>
+    </w:p>
+    <w:p>
+      <w:pPr/>
+      <w:r>
+        <w:rPr/>
+        <w:t xml:space="preserve">Bảng 3 tổng hợp số đo Pi ngày 29–31/10 và đối chiếu tiêu chí kiểm thử đã định trước. PASS/FAIL xét cả chỉ số lẫn điều kiện hợp lệ của lượt chạy. OS-T1 đạt ở cả 30 fps và 10 fps. OS-T2 đạt với governor performance ở cấu hình 2 luồng; các lượt ondemand ngày 29/10 vẫn được giữ và đánh dấu không hợp lệ. Một lần thử ngày 31/10 không chạy được do thiếu onnxruntime trong Python hệ thống và đã bị xóa trước khi lưu trữ. OS-T3 giữ FAIL vì P1 không giảm P99 ở mọi tải và tỷ lệ lỡ hạn vượt 1%. OS-T4 giảm AoI trung bình theo thời gian ở cả ba lượt mỗi điều kiện, nhưng vẫn FAIL vì chưa chứng minh hàng đợi FIFO tăng không giới hạn; cấu hình mixed chưa chạy và liên kết chỉ là PTY, không có MCU.</w:t>
+      </w:r>
+    </w:p>
+    <w:p>
+      <w:pPr>
+        <w:pStyle w:val="TableCaption"/>
+      </w:pPr>
+      <w:r>
+        <w:rPr/>
+        <w:t xml:space="preserve">Bảng 3. Số đo và đối chiếu tiêu chí OS-T1–OS-T4 trên Raspberry Pi 5.</w:t>
+      </w:r>
+    </w:p>
+    <w:tbl>
+      <w:tblPr>
+        <w:tblW w:w="9071" w:type="dxa"/>
+        <w:tblBorders>
+          <w:top w:val="single" w:sz="4" w:color="808080"/>
+          <w:left w:val="single" w:sz="4" w:color="808080"/>
+          <w:bottom w:val="single" w:sz="4" w:color="808080"/>
+          <w:right w:val="single" w:sz="4" w:color="808080"/>
+          <w:insideH w:val="single" w:sz="4" w:color="808080"/>
+          <w:insideV w:val="single" w:sz="4" w:color="808080"/>
+        </w:tblBorders>
+        <w:tblLayout w:type="fixed"/>
+        <w:tblCellMar>
+          <w:top w:w="60" w:type="dxa"/>
+          <w:left w:w="115" w:type="dxa"/>
+          <w:bottom w:w="60" w:type="dxa"/>
+          <w:right w:w="115" w:type="dxa"/>
+        </w:tblCellMar>
+      </w:tblPr>
+      <w:tblGrid>
+        <w:gridCol w:w="3023"/>
+        <w:gridCol w:w="3023"/>
+        <w:gridCol w:w="3023"/>
+      </w:tblGrid>
+      <w:tr>
+        <w:trPr>
+          <w:cantSplit/>
+          <w:tblHeader/>
+        </w:trPr>
+        <w:tc>
+          <w:tcPr>
+            <w:tcW w:w="3023" w:type="dxa"/>
+            <w:shd w:fill="E8EEF4"/>
+            <w:vAlign w:val="center"/>
+          </w:tcPr>
+          <w:p>
+            <w:pPr>
+              <w:pStyle w:val="TableText"/>
+            </w:pPr>
+            <w:r>
+              <w:rPr>
+                <w:b/>
+              </w:rPr>
               <w:t xml:space="preserve">Kiểm thử</w:t>
             </w:r>
           </w:p>
@@ -6369,7 +8028,7 @@
             </w:pPr>
             <w:r>
               <w:rPr/>
-              <w:t xml:space="preserve">FAIL; dữ liệu xác nhận hồi quy khi tải băng thông nhớ, đúng với nhãn nhóm.</w:t>
+              <w:t xml:space="preserve">FAIL — không đạt cả yêu cầu P1 P99 ≤ P0 P99 ở mọi tải và tỷ lệ lỡ hạn P1 ≤ 1%; 3/5 lượt dự kiến.</w:t>
             </w:r>
           </w:p>
         </w:tc>
@@ -6383,7 +8042,7 @@
             </w:pPr>
             <w:r>
               <w:rPr/>
-              <w:t xml:space="preserve">Latency camera→inference hoàn tất P50/P99, trung vị 3 lượt (ms), P0→P1: nhàn 58,224/59,894→58,090/59,608; CPU stream 321,040/355,267→320,926/355,420; memory-rate 363,034/408,248→370,637/421,862. Tỉ lệ trễ hạn và cyclictest max không có trong summary nên chưa đối chiếu được hai chỉ số đó.</w:t>
+              <w:t xml:space="preserve">E2, trung vị 3 lượt, service P99 P0→P1 (ms): nhàn 59,89→59,61; stream 355,27→355,42; memrate 408,25→421,86. Với deadline bằng chu kỳ nguồn 100 ms, tỷ lệ lỡ hạn P0/P1: nhàn 0/0; stream 1,0/1,0; memrate 1,0/1,0 (1,0 tương ứng 100%). Tranh chấp nhớ/cache kéo inference lên khoảng 320–420 ms; P1 điều chỉnh CPU, không dành riêng nhớ/cache. Chiến dịch không thu cyclictest max.</w:t>
             </w:r>
           </w:p>
         </w:tc>
@@ -6416,7 +8075,7 @@
             </w:pPr>
             <w:r>
               <w:rPr/>
-              <w:t xml:space="preserve">FAIL; chưa đủ bằng chứng đạt tiêu chí AoI trung bình theo thời gian và hàng FIFO tăng không giới hạn, phù hợp nhãn nhóm.</w:t>
+              <w:t xml:space="preserve">FAIL — AoI giảm ở mọi lượt nhưng chưa chứng minh FIFO tăng không giới hạn; chưa chạy mixed hay UART vật lý có MCU.</w:t>
             </w:r>
           </w:p>
         </w:tc>
@@ -6430,7 +8089,7 @@
             </w:pPr>
             <w:r>
               <w:rPr/>
-              <w:t xml:space="preserve">AoI tại RX P50/P99, trung vị 3 lượt (ms): nhàn FIFO 170,413/186,858; latest 169,997/186,508. Memory-rate FIFO 263,403/314,712; latest 265,366/300,181. Summary không ghi time-average/peak AoI, deadline-miss fraction hay queue length; dưới tải có khoảng 1.300 frame bị ring overwrite/lượt (đây không phải số đo độ dài hàng FIFO).</w:t>
+              <w:t xml:space="preserve">E3B, P1, bridge latest, 3 lượt mỗi input-policy. AoI trung bình theo thời gian (ms), FIFO/latest: nhàn 191,8–192,1/92,6–93,4; memrate 321,3–336,7/223,4–234,6. Trung vị AoI đỉnh: nhàn 236,4/135,2; memrate 456,1/351,9 ms. Tỷ lệ lỡ hạn &gt;100 ms: nhàn khoảng 99,8%/0%; memrate 100%/100%. Latest bỏ 398–444 đầu vào cũ/lượt khi nhàn và 1.315–1.344 khi memrate. Không ghi độ dài queue; AoI FIFO nhàn ổn định khoảng 192 ms, số khung rơi bằng 0, gợi ý backlog hữu hạn. Liên kết là PTY, không có MCU.</w:t>
             </w:r>
           </w:p>
         </w:tc>
@@ -6455,57 +8114,7 @@
         <w:drawing>
           <wp:inline xmlns:wp="http://schemas.openxmlformats.org/drawingml/2006/wordprocessingDrawing" distT="0" distB="0" distL="0" distR="0">
             <wp:extent cx="4320000" cy="1851428"/>
-            <wp:docPr id="6" name="Hình 6" descr="OS-T1. Phân bố khoảng cách frame từ timestamp sensor trong hai lượt 30 fps và 10 fps."/>
-            <a:graphic xmlns:a="http://schemas.openxmlformats.org/drawingml/2006/main">
-              <a:graphicData uri="http://schemas.openxmlformats.org/drawingml/2006/picture">
-                <pic:pic xmlns:pic="http://schemas.openxmlformats.org/drawingml/2006/picture">
-                  <pic:nvPicPr>
-                    <pic:cNvPr id="6" name="image6.png"/>
-                    <pic:cNvPicPr/>
-                  </pic:nvPicPr>
-                  <pic:blipFill>
-                    <a:blip r:embed="rIdImage6"/>
-                    <a:stretch>
-                      <a:fillRect/>
-                    </a:stretch>
-                  </pic:blipFill>
-                  <pic:spPr>
-                    <a:xfrm>
-                      <a:off x="0" y="0"/>
-                      <a:ext cx="4320000" cy="1851428"/>
-                    </a:xfrm>
-                    <a:prstGeom prst="rect">
-                      <a:avLst/>
-                    </a:prstGeom>
-                  </pic:spPr>
-                </pic:pic>
-              </a:graphicData>
-            </a:graphic>
-          </wp:inline>
-        </w:drawing>
-      </w:r>
-    </w:p>
-    <w:p>
-      <w:pPr>
-        <w:pStyle w:val="Caption"/>
-        <w:jc w:val="center"/>
-      </w:pPr>
-      <w:r>
-        <w:rPr/>
-        <w:t xml:space="preserve">OS-T1. Phân bố khoảng cách frame từ timestamp sensor trong hai lượt 30 fps và 10 fps.</w:t>
-      </w:r>
-    </w:p>
-    <w:p>
-      <w:pPr>
-        <w:keepNext/>
-        <w:ind w:firstLine="0"/>
-        <w:jc w:val="center"/>
-      </w:pPr>
-      <w:r>
-        <w:drawing>
-          <wp:inline xmlns:wp="http://schemas.openxmlformats.org/drawingml/2006/wordprocessingDrawing" distT="0" distB="0" distL="0" distR="0">
-            <wp:extent cx="4320000" cy="1851428"/>
-            <wp:docPr id="7" name="Hình 7" descr="OS-T2. P50/P95/P99 latency suy luận theo số luồng."/>
+            <wp:docPr id="7" name="Hình 7" descr="OS-T1. Phân bố khoảng cách frame từ timestamp sensor trong hai lượt 30 fps và 10 fps."/>
             <a:graphic xmlns:a="http://schemas.openxmlformats.org/drawingml/2006/main">
               <a:graphicData uri="http://schemas.openxmlformats.org/drawingml/2006/picture">
                 <pic:pic xmlns:pic="http://schemas.openxmlformats.org/drawingml/2006/picture">
@@ -6542,7 +8151,7 @@
       </w:pPr>
       <w:r>
         <w:rPr/>
-        <w:t xml:space="preserve">OS-T2. P50/P95/P99 latency suy luận theo số luồng.</w:t>
+        <w:t xml:space="preserve">OS-T1. Phân bố khoảng cách frame từ timestamp sensor trong hai lượt 30 fps và 10 fps.</w:t>
       </w:r>
     </w:p>
     <w:p>
@@ -6555,7 +8164,7 @@
         <w:drawing>
           <wp:inline xmlns:wp="http://schemas.openxmlformats.org/drawingml/2006/wordprocessingDrawing" distT="0" distB="0" distL="0" distR="0">
             <wp:extent cx="4320000" cy="1851428"/>
-            <wp:docPr id="8" name="Hình 8" descr="OS-T3. Latency P99 camera→inference hoàn tất theo tải, so sánh P0/P1."/>
+            <wp:docPr id="8" name="Hình 8" descr="OS-T2. P50/P95/P99 latency suy luận theo số luồng."/>
             <a:graphic xmlns:a="http://schemas.openxmlformats.org/drawingml/2006/main">
               <a:graphicData uri="http://schemas.openxmlformats.org/drawingml/2006/picture">
                 <pic:pic xmlns:pic="http://schemas.openxmlformats.org/drawingml/2006/picture">
@@ -6592,7 +8201,7 @@
       </w:pPr>
       <w:r>
         <w:rPr/>
-        <w:t xml:space="preserve">OS-T3. Latency P99 camera→inference hoàn tất theo tải, so sánh P0/P1.</w:t>
+        <w:t xml:space="preserve">OS-T2. P50/P95/P99 latency suy luận theo số luồng.</w:t>
       </w:r>
     </w:p>
     <w:p>
@@ -6604,8 +8213,8 @@
       <w:r>
         <w:drawing>
           <wp:inline xmlns:wp="http://schemas.openxmlformats.org/drawingml/2006/wordprocessingDrawing" distT="0" distB="0" distL="0" distR="0">
-            <wp:extent cx="4320000" cy="1928571"/>
-            <wp:docPr id="9" name="Hình 9" descr="OS-T4. AoI tại RX theo FIFO/latest và tải."/>
+            <wp:extent cx="4320000" cy="1851428"/>
+            <wp:docPr id="9" name="Hình 9" descr="OS-T3. Latency P99 camera→inference hoàn tất theo tải, so sánh P0/P1."/>
             <a:graphic xmlns:a="http://schemas.openxmlformats.org/drawingml/2006/main">
               <a:graphicData uri="http://schemas.openxmlformats.org/drawingml/2006/picture">
                 <pic:pic xmlns:pic="http://schemas.openxmlformats.org/drawingml/2006/picture">
@@ -6615,6 +8224,56 @@
                   </pic:nvPicPr>
                   <pic:blipFill>
                     <a:blip r:embed="rIdImage9"/>
+                    <a:stretch>
+                      <a:fillRect/>
+                    </a:stretch>
+                  </pic:blipFill>
+                  <pic:spPr>
+                    <a:xfrm>
+                      <a:off x="0" y="0"/>
+                      <a:ext cx="4320000" cy="1851428"/>
+                    </a:xfrm>
+                    <a:prstGeom prst="rect">
+                      <a:avLst/>
+                    </a:prstGeom>
+                  </pic:spPr>
+                </pic:pic>
+              </a:graphicData>
+            </a:graphic>
+          </wp:inline>
+        </w:drawing>
+      </w:r>
+    </w:p>
+    <w:p>
+      <w:pPr>
+        <w:pStyle w:val="Caption"/>
+        <w:jc w:val="center"/>
+      </w:pPr>
+      <w:r>
+        <w:rPr/>
+        <w:t xml:space="preserve">OS-T3. Latency P99 camera→inference hoàn tất theo tải, so sánh P0/P1.</w:t>
+      </w:r>
+    </w:p>
+    <w:p>
+      <w:pPr>
+        <w:keepNext/>
+        <w:ind w:firstLine="0"/>
+        <w:jc w:val="center"/>
+      </w:pPr>
+      <w:r>
+        <w:drawing>
+          <wp:inline xmlns:wp="http://schemas.openxmlformats.org/drawingml/2006/wordprocessingDrawing" distT="0" distB="0" distL="0" distR="0">
+            <wp:extent cx="4320000" cy="1928571"/>
+            <wp:docPr id="10" name="Hình 10" descr="OS-T4. AoI tại RX theo FIFO/latest và tải."/>
+            <a:graphic xmlns:a="http://schemas.openxmlformats.org/drawingml/2006/main">
+              <a:graphicData uri="http://schemas.openxmlformats.org/drawingml/2006/picture">
+                <pic:pic xmlns:pic="http://schemas.openxmlformats.org/drawingml/2006/picture">
+                  <pic:nvPicPr>
+                    <pic:cNvPr id="10" name="image10.png"/>
+                    <pic:cNvPicPr/>
+                  </pic:nvPicPr>
+                  <pic:blipFill>
+                    <a:blip r:embed="rIdImage10"/>
                     <a:stretch>
                       <a:fillRect/>
                     </a:stretch>
@@ -6658,7 +8317,7 @@
       <w:pPr/>
       <w:r>
         <w:rPr/>
-        <w:t xml:space="preserve">Các bảng lịch sử dưới đây giữ dữ liệu trước đợt camera, gồm nguồn tổng hợp, ảnh cố định và PTY; chúng không xác nhận OS-T1–OS-T4 mới. Nhóm đo riêng đánh thức định kỳ, inference độc lập, pipeline phần mềm và phản ứng trên bo mạch. Số lượt thu được không đồng nghĩa số lượt đủ điều kiện cho mọi cách phân tích: ở Bảng 3, E1/E2/E3 PTY đạt 45/45 theo kiểm tra phần mềm ban đầu nhưng chỉ 0/45 đủ theo dõi bổ sung. Mỗi điều kiện được ghi đầu vào, tải nền, cấu hình scheduler và chế độ điều chỉnh tần số. Mẫu cùng lượt không phải lần lặp độc lập, vì vậy phân vị lấy trung vị giữa lượt, còn giá trị lớn nhất lấy cực đại quan sát.</w:t>
+        <w:t xml:space="preserve">Các bảng lịch sử giữ dữ liệu trước đợt camera, gồm nguồn tổng hợp, ảnh cố định và PTY; chúng không xác nhận OS-T1–OS-T4 mới. Nhóm đo riêng đánh thức định kỳ, inference độc lập, pipeline phần mềm và phản ứng trên bo mạch. Số lượt thu được không đồng nghĩa với số lượt đủ điều kiện cho mọi cách phân tích: ở Bảng 4, E1/E2/E3 PTY đạt 45/45 theo kiểm tra phần mềm ban đầu nhưng chỉ 0/45 đủ theo dõi bổ sung. Mỗi điều kiện được ghi đầu vào, tải nền, cấu hình scheduler và chế độ điều chỉnh tần số. Mẫu cùng lượt không phải lần lặp độc lập, vì vậy phân vị lấy trung vị giữa lượt, còn giá trị lớn nhất là cực đại quan sát.</w:t>
       </w:r>
     </w:p>
     <w:p>
@@ -6667,7 +8326,7 @@
       </w:pPr>
       <w:r>
         <w:rPr/>
-        <w:t xml:space="preserve">Bảng 3. Tổng hợp số lượt đo và phạm vi sử dụng.</w:t>
+        <w:t xml:space="preserve">Bảng 4. Tổng hợp số lượt đo và phạm vi sử dụng.</w:t>
       </w:r>
     </w:p>
     <w:tbl>
@@ -6987,7 +8646,7 @@
       <w:pPr/>
       <w:r>
         <w:rPr/>
-        <w:t xml:space="preserve">Ở Bảng 4, nhóm dùng cyclictest với luồng đo trên CPU 0, timer cách nhau 1 ms và bộ nhớ được khóa. Với mỗi lượt kéo dài 120 s và 3 lần lặp cho mỗi điều kiện, nhóm đối chiếu P0 dùng SCHED_OTHER với P1 dùng FIFO priority 50 đã được kiểm tra trên luồng đo. Hai hàng đối chiếu latency thường gặp và phần đuôi.</w:t>
+        <w:t xml:space="preserve">Ở Bảng 5, nhóm dùng cyclictest với luồng đo trên CPU 0, timer cách nhau 1 ms và bộ nhớ được khóa. Với mỗi lượt kéo dài 120 s và 3 lần lặp cho mỗi điều kiện, nhóm đối chiếu P0 dùng SCHED_OTHER với P1 dùng FIFO priority 50 đã được kiểm tra trên luồng đo. Hai hàng đối chiếu latency thường gặp và phần đuôi.</w:t>
       </w:r>
     </w:p>
     <w:p>
@@ -6996,7 +8655,7 @@
       </w:pPr>
       <w:r>
         <w:rPr/>
-        <w:t xml:space="preserve">Bảng 4. Kết quả sơ bộ cyclictest, đơn vị µs; P50/P99 là trung vị giữa lượt đo, giá trị lớn nhất là cực đại quan sát.</w:t>
+        <w:t xml:space="preserve">Bảng 5. Kết quả sơ bộ cyclictest, đơn vị µs; P50/P99 là trung vị giữa lượt đo, giá trị lớn nhất là cực đại quan sát.</w:t>
       </w:r>
     </w:p>
     <w:tbl>
@@ -7370,7 +9029,7 @@
       <w:pPr/>
       <w:r>
         <w:rPr/>
-        <w:t xml:space="preserve">Khi có memrate ở Bảng 4, P99 của P0 tăng từ 57 lên 613 µs, còn P1 tăng từ 9 lên 239 µs. Mặc dù P1 giảm tail latency so với P0, tải nhớ vẫn gây ảnh hưởng; hơn nữa, trung vị P0 còn chịu timer slack nên khoảng cách P50 chưa thể quy hết cho thời gian chờ bộ scheduler. Quan sát này phù hợp với việc các lõi chia sẻ tài nguyên, tuy vậy đây chưa phải phép đo trực tiếp băng thông nhớ. Kết quả đánh thức timer cũng không đại diện cho thời gian inference hoặc latency UART.</w:t>
+        <w:t xml:space="preserve">Khi có memrate ở Bảng 5, P99 của P0 tăng từ 57 lên 613 µs, còn P1 tăng từ 9 lên 239 µs. Mặc dù P1 giảm tail latency so với P0, tải nhớ vẫn gây ảnh hưởng; hơn nữa, trung vị P0 còn chịu timer slack nên khoảng cách P50 chưa thể quy hết cho thời gian chờ của scheduler. Quan sát này phù hợp với việc các lõi chia sẻ tài nguyên, tuy vậy đây chưa phải phép đo trực tiếp băng thông nhớ. Kết quả đánh thức timer cũng không đại diện cho thời gian inference hoặc latency UART.</w:t>
       </w:r>
     </w:p>
     <w:p>
@@ -7379,7 +9038,7 @@
       </w:pPr>
       <w:r>
         <w:rPr/>
-        <w:t xml:space="preserve">Bảng 5. Thời gian gọi MobileNetV2 ở các điều kiện tải và số thread, đơn vị ms.</w:t>
+        <w:t xml:space="preserve">Bảng 6. Thời gian gọi MobileNetV2 ở các điều kiện tải và số luồng, đơn vị ms.</w:t>
       </w:r>
     </w:p>
     <w:tbl>
@@ -7884,7 +9543,7 @@
       <w:pPr/>
       <w:r>
         <w:rPr/>
-        <w:t xml:space="preserve">Mỗi lượt ở Bảng 5 tính giờ 1000 lần gọi sau 50 lần chạy làm nóng. Khi nhàn rỗi, P50 giảm từ 44.0 ms với 1 luồng xuống 29.4 ms với 3 luồng, cho thấy thêm luồng có thể giúp lời gọi mô hình hoàn tất sớm hơn. Dưới tải CPU, hàng 4 luồng lại có P50 là 60.3 ms, cao hơn 45.1 ms của hàng 1 luồng. Vì lợi ích phụ thuộc tranh chấp và số lượt hợp lệ cũng khác nhau, nhóm tách tiền xử lý khỏi lời gọi mô hình để tránh gộp các công việc vào cùng kết luận.</w:t>
+        <w:t xml:space="preserve">Mỗi lượt ở Bảng 6 tính giờ 1000 lần gọi sau 50 lần chạy làm nóng. Khi nhàn rỗi, P50 giảm từ 44.0 ms với 1 luồng xuống 29.4 ms với 3 luồng, cho thấy thêm luồng có thể giúp lời gọi mô hình hoàn tất sớm hơn. Dưới tải CPU, hàng 4 luồng lại có P50 là 60.3 ms, cao hơn 45.1 ms của hàng 1 luồng. Vì lợi ích phụ thuộc tranh chấp và số lượt hợp lệ khác nhau, nhóm tách tiền xử lý khỏi lời gọi mô hình để tránh gộp các công việc vào cùng kết luận.</w:t>
       </w:r>
     </w:p>
     <w:p>
@@ -7900,7 +9559,7 @@
       <w:pPr/>
       <w:r>
         <w:rPr/>
-        <w:t xml:space="preserve">Bảng 6 đo từ lúc sinh đầu vào tới khi receiver trên Pi nhận kết quả qua PTY, với 3 lần lặp mỗi ô. Phép đo khảo sát queue và tính toán. Đây là pipeline phần mềm. Kết quả chưa đại diện UART vật lý giữa Pi và STM32.</w:t>
+        <w:t xml:space="preserve">Bảng 7 đo từ lúc sinh đầu vào tới khi receiver trên Pi nhận kết quả qua PTY, với 3 lần lặp mỗi ô. Phép đo khảo sát queue và tính toán trên pipeline phần mềm. Kết quả chưa đại diện UART vật lý Pi–STM32.</w:t>
       </w:r>
     </w:p>
     <w:p>
@@ -7909,7 +9568,7 @@
       </w:pPr>
       <w:r>
         <w:rPr/>
-        <w:t xml:space="preserve">Bảng 6. Kết quả sơ bộ E1/E2/E3: latency và AoI, đơn vị ms; không phải phép đo UART vật lý.</w:t>
+        <w:t xml:space="preserve">Bảng 7. Kết quả sơ bộ E1/E2/E3: latency và AoI, đơn vị ms; không phải phép đo UART vật lý.</w:t>
       </w:r>
     </w:p>
     <w:tbl>
@@ -8377,7 +10036,7 @@
       <w:pPr/>
       <w:r>
         <w:rPr/>
-        <w:t xml:space="preserve">Trong Bảng 6, P50 chuyển giao E1 P0 tăng từ 44.37 ms khi idle lên 6626 ms dưới memrate. Ở E3 memrate, AoI trung bình của latest là 6958 ms, trong khi FIFO là 6660 ms; thay kết quả tại bridge chưa làm tuổi giảm. Bộ đếm thay thế tại bridge của các hàng E3 đều bằng 0 trong bảng tổng hợp, gợi ý dữ liệu đang chờ trước inference. Nhóm vì vậy đối chiếu từng giai đoạn trước khi quy nguyên nhân cho inference chậm, giữ kết quả cache E2 vì P1 cũng chưa cải thiện chung.</w:t>
+        <w:t xml:space="preserve">Trong Bảng 7, P50 chuyển giao E1 P0 tăng từ 44.37 ms khi idle lên 6626 ms dưới memrate. Ở E3 memrate, AoI trung bình của latest là 6958 ms, trong khi FIFO là 6660 ms; việc thay kết quả tại bridge chưa làm giảm tuổi dữ liệu. Bộ đếm thay thế tại bridge của các hàng E3 đều bằng 0 trong bảng tổng hợp, gợi ý dữ liệu đang chờ trước inference. Nhóm vì vậy đối chiếu từng giai đoạn trước khi quy nguyên nhân cho inference chậm, giữ kết quả cache E2 vì P1 cũng chưa cải thiện chung.</w:t>
       </w:r>
     </w:p>
     <w:p>
@@ -8391,7 +10050,7 @@
       <w:pPr/>
       <w:r>
         <w:rPr/>
-        <w:t xml:space="preserve">Nhóm chuyển điểm loại đầu vào cũ lên trước inference trong E3b, nhưng các lượt được chấp nhận vẫn phải tách khỏi lượt lỗi nguồn theo Bảng 3.</w:t>
+        <w:t xml:space="preserve">Nhóm chuyển điểm loại đầu vào cũ lên trước inference trong E3b, nhưng các lượt được chấp nhận vẫn phải tách khỏi lượt lỗi nguồn theo Bảng 4.</w:t>
       </w:r>
     </w:p>
     <w:p>
@@ -8407,14 +10066,14 @@
       <w:pPr/>
       <w:r>
         <w:rPr/>
-        <w:t xml:space="preserve">Đợt E3 đầu trên UART vật lý có 0/18 lượt đủ điều kiện so sánh; 16/18 lượt xuất hiện cảnh báo nguồn và mọi lượt tải bộ nhớ đều có sai lệch khớp đồng hồ vượt ngưỡng. Trong 18 lượt đo lại, sụt áp vẫn xuất hiện ở tất cả các lượt; khi giữ dữ liệu mới nhất ở cả đầu vào lẫn bridge dưới tải, lượt đầu còn ở FAILSAFE suốt cửa sổ. Các lượt tiếp theo ở HOLD lần lượt 92.15% và 91.44%, cho thấy cần xem diễn biến trạng thái thay vì chỉ đếm kết quả nhận được. Các lượt này chỉ dùng chẩn đoán.</w:t>
+        <w:t xml:space="preserve">Đợt E3 đầu trên UART vật lý có 0/18 lượt đủ điều kiện so sánh; 16/18 lượt xuất hiện cảnh báo nguồn và mọi lượt tải bộ nhớ đều có sai lệch khớp đồng hồ vượt ngưỡng. Trong 18 lượt đo lại, sụt áp vẫn xuất hiện ở tất cả các lượt; khi giữ dữ liệu mới nhất ở cả đầu vào lẫn bridge dưới tải, lượt đầu còn ở FAILSAFE suốt cửa sổ. Các lượt tiếp theo ở HOLD lần lượt 92.15% và 91.44%, cho thấy cần xem diễn biến trạng thái thay vì chỉ đếm kết quả nhận được. Các lượt này chỉ để chẩn đoán.</w:t>
       </w:r>
     </w:p>
     <w:p>
       <w:pPr/>
       <w:r>
         <w:rPr/>
-        <w:t xml:space="preserve">Bảng 7 phân biệt mất liveness với dữ liệu cũ khi heartbeat vẫn đến. F1 và F2 lấy heartbeat cuối làm mốc. F3 và F5 lấy inference cuối. Vì khác mốc, các latency không được gộp để so trực tiếp hai cơ chế.</w:t>
+        <w:t xml:space="preserve">Bảng 8 phân biệt mất liveness với dữ liệu cũ khi heartbeat vẫn đến. F1 và F2 lấy heartbeat cuối làm mốc. F3 và F5 lấy inference cuối. Vì khác mốc, các latency không được gộp để so trực tiếp hai cơ chế.</w:t>
       </w:r>
     </w:p>
     <w:p>
@@ -8423,7 +10082,7 @@
       </w:pPr>
       <w:r>
         <w:rPr/>
-        <w:t xml:space="preserve">Bảng 7. Thời gian MCU chuyển sang FAILSAFE theo nguyên nhân lỗi, đơn vị ms.</w:t>
+        <w:t xml:space="preserve">Bảng 8. Thời gian MCU chuyển sang FAILSAFE theo nguyên nhân lỗi, đơn vị ms.</w:t>
       </w:r>
     </w:p>
     <w:tbl>
@@ -8853,7 +10512,7 @@
       <w:pPr/>
       <w:r>
         <w:rPr/>
-        <w:t xml:space="preserve">Nhóm đặt ngưỡng heartbeat 100 ms, HOLD tuổi nguồn 200 ms và FAILSAFE tuổi nguồn 500 ms để thử phản ứng giám sát. Ở Bảng 7, P50 của F5 là 475.596 ms dù ngưỡng FAILSAFE tuổi nguồn lớn hơn khoảng sau lần nhận cuối. Vì kết quả đã có tuổi lúc gửi và phép ước lượng còn cộng khoản truyền giả định 5 ms, khoảng sau lần nhận cuối không dùng chung mốc bắt đầu với tuổi nguồn. HOLD chưa phải heartbeat timeout, bởi tuổi nguồn có thể vượt ngưỡng trong khi bản tin heartbeat vẫn đến, nên cần đọc đúng nguyên nhân chuyển trạng thái.</w:t>
+        <w:t xml:space="preserve">Nhóm đặt ngưỡng heartbeat 100 ms, HOLD tuổi nguồn 200 ms và FAILSAFE tuổi nguồn 500 ms để thử phản ứng giám sát. Ở Bảng 8, P50 của F5 là 475.596 ms dù ngưỡng FAILSAFE tuổi nguồn lớn hơn khoảng sau lần nhận cuối. Vì kết quả đã có tuổi lúc gửi và phép ước lượng còn cộng thời gian truyền giả định 5 ms, khoảng sau lần nhận cuối không dùng chung mốc bắt đầu với tuổi nguồn. HOLD chưa phải heartbeat timeout, bởi tuổi nguồn có thể vượt ngưỡng trong khi bản tin heartbeat vẫn đến, nên cần đọc đúng nguyên nhân chuyển trạng thái.</w:t>
       </w:r>
     </w:p>
     <w:p>
@@ -8885,7 +10544,7 @@
       <w:pPr/>
       <w:r>
         <w:rPr/>
-        <w:t xml:space="preserve">Kết quả sơ bộ cho RQ1 ghi nhận tail latency tăng dưới tải nhớ, còn RQ2 cho thấy priority cải thiện đánh thức nhưng chưa cô lập tài nguyên. Memory locking, affinity và priority cần thử loại trừ riêng. Với RQ3, bỏ đầu vào trước inference tác động phần tuổi khác với bỏ kết quả tại bridge. RQ4 có log MCU/GPIO, nhưng timeout danh định chưa phải cận trên phản ứng.</w:t>
+        <w:t xml:space="preserve">Kết quả sơ bộ cho RQ1 ghi nhận tail latency tăng dưới tải nhớ, còn RQ2 cho thấy priority cải thiện độ trễ đánh thức nhưng chưa cô lập tài nguyên. Memory locking, affinity và priority cần thử loại trừ riêng. Với RQ3, bỏ đầu vào trước inference tác động phần tuổi khác với bỏ kết quả tại bridge. RQ4 có log MCU/GPIO, nhưng timeout danh định chưa phải cận trên phản ứng.</w:t>
       </w:r>
     </w:p>
     <w:p>
@@ -8901,7 +10560,7 @@
       <w:pPr/>
       <w:r>
         <w:rPr/>
-        <w:t xml:space="preserve">OS-T3 FAIL: dưới memory-rate, latency P99 camera→inference hoàn tất của P1 tăng từ 408,248 lên 421,862 ms so với P0; CPU stream gần như không đổi nhưng không bù được hồi quy này. Summary không cung cấp deadline-miss fraction và cyclictest max nên kết luận không mở rộng sang hai chỉ số đó. OS-T4 cũng FAIL theo tiêu chí đã đặt trước: AoI tại RX P99 của latest thấp hơn FIFO ở hai cấu hình tổng hợp, nhưng một số lượt riêng không giảm và phép đo không tính AoI trung bình theo thời gian, AoI đỉnh hay tăng trưởng độ dài hàng FIFO. Đây chưa phải bằng chứng bác bỏ lợi ích latest-value; dữ liệu hiện có chưa đủ xác nhận giả thuyết kiểm thử. OS-T1 và OS-T2 đã đạt sau các lượt hợp lệ ngày 30–31/10; T3/T4 vẫn cần bổ sung các metric còn thiếu.</w:t>
+        <w:t xml:space="preserve">OS-T3 FAIL vì service P99 của P1 tăng ở cả stream và memrate, còn tỷ lệ lỡ hạn 100 ms đều là 100%, trong khi ưu tiên CPU, pinning và khóa trang nhớ không dành riêng băng thông nhớ/cache dùng chung để bảo vệ inference, vốn chậm hơn nhiều so với chu kỳ nguồn. Chiến dịch chỉ có ba lượt, chưa đủ năm lượt và không thu cyclictest max. OS-T4 giảm AoI trung bình theo thời gian ở mọi lượt, nhưng AoI FIFO nhàn quanh 192 ms cùng số khung rơi bằng 0 chỉ gợi ý backlog hữu hạn. Không ghi queue length, chưa chạy mixed và chưa đo UART vật lý có MCU, nên OS-T4 vẫn FAIL. Trung vị AoI đỉnh tính từ ba lượt; bảng theo điều kiện lưu cực đại.</w:t>
       </w:r>
     </w:p>
     <w:p>
@@ -8917,7 +10576,7 @@
       <w:pPr/>
       <w:r>
         <w:rPr/>
-        <w:t xml:space="preserve">Sụt áp là nhiễu chính dưới tải, nên một số lượt chỉ để tham khảo cùng nhiệt độ, chế độ tần số và số thread. Với cyclictest, phần có tải còn thiếu xác nhận process tạo tải hoạt động liên tục; các lượt pipeline lại thiếu độ phủ theo dõi toàn cửa sổ. Theo dõi điện áp định kỳ vẫn có thể bỏ lỡ nhiễu ngắn giữa các mẫu, trong khi cờ nguồn lưu từ trước phải được tách khỏi cảnh báo xảy ra ngay trong lượt. Hàng nghìn mẫu liên tiếp vẫn có thể tương quan, nên số mẫu lớn chưa thay được số lần chạy độc lập. Vì ánh xạ đồng hồ phụ thuộc echo và độ mới của phép khớp, task FIFO khi tiêm lỗi có thể làm bridge thiếu CPU và gián đoạn đường quan sát, nên thiếu STATE_EVENT chưa chứng minh MCU luôn FRESH và nhóm không tự điền tỷ lệ thời gian.</w:t>
+        <w:t xml:space="preserve">Sụt áp là nhiễu chính dưới tải, nên một số lượt chỉ để tham khảo cùng nhiệt độ, chế độ tần số và số luồng. Với cyclictest, phần có tải còn thiếu xác nhận process tạo tải hoạt động liên tục; các lượt pipeline lại thiếu độ phủ theo dõi toàn cửa sổ. Theo dõi điện áp định kỳ vẫn có thể bỏ lỡ nhiễu ngắn giữa các mẫu, trong khi cờ nguồn lưu từ trước phải được tách khỏi cảnh báo xảy ra ngay trong lượt. Hàng nghìn mẫu liên tiếp vẫn có thể tương quan, nên số mẫu lớn chưa thay được số lần chạy độc lập. Vì ánh xạ đồng hồ phụ thuộc echo và độ mới của phép khớp, task FIFO khi tiêm lỗi có thể làm bridge thiếu CPU và gián đoạn đường quan sát, nên thiếu STATE_EVENT chưa chứng minh MCU luôn FRESH và nhóm không tự điền tỷ lệ thời gian.</w:t>
       </w:r>
     </w:p>
     <w:p>
@@ -8949,7 +10608,7 @@
       <w:pPr/>
       <w:r>
         <w:rPr/>
-        <w:t xml:space="preserve">Bảng 8 là kế hoạch, chưa phải kết quả đã đạt. Nhóm ưu tiên sửa OS-T3/T4 và xác nhận đường UART trước khi thử tải mở rộng trên FreeRTOS. Mọi phép đo mới cần lưu cấu hình, lệnh chạy, log thô và tóm tắt; metadata phải phân biệt Pi 4 GB hiện tại với bo 8 GB của tập lịch sử. Các mốc có thể điều chỉnh theo kết quả kiểm tra nhưng không đổi ngưỡng đạt sau khi xem dữ liệu. Báo cáo cuối kỳ và demo dự kiến hoàn tất ngày 30/11/2026.</w:t>
+        <w:t xml:space="preserve">Bảng 9 là kế hoạch, chưa phải kết quả đã đạt. Nhóm ưu tiên sửa OS-T3/T4 và xác nhận đường UART trước khi thử tải mở rộng trên FreeRTOS. Mọi phép đo mới cần lưu cấu hình, lệnh chạy, log thô và tóm tắt; metadata phải phân biệt Pi 4 GB hiện tại với bo 8 GB của tập lịch sử. Các mốc có thể điều chỉnh theo kết quả kiểm tra nhưng không đổi ngưỡng đạt sau khi xem dữ liệu. Báo cáo cuối kỳ và demo dự kiến hoàn tất ngày 30/11/2026.</w:t>
       </w:r>
     </w:p>
     <w:p>
@@ -8958,7 +10617,7 @@
       </w:pPr>
       <w:r>
         <w:rPr/>
-        <w:t xml:space="preserve">Bảng 8. Kế hoạch kiểm thử và hoàn thiện cuối kỳ (dự kiến).</w:t>
+        <w:t xml:space="preserve">Bảng 9. Kế hoạch kiểm thử và hoàn thiện cuối kỳ (dự kiến).</w:t>
       </w:r>
     </w:p>
     <w:tbl>
@@ -9054,7 +10713,7 @@
             </w:pPr>
             <w:r>
               <w:rPr/>
-              <w:t xml:space="preserve">Củng cố số lượt hợp lệ T1/T2 nếu thời gian cho phép; bổ sung metric deadline/cyclictest cho T3 và time-average AoI/queue length cho T4; đo lại các cấu hình cần thiết</w:t>
+              <w:t xml:space="preserve">Củng cố số lượt hợp lệ T1/T2 nếu thời gian cho phép; bổ sung số lượt và cyclictest max cho T3, ghi queue length và chạy cấu hình mixed cho T4; đo lại các cấu hình cần thiết</w:t>
             </w:r>
           </w:p>
         </w:tc>
@@ -9238,7 +10897,7 @@
       <w:pPr/>
       <w:r>
         <w:rPr/>
-        <w:t xml:space="preserve">Mỗi cấu hình mặc định có ba lượt năm phút, trừ khi kịch bản quy định riêng; mục tiêu củng cố bằng chứng vẫn là ít nhất năm lượt hợp lệ khi đủ thời gian. Nhóm kiểm throttle bằng 0x0 trước/sau, governor performance, metadata và tiến trình tạo tải trong toàn cửa sổ. OS-T2 dùng 1.000 lượt làm nóng rồi 5.000 lần inference mỗi số thread; đây là quy trình dự kiến đối chiếu log, không phải số mẫu đã xác nhận. Khi chuyển firmware, bench phải sao lưu image cũ, kiểm hash và read-back theo runbook. UART OS dùng 921600 baud, thay cho con số 115200 trong bảng kịch bản cũ.</w:t>
+        <w:t xml:space="preserve">Mỗi cấu hình mặc định có ba lượt năm phút, trừ khi kịch bản quy định riêng; mục tiêu củng cố bằng chứng vẫn là ít nhất năm lượt hợp lệ khi đủ thời gian. Nhóm kiểm throttle bằng 0x0 trước/sau, governor performance, metadata và tiến trình tạo tải trong toàn cửa sổ. OS-T2 dùng 1.000 lượt làm nóng rồi 5.000 lần inference mỗi số luồng; đây là quy trình dự kiến đối chiếu log, không phải số mẫu đã xác nhận. Khi chuyển firmware, bench phải sao lưu image cũ, kiểm hash và read-back theo runbook. UART OS dùng 921600 baud, thay cho con số 115200 trong bảng kịch bản cũ.</w:t>
       </w:r>
     </w:p>
     <w:p>
@@ -9254,7 +10913,7 @@
       <w:pPr/>
       <w:r>
         <w:rPr/>
-        <w:t xml:space="preserve">Báo cáo ghi nhận camera IMX219 đã hoạt động và trình bày số đo mới cho OS-T1–OS-T4. OS-T1 PASS ở 30 fps và 10 fps, gồm timing, clock và validity; OS-T2 PASS với governor performance ở 2 luồng, đạt P99/P50 = 1,27. Các lượt T2 ondemand trước đó vẫn được giữ với nhãn không hợp lệ. OS-T3 FAIL do P1 tăng AoI P99 dưới tải băng thông nhớ. OS-T4 vẫn FAIL vì chưa đo time-average AoI và tăng trưởng hàng FIFO theo tiêu chí, dù AoI tại RX P99 trung vị của latest thấp hơn FIFO trong hai cấu hình tổng hợp. Nền tảng Edge-AI không đồng nhất cho phép quan sát Linux xử lý workload biến thiên và FreeRTOS giám sát qua UART. Supervisor cần kiểm cả liveness và freshness; nhóm sẽ bổ sung các metric còn thiếu cho T3/T4.</w:t>
+        <w:t xml:space="preserve">Báo cáo ghi nhận camera IMX219 đã hoạt động và trình bày số đo mới cho OS-T1–OS-T4. OS-T1 PASS ở 30 fps và 10 fps, gồm timing, clock và validity; OS-T2 PASS với governor performance ở 2 luồng, đạt P99/P50 = 1,27. Các lượt T2 ondemand trước đó vẫn được giữ với nhãn không hợp lệ. OS-T3 FAIL vì service P99 của P1 tăng dưới stream và memrate, đồng thời tỷ lệ lỡ hạn 100 ms là 100% ở cả hai tải. OS-T4 giảm AoI trung bình theo thời gian trong mọi lượt nhưng vẫn FAIL vì chưa chứng minh FIFO tăng không giới hạn; cấu hình mixed và đường UART vật lý có MCU chưa được kiểm thử trong chiến dịch này. Nền tảng Edge-AI không đồng nhất cho phép quan sát Linux xử lý workload biến thiên và FreeRTOS giám sát qua UART. Supervisor cần kiểm cả liveness và freshness; nhóm sẽ bổ sung số lượt, cyclictest max và bằng chứng về hàng đợi cho T3/T4.</w:t>
       </w:r>
     </w:p>
     <w:p>

</xml_diff>

<commit_message>
report: bench photos (annotated full setup, camera close-up) in section 4.5
Co-Authored-By: Claude Opus 5.5 <noreply@anthropic.com>
</commit_message>
<xml_diff>
--- a/report_vi/BaoCao_HDH_Nhom3Stars_GiuaKy.docx
+++ b/report_vi/BaoCao_HDH_Nhom3Stars_GiuaKy.docx
@@ -7681,33 +7681,107 @@
       <w:pPr/>
       <w:r>
         <w:rPr/>
-        <w:t xml:space="preserve">Hai vị trí dưới đây dành cho ảnh thực tế của bàn thử.</w:t>
-      </w:r>
-    </w:p>
-    <w:p>
-      <w:pPr/>
-      <w:r>
-        <w:rPr>
-          <w:b/>
-        </w:rPr>
-        <w:t xml:space="preserve">Ảnh bàn thử: toàn cảnh</w:t>
-      </w:r>
-      <w:r>
-        <w:rPr/>
-        <w:t xml:space="preserve"> — [Chừa vị trí để chủ bench chèn ảnh toàn cảnh.]</w:t>
-      </w:r>
-    </w:p>
-    <w:p>
-      <w:pPr/>
-      <w:r>
-        <w:rPr>
-          <w:b/>
-        </w:rPr>
-        <w:t xml:space="preserve">Ảnh cận cảnh module camera</w:t>
-      </w:r>
-      <w:r>
-        <w:rPr/>
-        <w:t xml:space="preserve"> — [Chừa vị trí để chủ bench chèn ảnh cận camera và đầu ribbon.]</w:t>
+        <w:t xml:space="preserve">Hình 4.2 và 4.3 ghi lại bàn thử thực tế và cận cảnh module camera.</w:t>
+      </w:r>
+    </w:p>
+    <w:p>
+      <w:pPr>
+        <w:keepNext/>
+        <w:ind w:firstLine="0"/>
+        <w:jc w:val="center"/>
+      </w:pPr>
+      <w:r>
+        <w:drawing>
+          <wp:inline xmlns:wp="http://schemas.openxmlformats.org/drawingml/2006/wordprocessingDrawing" distT="0" distB="0" distL="0" distR="0">
+            <wp:extent cx="5760000" cy="4067676"/>
+            <wp:docPr id="7" name="Hình 7" descr="Hình 4.2. Bàn thử thực tế: Raspberry Pi 5 (4 GB, vỏ có quạt), NUCLEO-F446RE, breadboard với LED trạng thái và MPU6050, Pi Camera v2 nối qua cáp ribbon tới CAM/DISP 0."/>
+            <a:graphic xmlns:a="http://schemas.openxmlformats.org/drawingml/2006/main">
+              <a:graphicData uri="http://schemas.openxmlformats.org/drawingml/2006/picture">
+                <pic:pic xmlns:pic="http://schemas.openxmlformats.org/drawingml/2006/picture">
+                  <pic:nvPicPr>
+                    <pic:cNvPr id="7" name="image7.png"/>
+                    <pic:cNvPicPr/>
+                  </pic:nvPicPr>
+                  <pic:blipFill>
+                    <a:blip r:embed="rIdImage7"/>
+                    <a:stretch>
+                      <a:fillRect/>
+                    </a:stretch>
+                  </pic:blipFill>
+                  <pic:spPr>
+                    <a:xfrm>
+                      <a:off x="0" y="0"/>
+                      <a:ext cx="5760000" cy="4067676"/>
+                    </a:xfrm>
+                    <a:prstGeom prst="rect">
+                      <a:avLst/>
+                    </a:prstGeom>
+                  </pic:spPr>
+                </pic:pic>
+              </a:graphicData>
+            </a:graphic>
+          </wp:inline>
+        </w:drawing>
+      </w:r>
+    </w:p>
+    <w:p>
+      <w:pPr>
+        <w:pStyle w:val="Caption"/>
+        <w:jc w:val="center"/>
+      </w:pPr>
+      <w:r>
+        <w:rPr/>
+        <w:t xml:space="preserve">Hình 4.2. Bàn thử thực tế: Raspberry Pi 5 (4 GB, vỏ có quạt), NUCLEO-F446RE, breadboard với LED trạng thái và MPU6050, Pi Camera v2 nối qua cáp ribbon tới CAM/DISP 0.</w:t>
+      </w:r>
+    </w:p>
+    <w:p>
+      <w:pPr>
+        <w:keepNext/>
+        <w:ind w:firstLine="0"/>
+        <w:jc w:val="center"/>
+      </w:pPr>
+      <w:r>
+        <w:drawing>
+          <wp:inline xmlns:wp="http://schemas.openxmlformats.org/drawingml/2006/wordprocessingDrawing" distT="0" distB="0" distL="0" distR="0">
+            <wp:extent cx="2700000" cy="3600000"/>
+            <wp:docPr id="8" name="Hình 8" descr="Hình 4.3. Cận cảnh Pi Camera Module v2 (IMX219) và cáp ribbon 15 chân phía camera."/>
+            <a:graphic xmlns:a="http://schemas.openxmlformats.org/drawingml/2006/main">
+              <a:graphicData uri="http://schemas.openxmlformats.org/drawingml/2006/picture">
+                <pic:pic xmlns:pic="http://schemas.openxmlformats.org/drawingml/2006/picture">
+                  <pic:nvPicPr>
+                    <pic:cNvPr id="8" name="image8.jpg"/>
+                    <pic:cNvPicPr/>
+                  </pic:nvPicPr>
+                  <pic:blipFill>
+                    <a:blip r:embed="rIdImage8"/>
+                    <a:stretch>
+                      <a:fillRect/>
+                    </a:stretch>
+                  </pic:blipFill>
+                  <pic:spPr>
+                    <a:xfrm>
+                      <a:off x="0" y="0"/>
+                      <a:ext cx="2700000" cy="3600000"/>
+                    </a:xfrm>
+                    <a:prstGeom prst="rect">
+                      <a:avLst/>
+                    </a:prstGeom>
+                  </pic:spPr>
+                </pic:pic>
+              </a:graphicData>
+            </a:graphic>
+          </wp:inline>
+        </w:drawing>
+      </w:r>
+    </w:p>
+    <w:p>
+      <w:pPr>
+        <w:pStyle w:val="Caption"/>
+        <w:jc w:val="center"/>
+      </w:pPr>
+      <w:r>
+        <w:rPr/>
+        <w:t xml:space="preserve">Hình 4.3. Cận cảnh Pi Camera Module v2 (IMX219) và cáp ribbon 15 chân phía camera.</w:t>
       </w:r>
     </w:p>
     <w:p>
@@ -8114,107 +8188,7 @@
         <w:drawing>
           <wp:inline xmlns:wp="http://schemas.openxmlformats.org/drawingml/2006/wordprocessingDrawing" distT="0" distB="0" distL="0" distR="0">
             <wp:extent cx="4320000" cy="1851428"/>
-            <wp:docPr id="7" name="Hình 7" descr="OS-T1. Phân bố khoảng cách frame từ timestamp sensor trong hai lượt 30 fps và 10 fps."/>
-            <a:graphic xmlns:a="http://schemas.openxmlformats.org/drawingml/2006/main">
-              <a:graphicData uri="http://schemas.openxmlformats.org/drawingml/2006/picture">
-                <pic:pic xmlns:pic="http://schemas.openxmlformats.org/drawingml/2006/picture">
-                  <pic:nvPicPr>
-                    <pic:cNvPr id="7" name="image7.png"/>
-                    <pic:cNvPicPr/>
-                  </pic:nvPicPr>
-                  <pic:blipFill>
-                    <a:blip r:embed="rIdImage7"/>
-                    <a:stretch>
-                      <a:fillRect/>
-                    </a:stretch>
-                  </pic:blipFill>
-                  <pic:spPr>
-                    <a:xfrm>
-                      <a:off x="0" y="0"/>
-                      <a:ext cx="4320000" cy="1851428"/>
-                    </a:xfrm>
-                    <a:prstGeom prst="rect">
-                      <a:avLst/>
-                    </a:prstGeom>
-                  </pic:spPr>
-                </pic:pic>
-              </a:graphicData>
-            </a:graphic>
-          </wp:inline>
-        </w:drawing>
-      </w:r>
-    </w:p>
-    <w:p>
-      <w:pPr>
-        <w:pStyle w:val="Caption"/>
-        <w:jc w:val="center"/>
-      </w:pPr>
-      <w:r>
-        <w:rPr/>
-        <w:t xml:space="preserve">OS-T1. Phân bố khoảng cách frame từ timestamp sensor trong hai lượt 30 fps và 10 fps.</w:t>
-      </w:r>
-    </w:p>
-    <w:p>
-      <w:pPr>
-        <w:keepNext/>
-        <w:ind w:firstLine="0"/>
-        <w:jc w:val="center"/>
-      </w:pPr>
-      <w:r>
-        <w:drawing>
-          <wp:inline xmlns:wp="http://schemas.openxmlformats.org/drawingml/2006/wordprocessingDrawing" distT="0" distB="0" distL="0" distR="0">
-            <wp:extent cx="4320000" cy="1851428"/>
-            <wp:docPr id="8" name="Hình 8" descr="OS-T2. P50/P95/P99 latency suy luận theo số luồng."/>
-            <a:graphic xmlns:a="http://schemas.openxmlformats.org/drawingml/2006/main">
-              <a:graphicData uri="http://schemas.openxmlformats.org/drawingml/2006/picture">
-                <pic:pic xmlns:pic="http://schemas.openxmlformats.org/drawingml/2006/picture">
-                  <pic:nvPicPr>
-                    <pic:cNvPr id="8" name="image8.png"/>
-                    <pic:cNvPicPr/>
-                  </pic:nvPicPr>
-                  <pic:blipFill>
-                    <a:blip r:embed="rIdImage8"/>
-                    <a:stretch>
-                      <a:fillRect/>
-                    </a:stretch>
-                  </pic:blipFill>
-                  <pic:spPr>
-                    <a:xfrm>
-                      <a:off x="0" y="0"/>
-                      <a:ext cx="4320000" cy="1851428"/>
-                    </a:xfrm>
-                    <a:prstGeom prst="rect">
-                      <a:avLst/>
-                    </a:prstGeom>
-                  </pic:spPr>
-                </pic:pic>
-              </a:graphicData>
-            </a:graphic>
-          </wp:inline>
-        </w:drawing>
-      </w:r>
-    </w:p>
-    <w:p>
-      <w:pPr>
-        <w:pStyle w:val="Caption"/>
-        <w:jc w:val="center"/>
-      </w:pPr>
-      <w:r>
-        <w:rPr/>
-        <w:t xml:space="preserve">OS-T2. P50/P95/P99 latency suy luận theo số luồng.</w:t>
-      </w:r>
-    </w:p>
-    <w:p>
-      <w:pPr>
-        <w:keepNext/>
-        <w:ind w:firstLine="0"/>
-        <w:jc w:val="center"/>
-      </w:pPr>
-      <w:r>
-        <w:drawing>
-          <wp:inline xmlns:wp="http://schemas.openxmlformats.org/drawingml/2006/wordprocessingDrawing" distT="0" distB="0" distL="0" distR="0">
-            <wp:extent cx="4320000" cy="1851428"/>
-            <wp:docPr id="9" name="Hình 9" descr="OS-T3. Latency P99 camera→inference hoàn tất theo tải, so sánh P0/P1."/>
+            <wp:docPr id="9" name="Hình 9" descr="OS-T1. Phân bố khoảng cách frame từ timestamp sensor trong hai lượt 30 fps và 10 fps."/>
             <a:graphic xmlns:a="http://schemas.openxmlformats.org/drawingml/2006/main">
               <a:graphicData uri="http://schemas.openxmlformats.org/drawingml/2006/picture">
                 <pic:pic xmlns:pic="http://schemas.openxmlformats.org/drawingml/2006/picture">
@@ -8251,7 +8225,7 @@
       </w:pPr>
       <w:r>
         <w:rPr/>
-        <w:t xml:space="preserve">OS-T3. Latency P99 camera→inference hoàn tất theo tải, so sánh P0/P1.</w:t>
+        <w:t xml:space="preserve">OS-T1. Phân bố khoảng cách frame từ timestamp sensor trong hai lượt 30 fps và 10 fps.</w:t>
       </w:r>
     </w:p>
     <w:p>
@@ -8263,8 +8237,8 @@
       <w:r>
         <w:drawing>
           <wp:inline xmlns:wp="http://schemas.openxmlformats.org/drawingml/2006/wordprocessingDrawing" distT="0" distB="0" distL="0" distR="0">
-            <wp:extent cx="4320000" cy="1928571"/>
-            <wp:docPr id="10" name="Hình 10" descr="OS-T4. AoI tại RX theo FIFO/latest và tải."/>
+            <wp:extent cx="4320000" cy="1851428"/>
+            <wp:docPr id="10" name="Hình 10" descr="OS-T2. P50/P95/P99 latency suy luận theo số luồng."/>
             <a:graphic xmlns:a="http://schemas.openxmlformats.org/drawingml/2006/main">
               <a:graphicData uri="http://schemas.openxmlformats.org/drawingml/2006/picture">
                 <pic:pic xmlns:pic="http://schemas.openxmlformats.org/drawingml/2006/picture">
@@ -8274,6 +8248,106 @@
                   </pic:nvPicPr>
                   <pic:blipFill>
                     <a:blip r:embed="rIdImage10"/>
+                    <a:stretch>
+                      <a:fillRect/>
+                    </a:stretch>
+                  </pic:blipFill>
+                  <pic:spPr>
+                    <a:xfrm>
+                      <a:off x="0" y="0"/>
+                      <a:ext cx="4320000" cy="1851428"/>
+                    </a:xfrm>
+                    <a:prstGeom prst="rect">
+                      <a:avLst/>
+                    </a:prstGeom>
+                  </pic:spPr>
+                </pic:pic>
+              </a:graphicData>
+            </a:graphic>
+          </wp:inline>
+        </w:drawing>
+      </w:r>
+    </w:p>
+    <w:p>
+      <w:pPr>
+        <w:pStyle w:val="Caption"/>
+        <w:jc w:val="center"/>
+      </w:pPr>
+      <w:r>
+        <w:rPr/>
+        <w:t xml:space="preserve">OS-T2. P50/P95/P99 latency suy luận theo số luồng.</w:t>
+      </w:r>
+    </w:p>
+    <w:p>
+      <w:pPr>
+        <w:keepNext/>
+        <w:ind w:firstLine="0"/>
+        <w:jc w:val="center"/>
+      </w:pPr>
+      <w:r>
+        <w:drawing>
+          <wp:inline xmlns:wp="http://schemas.openxmlformats.org/drawingml/2006/wordprocessingDrawing" distT="0" distB="0" distL="0" distR="0">
+            <wp:extent cx="4320000" cy="1851428"/>
+            <wp:docPr id="11" name="Hình 11" descr="OS-T3. Latency P99 camera→inference hoàn tất theo tải, so sánh P0/P1."/>
+            <a:graphic xmlns:a="http://schemas.openxmlformats.org/drawingml/2006/main">
+              <a:graphicData uri="http://schemas.openxmlformats.org/drawingml/2006/picture">
+                <pic:pic xmlns:pic="http://schemas.openxmlformats.org/drawingml/2006/picture">
+                  <pic:nvPicPr>
+                    <pic:cNvPr id="11" name="image11.png"/>
+                    <pic:cNvPicPr/>
+                  </pic:nvPicPr>
+                  <pic:blipFill>
+                    <a:blip r:embed="rIdImage11"/>
+                    <a:stretch>
+                      <a:fillRect/>
+                    </a:stretch>
+                  </pic:blipFill>
+                  <pic:spPr>
+                    <a:xfrm>
+                      <a:off x="0" y="0"/>
+                      <a:ext cx="4320000" cy="1851428"/>
+                    </a:xfrm>
+                    <a:prstGeom prst="rect">
+                      <a:avLst/>
+                    </a:prstGeom>
+                  </pic:spPr>
+                </pic:pic>
+              </a:graphicData>
+            </a:graphic>
+          </wp:inline>
+        </w:drawing>
+      </w:r>
+    </w:p>
+    <w:p>
+      <w:pPr>
+        <w:pStyle w:val="Caption"/>
+        <w:jc w:val="center"/>
+      </w:pPr>
+      <w:r>
+        <w:rPr/>
+        <w:t xml:space="preserve">OS-T3. Latency P99 camera→inference hoàn tất theo tải, so sánh P0/P1.</w:t>
+      </w:r>
+    </w:p>
+    <w:p>
+      <w:pPr>
+        <w:keepNext/>
+        <w:ind w:firstLine="0"/>
+        <w:jc w:val="center"/>
+      </w:pPr>
+      <w:r>
+        <w:drawing>
+          <wp:inline xmlns:wp="http://schemas.openxmlformats.org/drawingml/2006/wordprocessingDrawing" distT="0" distB="0" distL="0" distR="0">
+            <wp:extent cx="4320000" cy="1928571"/>
+            <wp:docPr id="12" name="Hình 12" descr="OS-T4. AoI tại RX theo FIFO/latest và tải."/>
+            <a:graphic xmlns:a="http://schemas.openxmlformats.org/drawingml/2006/main">
+              <a:graphicData uri="http://schemas.openxmlformats.org/drawingml/2006/picture">
+                <pic:pic xmlns:pic="http://schemas.openxmlformats.org/drawingml/2006/picture">
+                  <pic:nvPicPr>
+                    <pic:cNvPr id="12" name="image12.png"/>
+                    <pic:cNvPicPr/>
+                  </pic:nvPicPr>
+                  <pic:blipFill>
+                    <a:blip r:embed="rIdImage12"/>
                     <a:stretch>
                       <a:fillRect/>
                     </a:stretch>

</xml_diff>

<commit_message>
report: plain-Vietnamese rewrite for human readers, work assignment on cover, clearer photo marks
Owner feedback 31 Oct evening: no term(gloss) parentheses, no code
identifiers in the camera chapter, readable results table, drop the
deleted-run note, cover 'Phan cong' = implementation split, small
non-overlapping cyan photo marks.

Co-Authored-By: Claude Opus 5.5 <noreply@anthropic.com>
</commit_message>
<xml_diff>
--- a/report_vi/BaoCao_HDH_Nhom3Stars_GiuaKy.docx
+++ b/report_vi/BaoCao_HDH_Nhom3Stars_GiuaKy.docx
@@ -136,8 +136,9 @@
         </w:tblCellMar>
       </w:tblPr>
       <w:tblGrid>
-        <w:gridCol w:w="4535"/>
-        <w:gridCol w:w="4535"/>
+        <w:gridCol w:w="2550"/>
+        <w:gridCol w:w="1400"/>
+        <w:gridCol w:w="5121"/>
       </w:tblGrid>
       <w:tr>
         <w:trPr>
@@ -146,7 +147,7 @@
         </w:trPr>
         <w:tc>
           <w:tcPr>
-            <w:tcW w:w="4535" w:type="dxa"/>
+            <w:tcW w:w="2550" w:type="dxa"/>
             <w:shd w:fill="E8EEF4"/>
             <w:vAlign w:val="center"/>
           </w:tcPr>
@@ -164,7 +165,7 @@
         </w:tc>
         <w:tc>
           <w:tcPr>
-            <w:tcW w:w="4535" w:type="dxa"/>
+            <w:tcW w:w="1400" w:type="dxa"/>
             <w:shd w:fill="E8EEF4"/>
             <w:vAlign w:val="center"/>
           </w:tcPr>
@@ -180,20 +181,38 @@
             </w:r>
           </w:p>
         </w:tc>
-      </w:tr>
-      <w:tr>
-        <w:trPr>
-          <w:cantSplit/>
-        </w:trPr>
-        <w:tc>
-          <w:tcPr>
-            <w:tcW w:w="4535" w:type="dxa"/>
+        <w:tc>
+          <w:tcPr>
+            <w:tcW w:w="5121" w:type="dxa"/>
+            <w:shd w:fill="E8EEF4"/>
+            <w:vAlign w:val="center"/>
           </w:tcPr>
           <w:p>
             <w:pPr>
               <w:pStyle w:val="CoverTable"/>
             </w:pPr>
             <w:r>
+              <w:rPr>
+                <w:b/>
+              </w:rPr>
+              <w:t xml:space="preserve">Phân công</w:t>
+            </w:r>
+          </w:p>
+        </w:tc>
+      </w:tr>
+      <w:tr>
+        <w:trPr>
+          <w:cantSplit/>
+        </w:trPr>
+        <w:tc>
+          <w:tcPr>
+            <w:tcW w:w="2550" w:type="dxa"/>
+          </w:tcPr>
+          <w:p>
+            <w:pPr>
+              <w:pStyle w:val="CoverTable"/>
+            </w:pPr>
+            <w:r>
               <w:rPr/>
               <w:t xml:space="preserve">Nguyễn Quốc Khánh (nhóm trưởng)</w:t>
             </w:r>
@@ -201,7 +220,7 @@
         </w:tc>
         <w:tc>
           <w:tcPr>
-            <w:tcW w:w="4535" w:type="dxa"/>
+            <w:tcW w:w="1400" w:type="dxa"/>
           </w:tcPr>
           <w:p>
             <w:pPr>
@@ -213,14 +232,9 @@
             </w:r>
           </w:p>
         </w:tc>
-      </w:tr>
-      <w:tr>
-        <w:trPr>
-          <w:cantSplit/>
-        </w:trPr>
-        <w:tc>
-          <w:tcPr>
-            <w:tcW w:w="4535" w:type="dxa"/>
+        <w:tc>
+          <w:tcPr>
+            <w:tcW w:w="5121" w:type="dxa"/>
           </w:tcPr>
           <w:p>
             <w:pPr>
@@ -228,13 +242,32 @@
             </w:pPr>
             <w:r>
               <w:rPr/>
+              <w:t xml:space="preserve">Kiến trúc; pipeline Linux (camera/inference/bridge); thiết kế/chạy kiểm thử Raspberry Pi 5; tổng hợp báo cáo.</w:t>
+            </w:r>
+          </w:p>
+        </w:tc>
+      </w:tr>
+      <w:tr>
+        <w:trPr>
+          <w:cantSplit/>
+        </w:trPr>
+        <w:tc>
+          <w:tcPr>
+            <w:tcW w:w="2550" w:type="dxa"/>
+          </w:tcPr>
+          <w:p>
+            <w:pPr>
+              <w:pStyle w:val="CoverTable"/>
+            </w:pPr>
+            <w:r>
+              <w:rPr/>
               <w:t xml:space="preserve">Nguyễn Trung Hiếu</w:t>
             </w:r>
           </w:p>
         </w:tc>
         <w:tc>
           <w:tcPr>
-            <w:tcW w:w="4535" w:type="dxa"/>
+            <w:tcW w:w="1400" w:type="dxa"/>
           </w:tcPr>
           <w:p>
             <w:pPr>
@@ -246,14 +279,9 @@
             </w:r>
           </w:p>
         </w:tc>
-      </w:tr>
-      <w:tr>
-        <w:trPr>
-          <w:cantSplit/>
-        </w:trPr>
-        <w:tc>
-          <w:tcPr>
-            <w:tcW w:w="4535" w:type="dxa"/>
+        <w:tc>
+          <w:tcPr>
+            <w:tcW w:w="5121" w:type="dxa"/>
           </w:tcPr>
           <w:p>
             <w:pPr>
@@ -261,13 +289,32 @@
             </w:pPr>
             <w:r>
               <w:rPr/>
+              <w:t xml:space="preserve">Cấu hình Linux (ưu tiên/ghim CPU/tạo tải); đo đánh thức timer; tìm hiểu cơ sở lý thuyết.</w:t>
+            </w:r>
+          </w:p>
+        </w:tc>
+      </w:tr>
+      <w:tr>
+        <w:trPr>
+          <w:cantSplit/>
+        </w:trPr>
+        <w:tc>
+          <w:tcPr>
+            <w:tcW w:w="2550" w:type="dxa"/>
+          </w:tcPr>
+          <w:p>
+            <w:pPr>
+              <w:pStyle w:val="CoverTable"/>
+            </w:pPr>
+            <w:r>
+              <w:rPr/>
               <w:t xml:space="preserve">Nguyễn Quang Vinh</w:t>
             </w:r>
           </w:p>
         </w:tc>
         <w:tc>
           <w:tcPr>
-            <w:tcW w:w="4535" w:type="dxa"/>
+            <w:tcW w:w="1400" w:type="dxa"/>
           </w:tcPr>
           <w:p>
             <w:pPr>
@@ -276,6 +323,20 @@
             <w:r>
               <w:rPr/>
               <w:t xml:space="preserve">20233718</w:t>
+            </w:r>
+          </w:p>
+        </w:tc>
+        <w:tc>
+          <w:tcPr>
+            <w:tcW w:w="5121" w:type="dxa"/>
+          </w:tcPr>
+          <w:p>
+            <w:pPr>
+              <w:pStyle w:val="CoverTable"/>
+            </w:pPr>
+            <w:r>
+              <w:rPr/>
+              <w:t xml:space="preserve">Firmware STM32/FreeRTOS (nhận UART/giám sát/LED); khung UART; lắp và đấu nối bàn thử.</w:t>
             </w:r>
           </w:p>
         </w:tc>
@@ -335,7 +396,7 @@
       <w:pPr/>
       <w:r>
         <w:rPr/>
-        <w:t xml:space="preserve">Báo cáo giữa kỳ đến ngày 31/10/2026 trình bày nền tảng Edge-AI đang trong quá trình triển khai. Raspberry Pi chạy Ubuntu xử lý inference; STM32 chạy FreeRTOS giám sát qua UART. Nhóm khảo sát scheduler, tranh chấp tài nguyên và queue. Kết quả sơ bộ: OS-T1/OS-T2 PASS; OS-T3/OS-T4 FAIL theo tiêu chí đã định. Dữ liệu cho thấy ưu tiên CPU chưa cô lập được tranh chấp nhớ và vị trí loại đầu vào cũ ảnh hưởng đến tuổi dữ liệu. Các phép đo phần mềm và phản ứng GPIO được phân biệt với kết quả UART vật lý.</w:t>
+        <w:t xml:space="preserve">Báo cáo giữa kỳ đến ngày 31/10/2026 trình bày nền tảng Edge-AI đang trong quá trình triển khai. Raspberry Pi chạy Ubuntu xử lý suy luận; STM32 chạy FreeRTOS giám sát qua UART. Nhóm khảo sát lập lịch, tranh chấp tài nguyên và hàng đợi. Kết quả sơ bộ: OS-T1/OS-T2 PASS; OS-T3/OS-T4 FAIL theo tiêu chí đã định. Dữ liệu cho thấy ưu tiên CPU chưa cô lập được tranh chấp nhớ và vị trí loại đầu vào cũ ảnh hưởng đến tuổi dữ liệu. Các phép đo phần mềm và phản ứng GPIO được phân biệt với kết quả UART vật lý.</w:t>
       </w:r>
     </w:p>
     <w:p>
@@ -348,7 +409,7 @@
       </w:r>
       <w:r>
         <w:rPr/>
-        <w:t xml:space="preserve"> hệ điều hành; Linux; FreeRTOS; UART; scheduler; freshness; giám sát độc lập.</w:t>
+        <w:t xml:space="preserve"> hệ điều hành; Linux; FreeRTOS; UART; lập lịch; tuổi dữ liệu; giám sát độc lập.</w:t>
       </w:r>
     </w:p>
     <w:p>
@@ -558,7 +619,7 @@
       </w:pPr>
       <w:r>
         <w:rPr/>
-        <w:t xml:space="preserve">5.1 Capture và timestamp</w:t>
+        <w:t xml:space="preserve">5.1 Nguồn ảnh và thời điểm chụp</w:t>
       </w:r>
     </w:p>
     <w:p>
@@ -567,7 +628,7 @@
       </w:pPr>
       <w:r>
         <w:rPr/>
-        <w:t xml:space="preserve">5.2 Ring pixel và chính sách đầu vào</w:t>
+        <w:t xml:space="preserve">5.2 Lưu ảnh và chọn đầu vào</w:t>
       </w:r>
     </w:p>
     <w:p>
@@ -576,7 +637,7 @@
       </w:pPr>
       <w:r>
         <w:rPr/>
-        <w:t xml:space="preserve">5.3 Mốc AoI</w:t>
+        <w:t xml:space="preserve">5.3 Tính tuổi dữ liệu</w:t>
       </w:r>
     </w:p>
     <w:p>
@@ -603,7 +664,7 @@
       </w:pPr>
       <w:r>
         <w:rPr/>
-        <w:t xml:space="preserve">6.2 Lịch sử</w:t>
+        <w:t xml:space="preserve">6.2 Phạm vi dữ liệu trước camera</w:t>
       </w:r>
     </w:p>
     <w:p>
@@ -612,7 +673,7 @@
       </w:pPr>
       <w:r>
         <w:rPr/>
-        <w:t xml:space="preserve">6.3 Đánh thức và inference</w:t>
+        <w:t xml:space="preserve">6.3 Đánh thức và suy luận</w:t>
       </w:r>
     </w:p>
     <w:p>
@@ -621,7 +682,7 @@
       </w:pPr>
       <w:r>
         <w:rPr/>
-        <w:t xml:space="preserve">6.4 Pipeline và queue</w:t>
+        <w:t xml:space="preserve">6.4 Vị trí loại dữ liệu cũ</w:t>
       </w:r>
     </w:p>
     <w:p>
@@ -630,7 +691,7 @@
       </w:pPr>
       <w:r>
         <w:rPr/>
-        <w:t xml:space="preserve">6.5 UART và lỗi</w:t>
+        <w:t xml:space="preserve">6.5 UART và phản ứng khi lỗi</w:t>
       </w:r>
     </w:p>
     <w:p>
@@ -684,7 +745,7 @@
       </w:pPr>
       <w:r>
         <w:rPr/>
-        <w:t xml:space="preserve">8.2 Điều kiện phép đo và bench</w:t>
+        <w:t xml:space="preserve">8.2 Điều kiện phép đo và bàn thử</w:t>
       </w:r>
     </w:p>
     <w:p>
@@ -2141,7 +2202,14 @@
       <w:pPr/>
       <w:r>
         <w:rPr/>
-        <w:t xml:space="preserve">Kết quả Edge-AI có thể đã cũ khi tới nơi sử dụng. Scheduler (bộ lập lịch) Linux chia sẻ CPU, bộ nhớ và queue (hàng đợi) nên throughput (thông lượng) cao chưa bảo đảm freshness (độ mới dữ liệu). Raspberry Pi 5 chạy Ubuntu Server 24.04 ARM64 xử lý workload (tải công việc); STM32F446RE chạy RTOS FreeRTOS giám sát qua UART. MCU không chạy inference (suy luận); mục tiêu là nghiên cứu OS.</w:t>
+        <w:t xml:space="preserve">Khi CPU bận hoặc hàng đợi dài, ảnh có thể đã cũ trước khi tới nơi sử dụng. Vì vậy, ngoài thông lượng, hệ thống cần biết tuổi kết quả và cách phản ứng khi mất cập nhật.</w:t>
+      </w:r>
+    </w:p>
+    <w:p>
+      <w:pPr/>
+      <w:r>
+        <w:rPr/>
+        <w:t xml:space="preserve">Nhóm dùng Raspberry Pi 5 chạy Ubuntu Server 24.04 ARM64 để xử lý ảnh và STM32F446RE chạy FreeRTOS để giám sát qua UART. Suy luận tạo tải để khảo sát hệ điều hành; STM32 giám sát hoạt động và tuổi kết quả. Đề tài không đánh giá độ chính xác mô hình.</w:t>
       </w:r>
     </w:p>
     <w:p>
@@ -2154,58 +2222,17 @@
       </w:r>
     </w:p>
     <w:p>
-      <w:pPr>
-        <w:numPr>
-          <w:ilvl w:val="0"/>
-          <w:numId w:val="1"/>
-        </w:numPr>
-      </w:pPr>
-      <w:r>
-        <w:rPr/>
-        <w:t xml:space="preserve">RQ1: Tải cạnh tranh thay đổi service time (thời gian phục vụ) và chuyển giao thế nào?</w:t>
-      </w:r>
-    </w:p>
-    <w:p>
-      <w:pPr>
-        <w:numPr>
-          <w:ilvl w:val="0"/>
-          <w:numId w:val="1"/>
-        </w:numPr>
-      </w:pPr>
-      <w:r>
-        <w:rPr/>
-        <w:t xml:space="preserve">RQ2: Priority (độ ưu tiên), CPU pinning (ràng buộc lõi) và memory locking (khóa trang nhớ) cải thiện latency (độ trễ) ra sao?</w:t>
-      </w:r>
-    </w:p>
-    <w:p>
-      <w:pPr>
-        <w:numPr>
-          <w:ilvl w:val="0"/>
-          <w:numId w:val="1"/>
-        </w:numPr>
-      </w:pPr>
-      <w:r>
-        <w:rPr/>
-        <w:t xml:space="preserve">RQ3: FIFO và latest-value (chỉ giữ giá trị mới nhất) ảnh hưởng freshness thế nào; nên thay dữ liệu ở đâu?</w:t>
-      </w:r>
-    </w:p>
-    <w:p>
-      <w:pPr>
-        <w:numPr>
-          <w:ilvl w:val="0"/>
-          <w:numId w:val="1"/>
-        </w:numPr>
-      </w:pPr>
-      <w:r>
-        <w:rPr/>
-        <w:t xml:space="preserve">RQ4: Khi Pi ngừng phục vụ, MCU phát hiện và đưa đầu ra về trạng thái an toàn mô phỏng khi nào?</w:t>
-      </w:r>
-    </w:p>
-    <w:p>
-      <w:pPr/>
-      <w:r>
-        <w:rPr/>
-        <w:t xml:space="preserve">Nhóm gắn timestamp (dấu thời gian) để tìm điểm chờ từ Pi tới MCU. Supervisor (khối giám sát) quyết định đầu ra dựa trên hoạt động của bridge (cầu nối) và tuổi kết quả.</w:t>
+      <w:pPr/>
+      <w:r>
+        <w:rPr/>
+        <w:t xml:space="preserve">Nhóm tìm hiểu tải cạnh tranh làm thời gian xử lý và chuyển giao thay đổi thế nào. Việc tăng độ ưu tiên, gắn công việc vào lõi CPU và giữ trang nhớ trong RAM có giảm độ trễ không? Khi xử lý không kịp nguồn ảnh, nên giữ thứ tự FIFO hay bỏ dữ liệu cũ, và nên bỏ ở khâu nào? Cuối cùng, khi Pi ngừng cung cấp kết quả, STM32 mất bao lâu để phát hiện và chuyển đầu ra sang trạng thái an toàn mô phỏng?</w:t>
+      </w:r>
+    </w:p>
+    <w:p>
+      <w:pPr/>
+      <w:r>
+        <w:rPr/>
+        <w:t xml:space="preserve">LED chỉ mô phỏng đầu ra, chưa điều khiển cơ cấu chấp hành.</w:t>
       </w:r>
     </w:p>
     <w:p>
@@ -2230,7 +2257,14 @@
       <w:pPr/>
       <w:r>
         <w:rPr/>
-        <w:t xml:space="preserve">CFS phân chia CPU theo trọng số và lịch sử sử dụng; EEVDF xét điều kiện đủ tư cách và deadline (hạn hoàn thành) ảo. SCHED_FIFO cho thread (luồng) ưu tiên cao chiếm quyền công việc thấp hơn nhưng có thể khiến task (tác vụ) khác thiếu CPU. Phân tích cần ghi kernel, chính sách thread, quyền đặt priority và giới hạn băng thông real-time (thời gian thực) [1]. CPU pinning không cô lập bộ nhớ dùng chung; MemGuard nghiên cứu cô lập băng thông nhớ [2], chỉ được dùng để giải thích. cgroups (nhóm tài nguyên) có quota (hạn mức) thấp gây throttling (hạn chế phục vụ); mlockall giữ trang trong RAM, giảm page fault (lỗi trang), không loại cache miss (trượt bộ nhớ đệm).</w:t>
+        <w:t xml:space="preserve">Bộ lập lịch quyết định công việc nào được dùng CPU khi nhiều công việc cùng sẵn sàng. Chính sách mặc định chia sẻ CPU; SCHED_FIFO cho phép luồng có độ ưu tiên cao chạy trước, nhưng có thể khiến công việc khác thiếu thời gian xử lý [1]. Gắn luồng vào một lõi và giữ trang nhớ trong RAM giúp giảm một số nguồn chờ, nhưng các lõi vẫn dùng chung bộ nhớ và bộ nhớ đệm.</w:t>
+      </w:r>
+    </w:p>
+    <w:p>
+      <w:pPr/>
+      <w:r>
+        <w:rPr/>
+        <w:t xml:space="preserve">Vì vậy, ưu tiên CPU chưa đủ để bảo đảm thời gian suy luận khi tải khác chiếm băng thông bộ nhớ. MemGuard nghiên cứu cách dành riêng băng thông nhớ [2]; báo cáo dùng công trình này để giải thích giới hạn, không triển khai cơ chế đó.</w:t>
       </w:r>
     </w:p>
     <w:p>
@@ -2246,7 +2280,7 @@
       <w:pPr/>
       <w:r>
         <w:rPr/>
-        <w:t xml:space="preserve">PREEMPT_RT giảm vùng kernel không thể bị chiếm quyền. P3 dự kiến dùng Real-time Ubuntu đóng gói, không sửa hoặc tự biên dịch kernel. Dữ liệu sơ bộ trên kernel tiêu chuẩn chưa cho phép kết luận về P3.</w:t>
+        <w:t xml:space="preserve">PREEMPT_RT giảm những đoạn nhân Linux không thể bị chiếm quyền, nhằm cải thiện khả năng đáp ứng. Cấu hình P3 dự kiến dùng Real-time Ubuntu đóng gói sẵn. Các kết quả hiện có dùng nhân tiêu chuẩn, nên chưa cho phép kết luận về P3.</w:t>
       </w:r>
     </w:p>
     <w:p>
@@ -2262,7 +2296,14 @@
       <w:pPr/>
       <w:r>
         <w:rPr/>
-        <w:t xml:space="preserve">AoI là tuổi dữ liệu hữu ích mới nhất bên nhận giữ [3], [4]. Tuổi tăng khi ngừng cập nhật và giảm khi có kết quả mới, nhưng không về 0 vì dữ liệu đã chờ và truyền. AoI trung bình là diện tích dưới đường tuổi chia thời lượng đã khởi tạo, tính cả khoảng ngừng nhận và hai đầu cửa sổ; latency trung bình của gói không thay được đại lượng này.</w:t>
+        <w:t xml:space="preserve">AoI là tuổi của dữ liệu hữu ích mới nhất mà bên nhận đang giữ [3], [4]. Tuổi tăng khi không có cập nhật và giảm khi nhận kết quả mới. Nó không về 0 vì ảnh đã mất thời gian chờ, xử lý và truyền.</w:t>
+      </w:r>
+    </w:p>
+    <w:p>
+      <w:pPr/>
+      <w:r>
+        <w:rPr/>
+        <w:t xml:space="preserve">AoI trung bình được tính từ diện tích dưới đường tuổi chia cho thời gian quan sát, kể cả lúc ngừng nhận. Trung bình độ trễ của các gói đã tới không thể thay thế nó, vì bỏ qua khoảng không có gói.</w:t>
       </w:r>
     </w:p>
     <w:p>
@@ -2275,7 +2316,7 @@
         <w:drawing>
           <wp:inline xmlns:wp="http://schemas.openxmlformats.org/drawingml/2006/wordprocessingDrawing" distT="0" distB="0" distL="0" distR="0">
             <wp:extent cx="4320000" cy="1974857"/>
-            <wp:docPr id="2" name="Hình 2" descr="Hình 2.1. Age of Information và freshness threshold."/>
+            <wp:docPr id="2" name="Hình 2" descr="Hình 2.1. Tuổi dữ liệu tăng giữa các lần cập nhật và được đối chiếu với ngưỡng độ mới."/>
             <a:graphic xmlns:a="http://schemas.openxmlformats.org/drawingml/2006/main">
               <a:graphicData uri="http://schemas.openxmlformats.org/drawingml/2006/picture">
                 <pic:pic xmlns:pic="http://schemas.openxmlformats.org/drawingml/2006/picture">
@@ -2312,7 +2353,7 @@
       </w:pPr>
       <w:r>
         <w:rPr/>
-        <w:t xml:space="preserve">Hình 2.1. Age of Information và freshness threshold.</w:t>
+        <w:t xml:space="preserve">Hình 2.1. Tuổi dữ liệu tăng giữa các lần cập nhật và được đối chiếu với ngưỡng độ mới.</w:t>
       </w:r>
     </w:p>
     <w:p>
@@ -2328,7 +2369,14 @@
       <w:pPr/>
       <w:r>
         <w:rPr/>
-        <w:t xml:space="preserve">Simplex phân quyền giữa khối tính toán phức tạp và bộ điều khiển đáng tin cậy [5], [6]: Pi đề xuất, MCU quyết định output (đầu ra). Timeout (thời hạn chờ) và FAILSAFE chưa chứng minh an toàn hình thức. FreeRTOS dùng priority cố định và preemption (chiếm quyền), nhưng task vẫn trễ khi ngắt bị che hoặc công việc trước kéo dài. Cấp phát tĩnh chưa thay được phép đo stack (ngăn xếp) và execution time (thời gian thực thi).</w:t>
+        <w:t xml:space="preserve">Simplex tách khối tính toán phức tạp khỏi khối quyết định đầu ra [5], [6]. Trong bàn thử, Pi đề xuất kết quả còn STM32 quyết định có tiếp tục sử dụng hay không.</w:t>
+      </w:r>
+    </w:p>
+    <w:p>
+      <w:pPr/>
+      <w:r>
+        <w:rPr/>
+        <w:t xml:space="preserve">FreeRTOS lập lịch theo độ ưu tiên cố định và cho phép chiếm quyền. Tác vụ vẫn có thể trễ nếu ngắt bị che hoặc công việc trước kéo dài.</w:t>
       </w:r>
     </w:p>
     <w:p>
@@ -2353,7 +2401,14 @@
       <w:pPr/>
       <w:r>
         <w:rPr/>
-        <w:t xml:space="preserve">Đường đi: ONNX Runtime/MobileNetV2 → bridge → UART → ISR → buffer (bộ đệm) hữu hạn → RX task → supervisor → GPIO/LED. Logger (bộ ghi log) theo dõi hành trình; thiếu log vẫn có thể thiếu bằng chứng giám sát. Supervisor độc quyền ghi output. Heartbeat (bản tin sống) xác nhận bridge hoạt động; INFERENCE cung cấp kết quả kiểm freshness. Chưa có cơ cấu chấp hành hoặc watchdog (cơ chế canh lỗi) phần cứng độc lập.</w:t>
+        <w:t xml:space="preserve">Ảnh được xử lý trên Pi, kết quả đi qua bridge rồi truyền bằng UART tới STM32. Phía STM32 nhận dữ liệu, kiểm tra tính hợp lệ và chuyển cho khối giám sát quyết định trạng thái LED.</w:t>
+      </w:r>
+    </w:p>
+    <w:p>
+      <w:pPr/>
+      <w:r>
+        <w:rPr/>
+        <w:t xml:space="preserve">Bridge báo còn hoạt động riêng với bản tin kết quả, vì tiến trình vẫn có thể chạy trong khi suy luận đã ngừng cập nhật. Bàn thử chưa có cơ cấu chấp hành hoặc watchdog phần cứng độc lập.</w:t>
       </w:r>
     </w:p>
     <w:p>
@@ -2419,7 +2474,7 @@
       <w:pPr/>
       <w:r>
         <w:rPr/>
-        <w:t xml:space="preserve">Parser (bộ phân tích khung) tìm SOF, kiểm độ dài và CRC trước khi giao cho chính sách. CRC kiểm toàn vẹn; số thứ tự phát hiện dữ liệu cũ, trùng hoặc mất. Supervisor vẫn phải kiểm tuổi và phiên; frame (khung) hợp lệ chưa bảo đảm inference đúng.</w:t>
+        <w:t xml:space="preserve">UART truyền từng byte nên bên nhận cần nhận ra ranh giới bản tin và phát hiện dữ liệu hỏng. Bộ phân tích tìm dấu bắt đầu khung, kiểm độ dài và CRC trước khi chuyển dữ liệu cho khối giám sát. Số thứ tự giúp phát hiện bản tin cũ, trùng hoặc mất; một khung đúng CRC vẫn chưa bảo đảm kết quả đủ mới hay suy luận đúng.</w:t>
       </w:r>
     </w:p>
     <w:p>
@@ -2432,7 +2487,7 @@
         <w:drawing>
           <wp:inline xmlns:wp="http://schemas.openxmlformats.org/drawingml/2006/wordprocessingDrawing" distT="0" distB="0" distL="0" distR="0">
             <wp:extent cx="4320000" cy="1063920"/>
-            <wp:docPr id="4" name="Hình 4" descr="Hình 3.2. Cấu trúc frame UART và phạm vi kiểm tra CRC."/>
+            <wp:docPr id="4" name="Hình 4" descr="Hình 3.2. Cấu trúc khung UART và phạm vi kiểm tra CRC."/>
             <a:graphic xmlns:a="http://schemas.openxmlformats.org/drawingml/2006/main">
               <a:graphicData uri="http://schemas.openxmlformats.org/drawingml/2006/picture">
                 <pic:pic xmlns:pic="http://schemas.openxmlformats.org/drawingml/2006/picture">
@@ -2469,7 +2524,7 @@
       </w:pPr>
       <w:r>
         <w:rPr/>
-        <w:t xml:space="preserve">Hình 3.2. Cấu trúc frame UART và phạm vi kiểm tra CRC.</w:t>
+        <w:t xml:space="preserve">Hình 3.2. Cấu trúc khung UART và phạm vi kiểm tra CRC.</w:t>
       </w:r>
     </w:p>
     <w:p>
@@ -2478,7 +2533,7 @@
       </w:pPr>
       <w:r>
         <w:rPr/>
-        <w:t xml:space="preserve">Bảng 1. Cấu trúc frame truyền UART.</w:t>
+        <w:t xml:space="preserve">Bảng 1. Thành phần và vai trò của khung UART.</w:t>
       </w:r>
     </w:p>
     <w:tbl>
@@ -2523,7 +2578,7 @@
               <w:rPr>
                 <w:b/>
               </w:rPr>
-              <w:t xml:space="preserve">Trường</w:t>
+              <w:t xml:space="preserve">Thành phần</w:t>
             </w:r>
           </w:p>
         </w:tc>
@@ -2541,7 +2596,7 @@
               <w:rPr>
                 <w:b/>
               </w:rPr>
-              <w:t xml:space="preserve">Kích thước và vai trò</w:t>
+              <w:t xml:space="preserve">Vai trò</w:t>
             </w:r>
           </w:p>
         </w:tc>
@@ -2574,7 +2629,7 @@
             </w:pPr>
             <w:r>
               <w:rPr/>
-              <w:t xml:space="preserve">2 byte: A5 5A, đồng bộ khung</w:t>
+              <w:t xml:space="preserve">Dấu bắt đầu để bên nhận tìm ranh giới khung.</w:t>
             </w:r>
           </w:p>
         </w:tc>
@@ -2593,7 +2648,7 @@
             </w:pPr>
             <w:r>
               <w:rPr/>
-              <w:t xml:space="preserve">version, type</w:t>
+              <w:t xml:space="preserve">Phiên bản và loại bản tin</w:t>
             </w:r>
           </w:p>
         </w:tc>
@@ -2607,7 +2662,7 @@
             </w:pPr>
             <w:r>
               <w:rPr/>
-              <w:t xml:space="preserve">Mỗi trường 1 byte; phân biệt phiên bản và bản tin</w:t>
+              <w:t xml:space="preserve">Phân biệt cách giải mã và mục đích bản tin.</w:t>
             </w:r>
           </w:p>
         </w:tc>
@@ -2626,7 +2681,7 @@
             </w:pPr>
             <w:r>
               <w:rPr/>
-              <w:t xml:space="preserve">seq, len</w:t>
+              <w:t xml:space="preserve">Số thứ tự và độ dài</w:t>
             </w:r>
           </w:p>
         </w:tc>
@@ -2640,7 +2695,7 @@
             </w:pPr>
             <w:r>
               <w:rPr/>
-              <w:t xml:space="preserve">2 byte thứ tự; 1 byte độ dài payload</w:t>
+              <w:t xml:space="preserve">Phát hiện gián đoạn, xác định phần dữ liệu cần đọc.</w:t>
             </w:r>
           </w:p>
         </w:tc>
@@ -2659,7 +2714,7 @@
             </w:pPr>
             <w:r>
               <w:rPr/>
-              <w:t xml:space="preserve">payload</w:t>
+              <w:t xml:space="preserve">Dữ liệu</w:t>
             </w:r>
           </w:p>
         </w:tc>
@@ -2673,7 +2728,7 @@
             </w:pPr>
             <w:r>
               <w:rPr/>
-              <w:t xml:space="preserve">Tối đa 64 byte, các trường nhiều byte little-endian</w:t>
+              <w:t xml:space="preserve">Mang kết quả hoặc thông tin giám sát; tối đa 64 byte.</w:t>
             </w:r>
           </w:p>
         </w:tc>
@@ -2706,7 +2761,7 @@
             </w:pPr>
             <w:r>
               <w:rPr/>
-              <w:t xml:space="preserve">2 byte CRC-16/CCITT-FALSE; phủ từ version đến payload</w:t>
+              <w:t xml:space="preserve">Kiểm tra toàn vẹn nội dung khung.</w:t>
             </w:r>
           </w:p>
         </w:tc>
@@ -2716,7 +2771,7 @@
       <w:pPr/>
       <w:r>
         <w:rPr/>
-        <w:t xml:space="preserve">HEARTBEAT mang định danh phiên; INFERENCE mang kết quả, thứ tự đầu vào và tuổi lúc gửi. ECHO_REQ/ECHO_RESP đối chiếu đồng hồ; MCU_STATUS chứa trạng thái, bộ đếm; STATE_EVENT ghi chuyển trạng thái; INF_RX ghi timestamp nhận inference. Payload (phần dữ liệu khung) tối đa 64 byte.</w:t>
+        <w:t xml:space="preserve">Ngoài kết quả và tín hiệu còn hoạt động, hai phía trao đổi phản hồi để đối chiếu đồng hồ. STM32 gửi trạng thái và thời điểm chuyển trạng thái để phục vụ đánh giá.</w:t>
       </w:r>
     </w:p>
     <w:p>
@@ -2732,7 +2787,14 @@
       <w:pPr/>
       <w:r>
         <w:rPr/>
-        <w:t xml:space="preserve">INIT giữ output an toàn mô phỏng. RUN, còn gọi FRESH, đòi hỏi liveness (tín hiệu còn hoạt động) và kết quả hợp lệ. HOLD ngăn cập nhật khi tuổi vượt ngưỡng. FAILSAFE được chốt dù lưu lượng phục hồi. Session (phiên) phân biệt lần bridge khởi động; generation (thế hệ dữ liệu) loại dữ liệu chờ cũ khi đổi phiên hoặc rearm (tái kích hoạt). Supervisor kiểm timeout trước bản tin mới. Lõi portable (khả chuyển) hỗ trợ rearm; firmware trên bo chưa hoàn tất và chưa tự động rearm từ xa.</w:t>
+        <w:t xml:space="preserve">INIT giữ đầu ra ở mức an toàn mô phỏng khi chưa đủ điều kiện chạy. RUN, cũng gọi là FRESH, cho phép dùng kết quả khi bridge còn hoạt động và dữ liệu còn mới. HOLD ngừng cập nhật đầu ra khi kết quả quá cũ. FAILSAFE được chốt lại, nên lưu lượng phục hồi chưa làm hệ thống tự chạy tiếp.</w:t>
+      </w:r>
+    </w:p>
+    <w:p>
+      <w:pPr/>
+      <w:r>
+        <w:rPr/>
+        <w:t xml:space="preserve">Mỗi lần bridge khởi động được phân biệt bằng một phiên mới để dữ liệu chờ từ lần trước không được dùng lại. Khối giám sát kiểm tra hết hạn trước khi nhận cập nhật; phần tái kích hoạt trên bo chưa hoàn tất và chưa tự động thực hiện từ xa.</w:t>
       </w:r>
     </w:p>
     <w:p>
@@ -2748,7 +2810,14 @@
       <w:pPr/>
       <w:r>
         <w:rPr/>
-        <w:t xml:space="preserve">FIFO có thể tăng backlog (tồn đọng) nếu nguồn nhanh hơn khả năng phục vụ. Latest-value thay dữ liệu chờ; inference đang chạy vẫn hoàn tất [4]. Đặt latest-value ở bridge chỉ thay kết quả chờ gửi. Nhóm vì vậy thử rút datagram (thông điệp rời) trước inference, giữ đầu vào hợp lệ mới nhất và đếm đầu vào bỏ, với cùng tải, nguồn và scheduler.</w:t>
+        <w:t xml:space="preserve">FIFO giữ thứ tự đến, phù hợp khi cần xử lý đủ dữ liệu. Nếu nguồn nhanh hơn khả năng phục vụ, dữ liệu có thể phải chờ ngày càng lâu. Latest-value chỉ giữ dữ liệu chờ mới nhất, còn suy luận đang chạy vẫn hoàn tất [4].</w:t>
+      </w:r>
+    </w:p>
+    <w:p>
+      <w:pPr/>
+      <w:r>
+        <w:rPr/>
+        <w:t xml:space="preserve">Vị trí áp dụng quyết định phần thời gian chờ có thể loại bỏ. Dùng latest-value tại bridge chỉ bỏ kết quả chờ gửi; ảnh cũ vẫn có thể đang chờ suy luận.</w:t>
       </w:r>
     </w:p>
     <w:p>
@@ -2761,7 +2830,7 @@
         <w:drawing>
           <wp:inline xmlns:wp="http://schemas.openxmlformats.org/drawingml/2006/wordprocessingDrawing" distT="0" distB="0" distL="0" distR="0">
             <wp:extent cx="4320000" cy="1632000"/>
-            <wp:docPr id="5" name="Hình 5" descr="Hình 3.3. FIFO giữ backlog; latest-value thay kết quả chưa gửi."/>
+            <wp:docPr id="5" name="Hình 5" descr="Hình 3.3. FIFO giữ dữ liệu chờ; latest-value thay kết quả chưa gửi."/>
             <a:graphic xmlns:a="http://schemas.openxmlformats.org/drawingml/2006/main">
               <a:graphicData uri="http://schemas.openxmlformats.org/drawingml/2006/picture">
                 <pic:pic xmlns:pic="http://schemas.openxmlformats.org/drawingml/2006/picture">
@@ -2798,7 +2867,7 @@
       </w:pPr>
       <w:r>
         <w:rPr/>
-        <w:t xml:space="preserve">Hình 3.3. FIFO giữ backlog; latest-value thay kết quả chưa gửi.</w:t>
+        <w:t xml:space="preserve">Hình 3.3. FIFO giữ dữ liệu chờ; latest-value thay kết quả chưa gửi.</w:t>
       </w:r>
     </w:p>
     <w:p>
@@ -2823,14 +2892,14 @@
       <w:pPr/>
       <w:r>
         <w:rPr/>
-        <w:t xml:space="preserve">Source (nguồn), inference, bridge và receiver (bộ nhận) là các process (tiến trình) trao đổi qua IPC Unix datagram trong pipeline (đường ống xử lý). Source đánh dấu đầu vào; inference tiền xử lý, gọi ONNX Runtime rồi gửi kết quả cho bridge đóng frame. Host dùng workload tổng hợp khi kiểm logic.</w:t>
-      </w:r>
-    </w:p>
-    <w:p>
-      <w:pPr/>
-      <w:r>
-        <w:rPr/>
-        <w:t xml:space="preserve">Baseline dùng MobileNetV2-12 và ONNX Runtime 1.31.0, đối chiếu cùng đầu vào, số luồng và runtime (môi trường thực thi). Nhóm tách service time khỏi call time (thời gian gọi mô hình) [7]. Bridge ghi nối tiếp không chặn, hỗ trợ FIFO/latest-value, heartbeat và echo (trao đổi phản hồi). Frame đang phát phải hoàn tất trước khi thay dữ liệu chờ để tránh ghép sai. Logger nối dữ liệu bằng timestamp/bộ đếm; phân tích dùng thời điểm sự kiện.</w:t>
+        <w:t xml:space="preserve">Nguồn ảnh, suy luận, bridge và bên nhận chạy thành các tiến trình riêng, trao đổi qua IPC Unix datagram. Cách tách này giúp quan sát thời gian chờ ở từng khâu. Suy luận tiền xử lý ảnh rồi gọi MobileNetV2 bằng ONNX Runtime [7]; bridge đóng khung và chuyển kết quả sang UART.</w:t>
+      </w:r>
+    </w:p>
+    <w:p>
+      <w:pPr/>
+      <w:r>
+        <w:rPr/>
+        <w:t xml:space="preserve">Bridge gửi dữ liệu không chặn, đồng thời duy trì tín hiệu còn hoạt động. Khung đang phát phải hoàn tất trước khi thay kết quả chờ, tránh ghép dữ liệu của hai bản tin.</w:t>
       </w:r>
     </w:p>
     <w:p>
@@ -2846,7 +2915,14 @@
       <w:pPr/>
       <w:r>
         <w:rPr/>
-        <w:t xml:space="preserve">macOS dùng biên soạn, kiểm tra portable và biên dịch chéo; workload chạy trên Pi, firmware FreeRTOS trên STM32. Test parser ở host chưa xác nhận UART vật lý. P0 là mặc định; P1 điều chỉnh real-time: source FIFO priority 60, bridge FIFO priority 70 trên CPU 1, inference SCHED_OTHER trên CPU 0. Bridge được ưu tiên chuyển giao; phương án đầu dùng priority 50. P2 giới hạn quota CPU; P3 chưa có kết quả được chấp nhận.</w:t>
+        <w:t xml:space="preserve">Máy macOS dùng soạn thảo, kiểm tra phần dùng chung và biên dịch chéo firmware. Chương trình Linux chạy trên Pi; firmware FreeRTOS chạy trên STM32.</w:t>
+      </w:r>
+    </w:p>
+    <w:p>
+      <w:pPr/>
+      <w:r>
+        <w:rPr/>
+        <w:t xml:space="preserve">P0 giữ cách lập lịch mặc định. P1 ưu tiên nguồn ảnh và bridge trên CPU 1, với độ ưu tiên lần lượt 60 và 70; suy luận giữ SCHED_OTHER trên CPU 0. P2 khảo sát giới hạn CPU; P3 chưa có kết quả được chấp nhận.</w:t>
       </w:r>
     </w:p>
     <w:p>
@@ -2862,14 +2938,21 @@
       <w:pPr/>
       <w:r>
         <w:rPr/>
-        <w:t xml:space="preserve">ISR → buffer → RX task → supervisor → output giữ ngắt ngắn, giao phân tích cho task. Firmware mặc định dùng DMA vòng, giữ IRQ đối chiếu. RX task dựng frame, kiểm CRC rồi giao sự kiện kèm timestamp và generation. Buffer đầy phải ghi mất dữ liệu hoặc gián đoạn; dữ liệu mất không được làm mới liveness. Supervisor sở hữu trạng thái; task trạng thái truyền bản ghi đã chụp để TX không chặn quyết định. Bộ nhớ cấp phát tĩnh.</w:t>
-      </w:r>
-    </w:p>
-    <w:p>
-      <w:pPr/>
-      <w:r>
-        <w:rPr/>
-        <w:t xml:space="preserve">Timestamp RX được ghi khi đọc byte CRC cuối, sau khi byte tới UART; chu kỳ đánh thức, jitter (biến thiên thời gian) và việc rút cả lô gây lệch so với phần cứng. Bỏ lỡ vòng DMA hoặc lỗi UART phải được xử lý như gián đoạn dữ liệu.</w:t>
+        <w:t xml:space="preserve">ISR giữ công việc trong ngắt ngắn; dữ liệu đi qua bộ đệm hữu hạn tới tác vụ nhận và khối giám sát. Firmware mặc định nhận bằng DMA vòng, giữ phương án IRQ để đối chiếu. Tác vụ nhận dựng khung và kiểm CRC; dữ liệu mất hoặc gián đoạn không được tính là bằng chứng phía Pi còn hoạt động.</w:t>
+      </w:r>
+    </w:p>
+    <w:p>
+      <w:pPr/>
+      <w:r>
+        <w:rPr/>
+        <w:t xml:space="preserve">Khối giám sát sở hữu trạng thái đầu ra. Tác vụ gửi trạng thái dùng bản sao đã chụp để việc truyền UART không chặn quyết định giám sát. Bộ nhớ được cấp phát tĩnh nhằm giới hạn tài nguyên trên STM32.</w:t>
+      </w:r>
+    </w:p>
+    <w:p>
+      <w:pPr/>
+      <w:r>
+        <w:rPr/>
+        <w:t xml:space="preserve">Thời điểm nhận được ghi khi phần mềm đọc xong khung, sau khi byte đã tới UART. Độ trễ đánh thức và việc đọc dồn nhiều byte có thể làm mốc này lệch thời điểm nhận vật lý.</w:t>
       </w:r>
     </w:p>
     <w:p>
@@ -2885,7 +2968,14 @@
       <w:pPr/>
       <w:r>
         <w:rPr/>
-        <w:t xml:space="preserve">Cyclictest đo đánh thức, stress-ng tạo tải, log theo dõi pipeline. Echo ánh xạ đồng hồ Pi với TIM2; logic analyzer (máy phân tích logic) đối chiếu UART/GPIO [8]. Tuổi nguồn ước lượng gồm tuổi lúc gửi, thời gian sau nhận và dự phòng truyền chưa được chứng minh là cận trên. MONOTONIC và MONOTONIC_RAW cần kiểm riêng; sai số dư echo nhỏ chưa chứng minh đường truyền đối xứng.</w:t>
+        <w:t xml:space="preserve">Cyclictest đo độ trễ đánh thức; stress-ng tạo tải cạnh tranh. Các bản ghi thời gian theo dõi đường xử lý, còn máy phân tích logic đối chiếu UART và GPIO. Trao đổi phản hồi giữa Pi và bộ định thời STM32 giúp quy đổi hai miền đồng hồ [8].</w:t>
+      </w:r>
+    </w:p>
+    <w:p>
+      <w:pPr/>
+      <w:r>
+        <w:rPr/>
+        <w:t xml:space="preserve">Tuổi nguồn được ước lượng từ tuổi lúc gửi, thời gian sau nhận và phần dự phòng truyền. Ước lượng này chưa được chứng minh là giới hạn lớn nhất.</w:t>
       </w:r>
     </w:p>
     <w:p>
@@ -2901,7 +2991,7 @@
       <w:pPr/>
       <w:r>
         <w:rPr/>
-        <w:t xml:space="preserve">Bench (bàn thử) ở Hình 4.1 dùng UART 3,3 V, TX/RX chéo, mass chung. Camera nối ribbon 22-to-15 pin tới CAM/DISP 0. IMU MPU6050 nối I2C1, firmware OS chưa dùng; lấy mẫu thuộc OS-T7.</w:t>
+        <w:t xml:space="preserve">Bàn thử ở Hình 4.1 dùng UART 3,3 V, TX/RX chéo, mass chung. Camera nối cáp 22-to-15 chân tới CAM/DISP 0. IMU MPU6050 nối I2C1, firmware OS chưa dùng; lấy mẫu thuộc OS-T7.</w:t>
       </w:r>
     </w:p>
     <w:p>
@@ -3616,7 +3706,7 @@
       <w:pPr/>
       <w:r>
         <w:rPr/>
-        <w:t xml:space="preserve">Hình 4.2 và 4.3 ghi lại bàn thử thực tế và cận cảnh module camera.</w:t>
+        <w:t xml:space="preserve">Hình 4.2–4.3 ghi lại bàn thử và camera.</w:t>
       </w:r>
     </w:p>
     <w:p>
@@ -3679,7 +3769,7 @@
         <w:drawing>
           <wp:inline xmlns:wp="http://schemas.openxmlformats.org/drawingml/2006/wordprocessingDrawing" distT="0" distB="0" distL="0" distR="0">
             <wp:extent cx="2700000" cy="3600000"/>
-            <wp:docPr id="8" name="Hình 8" descr="Hình 4.3. Cận cảnh Pi Camera Module v2 (IMX219) và cáp ribbon 15 chân phía camera."/>
+            <wp:docPr id="8" name="Hình 8" descr="Hình 4.3. Cận cảnh Pi Camera Module v2 IMX219 và cáp ribbon 15 chân phía camera."/>
             <a:graphic xmlns:a="http://schemas.openxmlformats.org/drawingml/2006/main">
               <a:graphicData uri="http://schemas.openxmlformats.org/drawingml/2006/picture">
                 <pic:pic xmlns:pic="http://schemas.openxmlformats.org/drawingml/2006/picture">
@@ -3716,7 +3806,7 @@
       </w:pPr>
       <w:r>
         <w:rPr/>
-        <w:t xml:space="preserve">Hình 4.3. Cận cảnh Pi Camera Module v2 (IMX219) và cáp ribbon 15 chân phía camera.</w:t>
+        <w:t xml:space="preserve">Hình 4.3. Cận cảnh Pi Camera Module v2 IMX219 và cáp ribbon 15 chân phía camera.</w:t>
       </w:r>
     </w:p>
     <w:p>
@@ -3734,21 +3824,21 @@
       </w:pPr>
       <w:r>
         <w:rPr/>
-        <w:t xml:space="preserve">5.1 Capture và timestamp</w:t>
-      </w:r>
-    </w:p>
-    <w:p>
-      <w:pPr/>
-      <w:r>
-        <w:rPr/>
-        <w:t xml:space="preserve">Nguồn tổng hợp chỉ tạo frame_id và timestamp. Pi Camera v2 (IMX219) qua CSI bổ sung pixel thật để khảo sát scheduling (lập lịch), IPC và queue; nhóm không đánh giá độ chính xác mô hình. Số đo camera ở Bảng 3. Riêng offset sensor→receive lượt 30 fps có P50/P99/cực đại 10,411/12,157/14,676 ms; ở hai tốc độ, offset luôn dương và P99 dưới chu kỳ cộng 10 ms.</w:t>
-      </w:r>
-    </w:p>
-    <w:p>
-      <w:pPr/>
-      <w:r>
-        <w:rPr/>
-        <w:t xml:space="preserve">hea_cam dùng callback (hàm gọi lại) hoàn tất request (yêu cầu) của libcamera, lấy sequence của buffer làm frame_id và ghi t_recv_mono_ns bằng CLOCK_MONOTONIC ngay đầu callback. Pixel RGB được sao chép sau đồng bộ đọc DMA và loại padding (phần đệm) theo stride (bước dòng). SensorTimestamp đánh dấu bắt đầu phơi sáng dòng đầu, giữ nguyên trong t_sensor_ns và t_input_ns. Đồng hồ này là CLOCK_BOOTTIME; chỉ giả định đồng nhất với MONOTONIC khi Pi không suspend (tạm ngưng), có cặp đối chiếu đầu/cuối lượt.</w:t>
+        <w:t xml:space="preserve">5.1 Nguồn ảnh và thời điểm chụp</w:t>
+      </w:r>
+    </w:p>
+    <w:p>
+      <w:pPr/>
+      <w:r>
+        <w:rPr/>
+        <w:t xml:space="preserve">Nguồn tổng hợp giúp kiểm tra luồng xử lý nhưng không phản ánh thời gian thu ảnh. Pi Camera v2 qua CSI cung cấp ảnh thật để khảo sát lập lịch, IPC và hàng đợi. Mỗi khung ảnh mang thời điểm cảm biến bắt đầu chụp, nên có thể tính dữ liệu đã cũ bao lâu khi tới bên nhận.</w:t>
+      </w:r>
+    </w:p>
+    <w:p>
+      <w:pPr/>
+      <w:r>
+        <w:rPr/>
+        <w:t xml:space="preserve">Hệ thống cũng ghi thời điểm phần mềm nhận ảnh để phân biệt chậm ở nguồn với chờ xử lý phía sau. Hai mốc cần được quy về cùng đồng hồ trước khi tính tuổi.</w:t>
       </w:r>
     </w:p>
     <w:p>
@@ -3757,21 +3847,21 @@
       </w:pPr>
       <w:r>
         <w:rPr/>
-        <w:t xml:space="preserve">5.2 Ring pixel và chính sách đầu vào</w:t>
-      </w:r>
-    </w:p>
-    <w:p>
-      <w:pPr/>
-      <w:r>
-        <w:rPr/>
-        <w:t xml:space="preserve">Pixel nằm trong shared-memory ring (vòng bộ nhớ chia sẻ) hữu hạn, mặc định bốn slot (ô). Unix datagram chỉ mang frame_id 4 byte và t_input_ns 8 byte, little-endian, giữ nguyên record (bản ghi) IPC và tránh đưa ảnh vào socket queue. Reader (bên đọc) chọn slot theo frame_id modulo số slot. Writer (bên ghi) duy nhất đổi sequence counter (bộ đếm thứ tự) chẵn→lẻ, ghi dữ liệu rồi công bố chẵn. Reader sao chép có giới hạn và kiểm lại counter.</w:t>
-      </w:r>
-    </w:p>
-    <w:p>
-      <w:pPr/>
-      <w:r>
-        <w:rPr/>
-        <w:t xml:space="preserve">Counter lẻ hoặc thay đổi được đếm torn (đọc không nhất quán); slot ổn định nhưng khác frame_id được đếm overwritten (đã ghi đè), rồi bỏ. Input-policy latest rút notification (thông báo) chờ, chọn đầu vào hợp lệ mới nhất, đếm skipped_stale. Bridge có latest-value riêng cho kết quả. Cơ chế này loại dữ liệu cũ, không tăng tốc inference hay bảo đảm deadline.</w:t>
+        <w:t xml:space="preserve">5.2 Lưu ảnh và chọn đầu vào</w:t>
+      </w:r>
+    </w:p>
+    <w:p>
+      <w:pPr/>
+      <w:r>
+        <w:rPr/>
+        <w:t xml:space="preserve">Ảnh nằm trong vùng nhớ dùng chung gồm 4 ô để giới hạn bộ nhớ sử dụng. Tiến trình suy luận chỉ nhận thông báo nhỏ rồi đọc ảnh, tránh đưa toàn bộ ảnh vào hàng đợi trao đổi giữa các tiến trình. Trước khi dùng, bên đọc kiểm tra ảnh còn nguyên vẹn và chưa bị ảnh mới ghi đè; dữ liệu không đạt được bỏ đi.</w:t>
+      </w:r>
+    </w:p>
+    <w:p>
+      <w:pPr/>
+      <w:r>
+        <w:rPr/>
+        <w:t xml:space="preserve">Với FIFO, tiến trình xử lý theo thứ tự thông báo. Với latest-value, nó bỏ thông báo cũ và chọn ảnh hợp lệ mới nhất. Bridge có chính sách tương tự cho kết quả chờ gửi. Cơ chế này loại dữ liệu cũ chứ không làm suy luận nhanh hơn, nên vẫn có thể lỡ hạn khi một lần xử lý kéo dài.</w:t>
       </w:r>
     </w:p>
     <w:p>
@@ -3780,14 +3870,21 @@
       </w:pPr>
       <w:r>
         <w:rPr/>
-        <w:t xml:space="preserve">5.3 Mốc AoI</w:t>
-      </w:r>
-    </w:p>
-    <w:p>
-      <w:pPr/>
-      <w:r>
-        <w:rPr/>
-        <w:t xml:space="preserve">Với g_i là thời điểm phơi sáng đã ánh xạ sang đồng hồ consumer (bên sử dụng) và r_i là thời điểm nhận, tuổi sau cập nhật bằng r_i − g_i. Áp dụng tích phân AoI ở Phần 2. Camera/inference dùng MONOTONIC, bridge dùng MONOTONIC_RAW để kiểm tuổi và đồng bộ; chưa được trừ trực tiếp các mốc để diễn giải AoI camera đầu-cuối trên MCU.</w:t>
+        <w:t xml:space="preserve">5.3 Tính tuổi dữ liệu</w:t>
+      </w:r>
+    </w:p>
+    <w:p>
+      <w:pPr/>
+      <w:r>
+        <w:rPr/>
+        <w:t xml:space="preserve">Sau mỗi cập nhật, tuổi dữ liệu là khoảng thời gian từ lúc chụp đến lúc bên nhận nhận kết quả. Giữa hai lần cập nhật, tuổi tiếp tục tăng như mô tả ở Phần 2.</w:t>
+      </w:r>
+    </w:p>
+    <w:p>
+      <w:pPr/>
+      <w:r>
+        <w:rPr/>
+        <w:t xml:space="preserve">Hiện chưa đủ cơ sở diễn giải các phép đo phần mềm thành AoI từ camera tới MCU trên UART vật lý.</w:t>
       </w:r>
     </w:p>
     <w:p>
@@ -3812,7 +3909,28 @@
       <w:pPr/>
       <w:r>
         <w:rPr/>
-        <w:t xml:space="preserve">Lần thử OS-T2 ngày 31/10 thất bại do Python hệ thống thiếu onnxruntime, đã bị xóa trước lưu trữ.</w:t>
+        <w:t xml:space="preserve">OS-T1 kiểm tra nhịp chụp và mốc thời gian của nguồn ảnh. Nguồn ổn định là điều kiện để phân biệt trễ do camera với trễ do xử lý.</w:t>
+      </w:r>
+    </w:p>
+    <w:p>
+      <w:pPr/>
+      <w:r>
+        <w:rPr/>
+        <w:t xml:space="preserve">OS-T2 đo thời gian suy luận trên ảnh camera với các số luồng khác nhau. Phép thử chọn cấu hình 2 luồng trước khi thêm tải cạnh tranh.</w:t>
+      </w:r>
+    </w:p>
+    <w:p>
+      <w:pPr/>
+      <w:r>
+        <w:rPr/>
+        <w:t xml:space="preserve">OS-T3 so sánh P0/P1 khi có tranh chấp bộ nhớ. Nó kiểm tra liệu ưu tiên CPU có đủ giữ thời gian xử lý dưới chu kỳ nguồn hay không.</w:t>
+      </w:r>
+    </w:p>
+    <w:p>
+      <w:pPr/>
+      <w:r>
+        <w:rPr/>
+        <w:t xml:space="preserve">OS-T4 so sánh FIFO/latest-value ở đầu vào để xem bên nhận có dữ liệu mới hơn không. Bridge giữ kết quả mới nhất.</w:t>
       </w:r>
     </w:p>
     <w:p>
@@ -3821,7 +3939,7 @@
       </w:pPr>
       <w:r>
         <w:rPr/>
-        <w:t xml:space="preserve">Bảng 3. Số đo và đối chiếu tiêu chí OS-T1–OS-T4 trên Raspberry Pi 5.</w:t>
+        <w:t xml:space="preserve">Bảng 3. Kết quả chính và đối chiếu tiêu chí OS-T1–OS-T4 trên Raspberry Pi 5.</w:t>
       </w:r>
     </w:p>
     <w:tbl>
@@ -3885,7 +4003,7 @@
               <w:rPr>
                 <w:b/>
               </w:rPr>
-              <w:t xml:space="preserve">Trạng thái theo tiêu chí</w:t>
+              <w:t xml:space="preserve">Kết quả</w:t>
             </w:r>
           </w:p>
         </w:tc>
@@ -3903,214 +4021,212 @@
               <w:rPr>
                 <w:b/>
               </w:rPr>
-              <w:t xml:space="preserve">Chỉ số thực đo</w:t>
-            </w:r>
-          </w:p>
-        </w:tc>
-      </w:tr>
-      <w:tr>
-        <w:trPr>
-          <w:cantSplit/>
-        </w:trPr>
-        <w:tc>
-          <w:tcPr>
-            <w:tcW w:w="3023" w:type="dxa"/>
-          </w:tcPr>
-          <w:p>
-            <w:pPr>
-              <w:pStyle w:val="TableText"/>
-            </w:pPr>
-            <w:r>
-              <w:rPr/>
-              <w:t xml:space="preserve">OS-T1 — timing nguồn IMX219 và timestamp sensor</w:t>
-            </w:r>
-          </w:p>
-        </w:tc>
-        <w:tc>
-          <w:tcPr>
-            <w:tcW w:w="3023" w:type="dxa"/>
-          </w:tcPr>
-          <w:p>
-            <w:pPr>
-              <w:pStyle w:val="TableText"/>
-            </w:pPr>
-            <w:r>
-              <w:rPr/>
-              <w:t xml:space="preserve">PASS — cả hai tốc độ khung, độ ổn định clock và điều kiện hợp lệ đạt tiêu chí.</w:t>
-            </w:r>
-          </w:p>
-        </w:tc>
-        <w:tc>
-          <w:tcPr>
-            <w:tcW w:w="3023" w:type="dxa"/>
-          </w:tcPr>
-          <w:p>
-            <w:pPr>
-              <w:pStyle w:val="TableText"/>
-            </w:pPr>
-            <w:r>
-              <w:rPr/>
-              <w:t xml:space="preserve">30 fps, n=9.000: chu kỳ TB 33,3229 ms (lệch −0,0314%); jitter P99 0,0303 ms; rơi 0/9.000; offset sensor→receive P99 12,157 ms. 10 fps, n=3.000: chu kỳ TB 99,957 ms; jitter P99 0,359 ms; rơi 0/3.000; offset P99 10,54 ms; BOOTTIME−MONOTONIC đầu/cuối −1,093/−1,018 µs; throttle 0x0 trước/sau.</w:t>
-            </w:r>
-          </w:p>
-        </w:tc>
-      </w:tr>
-      <w:tr>
-        <w:trPr>
-          <w:cantSplit/>
-        </w:trPr>
-        <w:tc>
-          <w:tcPr>
-            <w:tcW w:w="3023" w:type="dxa"/>
-          </w:tcPr>
-          <w:p>
-            <w:pPr>
-              <w:pStyle w:val="TableText"/>
-            </w:pPr>
-            <w:r>
-              <w:rPr/>
-              <w:t xml:space="preserve">OS-T2 — baseline inference trên frame camera</w:t>
-            </w:r>
-          </w:p>
-        </w:tc>
-        <w:tc>
-          <w:tcPr>
-            <w:tcW w:w="3023" w:type="dxa"/>
-          </w:tcPr>
-          <w:p>
-            <w:pPr>
-              <w:pStyle w:val="TableText"/>
-            </w:pPr>
-            <w:r>
-              <w:rPr/>
-              <w:t xml:space="preserve">PASS — lượt governor performance hợp lệ; chọn 2 luồng vì P99/P50 = 1,27 &lt; 1,5.</w:t>
-            </w:r>
-          </w:p>
-        </w:tc>
-        <w:tc>
-          <w:tcPr>
-            <w:tcW w:w="3023" w:type="dxa"/>
-          </w:tcPr>
-          <w:p>
-            <w:pPr>
-              <w:pStyle w:val="TableText"/>
-            </w:pPr>
-            <w:r>
-              <w:rPr/>
-              <w:t xml:space="preserve">MobileNetV2 ONNX; 1.000 warm-up + 5.000 mẫu/thiết lập; throttle 0x0. P50/P95/P99 (ms), P99/P50: 1 luồng 44,72/46,42/52,25; 1,17. 2 luồng 31,05/33,89/39,31; 1,27. 4 luồng 30,36/33,88/50,18; 1,65. Các lượt ondemand ngày 29/10 vẫn được liệt kê là không hợp lệ.</w:t>
-            </w:r>
-          </w:p>
-        </w:tc>
-      </w:tr>
-      <w:tr>
-        <w:trPr>
-          <w:cantSplit/>
-        </w:trPr>
-        <w:tc>
-          <w:tcPr>
-            <w:tcW w:w="3023" w:type="dxa"/>
-          </w:tcPr>
-          <w:p>
-            <w:pPr>
-              <w:pStyle w:val="TableText"/>
-            </w:pPr>
-            <w:r>
-              <w:rPr/>
-              <w:t xml:space="preserve">OS-T3 — tranh chấp bộ nhớ/cache, P0 so với P1</w:t>
-            </w:r>
-          </w:p>
-        </w:tc>
-        <w:tc>
-          <w:tcPr>
-            <w:tcW w:w="3023" w:type="dxa"/>
-          </w:tcPr>
-          <w:p>
-            <w:pPr>
-              <w:pStyle w:val="TableText"/>
-            </w:pPr>
-            <w:r>
-              <w:rPr/>
-              <w:t xml:space="preserve">FAIL — không đạt cả yêu cầu P1 P99 ≤ P0 P99 ở mọi tải và tỷ lệ lỡ hạn P1 ≤ 1%; 3/5 lượt dự kiến.</w:t>
-            </w:r>
-          </w:p>
-        </w:tc>
-        <w:tc>
-          <w:tcPr>
-            <w:tcW w:w="3023" w:type="dxa"/>
-          </w:tcPr>
-          <w:p>
-            <w:pPr>
-              <w:pStyle w:val="TableText"/>
-            </w:pPr>
-            <w:r>
-              <w:rPr/>
-              <w:t xml:space="preserve">E2, trung vị 3 lượt, service P99 P0→P1 (ms): nhàn 59,89→59,61; stream 355,27→355,42; memrate 408,25→421,86. Với deadline bằng chu kỳ nguồn 100 ms, tỷ lệ lỡ hạn P0/P1: nhàn 0/0; stream 1,0/1,0; memrate 1,0/1,0 (1,0 tương ứng 100%). Tranh chấp nhớ/cache kéo inference lên khoảng 320–420 ms; P1 điều chỉnh CPU, không dành riêng nhớ/cache. Chiến dịch không thu cyclictest max.</w:t>
-            </w:r>
-          </w:p>
-        </w:tc>
-      </w:tr>
-      <w:tr>
-        <w:trPr>
-          <w:cantSplit/>
-        </w:trPr>
-        <w:tc>
-          <w:tcPr>
-            <w:tcW w:w="3023" w:type="dxa"/>
-          </w:tcPr>
-          <w:p>
-            <w:pPr>
-              <w:pStyle w:val="TableText"/>
-            </w:pPr>
-            <w:r>
-              <w:rPr/>
-              <w:t xml:space="preserve">OS-T4 — FIFO/latest-value và tích hợp bridge</w:t>
-            </w:r>
-          </w:p>
-        </w:tc>
-        <w:tc>
-          <w:tcPr>
-            <w:tcW w:w="3023" w:type="dxa"/>
-          </w:tcPr>
-          <w:p>
-            <w:pPr>
-              <w:pStyle w:val="TableText"/>
-            </w:pPr>
-            <w:r>
-              <w:rPr/>
-              <w:t xml:space="preserve">FAIL — AoI giảm ở mọi lượt nhưng chưa chứng minh FIFO tăng không giới hạn; chưa chạy mixed hay UART vật lý có MCU.</w:t>
-            </w:r>
-          </w:p>
-        </w:tc>
-        <w:tc>
-          <w:tcPr>
-            <w:tcW w:w="3023" w:type="dxa"/>
-          </w:tcPr>
-          <w:p>
-            <w:pPr>
-              <w:pStyle w:val="TableText"/>
-            </w:pPr>
-            <w:r>
-              <w:rPr/>
-              <w:t xml:space="preserve">E3B, P1, bridge latest, 3 lượt mỗi input-policy. AoI trung bình theo thời gian (ms), FIFO/latest: nhàn 191,8–192,1/92,6–93,4; memrate 321,3–336,7/223,4–234,6. Trung vị AoI đỉnh: nhàn 236,4/135,2; memrate 456,1/351,9 ms. Tỷ lệ lỡ hạn &gt;100 ms: nhàn khoảng 99,8%/0%; memrate 100%/100%. Latest bỏ 398–444 đầu vào cũ/lượt khi nhàn và 1.315–1.344 khi memrate. Không ghi độ dài queue; AoI FIFO nhàn ổn định khoảng 192 ms, số khung rơi bằng 0, gợi ý backlog hữu hạn. Liên kết là PTY, không có MCU.</w:t>
+              <w:t xml:space="preserve">Số đo chính</w:t>
+            </w:r>
+          </w:p>
+        </w:tc>
+      </w:tr>
+      <w:tr>
+        <w:trPr>
+          <w:cantSplit/>
+        </w:trPr>
+        <w:tc>
+          <w:tcPr>
+            <w:tcW w:w="3023" w:type="dxa"/>
+          </w:tcPr>
+          <w:p>
+            <w:pPr>
+              <w:pStyle w:val="TableText"/>
+            </w:pPr>
+            <w:r>
+              <w:rPr/>
+              <w:t xml:space="preserve">OS-T1 — Nhịp chụp và thời gian nguồn</w:t>
+            </w:r>
+          </w:p>
+        </w:tc>
+        <w:tc>
+          <w:tcPr>
+            <w:tcW w:w="3023" w:type="dxa"/>
+          </w:tcPr>
+          <w:p>
+            <w:pPr>
+              <w:pStyle w:val="TableText"/>
+            </w:pPr>
+            <w:r>
+              <w:rPr/>
+              <w:t xml:space="preserve">PASS</w:t>
+            </w:r>
+          </w:p>
+        </w:tc>
+        <w:tc>
+          <w:tcPr>
+            <w:tcW w:w="3023" w:type="dxa"/>
+          </w:tcPr>
+          <w:p>
+            <w:pPr>
+              <w:pStyle w:val="TableText"/>
+            </w:pPr>
+            <w:r>
+              <w:rPr/>
+              <w:t xml:space="preserve">30 fps: chu kỳ trung bình 33,3229 ms, biến thiên P99 0,0303 ms, không rơi khung trong 9.000 mẫu. 10 fps: 99,957 ms, P99 0,359 ms, không rơi khung trong 3.000 mẫu.</w:t>
+            </w:r>
+          </w:p>
+        </w:tc>
+      </w:tr>
+      <w:tr>
+        <w:trPr>
+          <w:cantSplit/>
+        </w:trPr>
+        <w:tc>
+          <w:tcPr>
+            <w:tcW w:w="3023" w:type="dxa"/>
+          </w:tcPr>
+          <w:p>
+            <w:pPr>
+              <w:pStyle w:val="TableText"/>
+            </w:pPr>
+            <w:r>
+              <w:rPr/>
+              <w:t xml:space="preserve">OS-T2 — Suy luận trên ảnh camera</w:t>
+            </w:r>
+          </w:p>
+        </w:tc>
+        <w:tc>
+          <w:tcPr>
+            <w:tcW w:w="3023" w:type="dxa"/>
+          </w:tcPr>
+          <w:p>
+            <w:pPr>
+              <w:pStyle w:val="TableText"/>
+            </w:pPr>
+            <w:r>
+              <w:rPr/>
+              <w:t xml:space="preserve">PASS</w:t>
+            </w:r>
+          </w:p>
+        </w:tc>
+        <w:tc>
+          <w:tcPr>
+            <w:tcW w:w="3023" w:type="dxa"/>
+          </w:tcPr>
+          <w:p>
+            <w:pPr>
+              <w:pStyle w:val="TableText"/>
+            </w:pPr>
+            <w:r>
+              <w:rPr/>
+              <w:t xml:space="preserve">P50/P99 với 2 luồng: 31,05/39,31 ms; tỷ số 1,27 &lt; 1,5. Mỗi cấu hình có 1.000 lần làm nóng và 5.000 mẫu; chế độ tần số performance.</w:t>
+            </w:r>
+          </w:p>
+        </w:tc>
+      </w:tr>
+      <w:tr>
+        <w:trPr>
+          <w:cantSplit/>
+        </w:trPr>
+        <w:tc>
+          <w:tcPr>
+            <w:tcW w:w="3023" w:type="dxa"/>
+          </w:tcPr>
+          <w:p>
+            <w:pPr>
+              <w:pStyle w:val="TableText"/>
+            </w:pPr>
+            <w:r>
+              <w:rPr/>
+              <w:t xml:space="preserve">OS-T3 — Tranh chấp bộ nhớ</w:t>
+            </w:r>
+          </w:p>
+        </w:tc>
+        <w:tc>
+          <w:tcPr>
+            <w:tcW w:w="3023" w:type="dxa"/>
+          </w:tcPr>
+          <w:p>
+            <w:pPr>
+              <w:pStyle w:val="TableText"/>
+            </w:pPr>
+            <w:r>
+              <w:rPr/>
+              <w:t xml:space="preserve">FAIL — P99 của P1 còn cao hơn P0 ở một số tải; tỷ lệ lỡ hạn vượt 1%.</w:t>
+            </w:r>
+          </w:p>
+        </w:tc>
+        <w:tc>
+          <w:tcPr>
+            <w:tcW w:w="3023" w:type="dxa"/>
+          </w:tcPr>
+          <w:p>
+            <w:pPr>
+              <w:pStyle w:val="TableText"/>
+            </w:pPr>
+            <w:r>
+              <w:rPr/>
+              <w:t xml:space="preserve">Trung vị 3 lượt: P99 P0→P1 khi nhàn 59,89→59,61 ms; tải đọc ghi liên tục 355,27→355,42 ms; tải băng thông nhớ 408,25→421,86 ms. Với hạn 100 ms, cả hai cấu hình lỡ hạn 100% ở hai tải nhớ.</w:t>
+            </w:r>
+          </w:p>
+        </w:tc>
+      </w:tr>
+      <w:tr>
+        <w:trPr>
+          <w:cantSplit/>
+        </w:trPr>
+        <w:tc>
+          <w:tcPr>
+            <w:tcW w:w="3023" w:type="dxa"/>
+          </w:tcPr>
+          <w:p>
+            <w:pPr>
+              <w:pStyle w:val="TableText"/>
+            </w:pPr>
+            <w:r>
+              <w:rPr/>
+              <w:t xml:space="preserve">OS-T4 — Chọn ảnh FIFO/latest-value</w:t>
+            </w:r>
+          </w:p>
+        </w:tc>
+        <w:tc>
+          <w:tcPr>
+            <w:tcW w:w="3023" w:type="dxa"/>
+          </w:tcPr>
+          <w:p>
+            <w:pPr>
+              <w:pStyle w:val="TableText"/>
+            </w:pPr>
+            <w:r>
+              <w:rPr/>
+              <w:t xml:space="preserve">FAIL — chưa chứng minh FIFO tồn đọng tăng không giới hạn; còn thiếu tải hỗn hợp và UART có MCU.</w:t>
+            </w:r>
+          </w:p>
+        </w:tc>
+        <w:tc>
+          <w:tcPr>
+            <w:tcW w:w="3023" w:type="dxa"/>
+          </w:tcPr>
+          <w:p>
+            <w:pPr>
+              <w:pStyle w:val="TableText"/>
+            </w:pPr>
+            <w:r>
+              <w:rPr/>
+              <w:t xml:space="preserve">AoI trung bình FIFO/latest-value: nhàn 191,8–192,1/92,6–93,4 ms; tải băng thông nhớ 321,3–336,7/223,4–234,6 ms. Tỷ lệ vượt 100 ms: nhàn khoảng 99,8%/0%; tải nhớ 100%/100%.</w:t>
             </w:r>
           </w:p>
         </w:tc>
       </w:tr>
     </w:tbl>
     <w:p>
-      <w:pPr>
-        <w:pStyle w:val="Source"/>
-      </w:pPr>
-      <w:r>
-        <w:rPr/>
-        <w:t xml:space="preserve">Nguồn: `2026-10-30_os_t1_camera`; `2026-10-31_os_t1_camera_10fps`; `2026-10-29_os_t2_infer` (không hợp lệ); `2026-10-31_os_t2_infer_performance`; `2026-10-30_os_t3_contention`; `2026-10-30_os_t4_policy` (timestamp phần mềm; không đo UART/MCU).</w:t>
-      </w:r>
-    </w:p>
-    <w:p>
-      <w:pPr/>
-      <w:r>
-        <w:rPr/>
-        <w:t xml:space="preserve">Hình 6.1–6.4 minh họa Bảng 3.</w:t>
+      <w:pPr/>
+      <w:r>
+        <w:rPr/>
+        <w:t xml:space="preserve">OS-T3 mới có 3/5 lượt dự kiến và chưa thu độ trễ đánh thức lớn nhất. OS-T4 có 3 lượt cho mỗi chính sách, dùng PTY trên Pi; chưa đo độ dài hàng đợi. AoI FIFO khi nhàn ổn định khoảng 192 ms, nên chưa đủ bằng chứng về tồn đọng tăng không giới hạn.</w:t>
+      </w:r>
+    </w:p>
+    <w:p>
+      <w:pPr/>
+      <w:r>
+        <w:rPr/>
+        <w:t xml:space="preserve">Các lượt OS-T2 dùng chế độ ondemand ngày 29/10 không hợp lệ cho đối chiếu này. Hình 6.1–6.4 giữ các phân bố và so sánh chi tiết của Bảng 3.</w:t>
       </w:r>
     </w:p>
     <w:p>
@@ -4123,7 +4239,7 @@
         <w:drawing>
           <wp:inline xmlns:wp="http://schemas.openxmlformats.org/drawingml/2006/wordprocessingDrawing" distT="0" distB="0" distL="0" distR="0">
             <wp:extent cx="4320000" cy="1851428"/>
-            <wp:docPr id="9" name="Hình 9" descr="Hình 6.1. OS-T1. Phân bố khoảng cách frame từ timestamp sensor trong hai lượt 30 fps và 10 fps."/>
+            <wp:docPr id="9" name="Hình 9" descr="Hình 6.1. OS-T1. Phân bố khoảng cách khung từ thời điểm cảm biến chụp trong hai lượt 30 fps và 10 fps."/>
             <a:graphic xmlns:a="http://schemas.openxmlformats.org/drawingml/2006/main">
               <a:graphicData uri="http://schemas.openxmlformats.org/drawingml/2006/picture">
                 <pic:pic xmlns:pic="http://schemas.openxmlformats.org/drawingml/2006/picture">
@@ -4160,7 +4276,7 @@
       </w:pPr>
       <w:r>
         <w:rPr/>
-        <w:t xml:space="preserve">Hình 6.1. OS-T1. Phân bố khoảng cách frame từ timestamp sensor trong hai lượt 30 fps và 10 fps.</w:t>
+        <w:t xml:space="preserve">Hình 6.1. OS-T1. Phân bố khoảng cách khung từ thời điểm cảm biến chụp trong hai lượt 30 fps và 10 fps.</w:t>
       </w:r>
     </w:p>
     <w:p>
@@ -4173,7 +4289,7 @@
         <w:drawing>
           <wp:inline xmlns:wp="http://schemas.openxmlformats.org/drawingml/2006/wordprocessingDrawing" distT="0" distB="0" distL="0" distR="0">
             <wp:extent cx="4320000" cy="1851428"/>
-            <wp:docPr id="10" name="Hình 10" descr="Hình 6.2. OS-T2. P50/P95/P99 latency suy luận theo số luồng."/>
+            <wp:docPr id="10" name="Hình 10" descr="Hình 6.2. OS-T2. Độ trễ suy luận P50/P95/P99 theo số luồng."/>
             <a:graphic xmlns:a="http://schemas.openxmlformats.org/drawingml/2006/main">
               <a:graphicData uri="http://schemas.openxmlformats.org/drawingml/2006/picture">
                 <pic:pic xmlns:pic="http://schemas.openxmlformats.org/drawingml/2006/picture">
@@ -4210,7 +4326,7 @@
       </w:pPr>
       <w:r>
         <w:rPr/>
-        <w:t xml:space="preserve">Hình 6.2. OS-T2. P50/P95/P99 latency suy luận theo số luồng.</w:t>
+        <w:t xml:space="preserve">Hình 6.2. OS-T2. Độ trễ suy luận P50/P95/P99 theo số luồng.</w:t>
       </w:r>
     </w:p>
     <w:p>
@@ -4223,7 +4339,7 @@
         <w:drawing>
           <wp:inline xmlns:wp="http://schemas.openxmlformats.org/drawingml/2006/wordprocessingDrawing" distT="0" distB="0" distL="0" distR="0">
             <wp:extent cx="4320000" cy="1851428"/>
-            <wp:docPr id="11" name="Hình 11" descr="Hình 6.3. OS-T3. Latency P99 camera→inference hoàn tất theo tải, so sánh P0/P1."/>
+            <wp:docPr id="11" name="Hình 11" descr="Hình 6.3. OS-T3. Độ trễ P99 từ chụp ảnh tới hoàn tất suy luận theo tải, so sánh P0/P1."/>
             <a:graphic xmlns:a="http://schemas.openxmlformats.org/drawingml/2006/main">
               <a:graphicData uri="http://schemas.openxmlformats.org/drawingml/2006/picture">
                 <pic:pic xmlns:pic="http://schemas.openxmlformats.org/drawingml/2006/picture">
@@ -4260,7 +4376,7 @@
       </w:pPr>
       <w:r>
         <w:rPr/>
-        <w:t xml:space="preserve">Hình 6.3. OS-T3. Latency P99 camera→inference hoàn tất theo tải, so sánh P0/P1.</w:t>
+        <w:t xml:space="preserve">Hình 6.3. OS-T3. Độ trễ P99 từ chụp ảnh tới hoàn tất suy luận theo tải, so sánh P0/P1.</w:t>
       </w:r>
     </w:p>
     <w:p>
@@ -4273,7 +4389,7 @@
         <w:drawing>
           <wp:inline xmlns:wp="http://schemas.openxmlformats.org/drawingml/2006/wordprocessingDrawing" distT="0" distB="0" distL="0" distR="0">
             <wp:extent cx="4320000" cy="1928571"/>
-            <wp:docPr id="12" name="Hình 12" descr="Hình 6.4. OS-T4. AoI tại RX theo FIFO/latest và tải."/>
+            <wp:docPr id="12" name="Hình 12" descr="Hình 6.4. OS-T4. AoI tại bên nhận theo FIFO/latest-value và tải."/>
             <a:graphic xmlns:a="http://schemas.openxmlformats.org/drawingml/2006/main">
               <a:graphicData uri="http://schemas.openxmlformats.org/drawingml/2006/picture">
                 <pic:pic xmlns:pic="http://schemas.openxmlformats.org/drawingml/2006/picture">
@@ -4310,7 +4426,7 @@
       </w:pPr>
       <w:r>
         <w:rPr/>
-        <w:t xml:space="preserve">Hình 6.4. OS-T4. AoI tại RX theo FIFO/latest và tải.</w:t>
+        <w:t xml:space="preserve">Hình 6.4. OS-T4. AoI tại bên nhận theo FIFO/latest-value và tải.</w:t>
       </w:r>
     </w:p>
     <w:p>
@@ -4319,14 +4435,14 @@
       </w:pPr>
       <w:r>
         <w:rPr/>
-        <w:t xml:space="preserve">6.2 Lịch sử</w:t>
-      </w:r>
-    </w:p>
-    <w:p>
-      <w:pPr/>
-      <w:r>
-        <w:rPr/>
-        <w:t xml:space="preserve">Trước camera: nguồn tổng hợp/ảnh cố định/PTY. Phân vị: trung vị lượt; cực đại: lớn nhất.</w:t>
+        <w:t xml:space="preserve">6.2 Phạm vi dữ liệu trước camera</w:t>
+      </w:r>
+    </w:p>
+    <w:p>
+      <w:pPr/>
+      <w:r>
+        <w:rPr/>
+        <w:t xml:space="preserve">Các phép đo cũ dùng nguồn tổng hợp, ảnh cố định hoặc PTY để kiểm tra từng cơ chế trước khi thêm camera.</w:t>
       </w:r>
     </w:p>
     <w:p>
@@ -4335,7 +4451,7 @@
       </w:pPr>
       <w:r>
         <w:rPr/>
-        <w:t xml:space="preserve">Bảng 4. Lượt cũ.</w:t>
+        <w:t xml:space="preserve">Bảng 4. Vai trò và giới hạn của các phép đo trước camera.</w:t>
       </w:r>
     </w:p>
     <w:tbl>
@@ -4380,7 +4496,7 @@
               <w:rPr>
                 <w:b/>
               </w:rPr>
-              <w:t xml:space="preserve">Nhóm thí nghiệm</w:t>
+              <w:t xml:space="preserve">Nhóm phép đo</w:t>
             </w:r>
           </w:p>
         </w:tc>
@@ -4398,7 +4514,7 @@
               <w:rPr>
                 <w:b/>
               </w:rPr>
-              <w:t xml:space="preserve">Số lượt và phạm vi chấp nhận</w:t>
+              <w:t xml:space="preserve">Kết luận sử dụng được</w:t>
             </w:r>
           </w:p>
         </w:tc>
@@ -4417,7 +4533,7 @@
             </w:pPr>
             <w:r>
               <w:rPr/>
-              <w:t xml:space="preserve">cyclictest</w:t>
+              <w:t xml:space="preserve">Đánh thức tác vụ</w:t>
             </w:r>
           </w:p>
         </w:tc>
@@ -4431,7 +4547,7 @@
             </w:pPr>
             <w:r>
               <w:rPr/>
-              <w:t xml:space="preserve">30/30 ban đầu; theo dõi bổ sung: 3/15/cấu hình, chỉ nhàn</w:t>
+              <w:t xml:space="preserve">Ưu tiên thời gian thực giảm độ trễ đánh thức; chưa suy ra thời gian hoàn thành suy luận.</w:t>
             </w:r>
           </w:p>
         </w:tc>
@@ -4464,7 +4580,7 @@
             </w:pPr>
             <w:r>
               <w:rPr/>
-              <w:t xml:space="preserve">21/24; loại 3 lượt 4 luồng: điện áp thấp</w:t>
+              <w:t xml:space="preserve">Thêm luồng chưa bảo đảm độ trễ ổn định khi cạnh tranh CPU.</w:t>
             </w:r>
           </w:p>
         </w:tc>
@@ -4483,7 +4599,7 @@
             </w:pPr>
             <w:r>
               <w:rPr/>
-              <w:t xml:space="preserve">E1/E2/E3 PTY</w:t>
+              <w:t xml:space="preserve">Truyền qua PTY</w:t>
             </w:r>
           </w:p>
         </w:tc>
@@ -4497,7 +4613,7 @@
             </w:pPr>
             <w:r>
               <w:rPr/>
-              <w:t xml:space="preserve">45/45 ban đầu; 0/45 đủ theo dõi bổ sung</w:t>
+              <w:t xml:space="preserve">Bỏ kết quả chờ gửi chưa xử lý được ảnh đang chờ suy luận.</w:t>
             </w:r>
           </w:p>
         </w:tc>
@@ -4516,7 +4632,7 @@
             </w:pPr>
             <w:r>
               <w:rPr/>
-              <w:t xml:space="preserve">E3b đầu vào latest</w:t>
+              <w:t xml:space="preserve">UART và giám sát lỗi</w:t>
             </w:r>
           </w:p>
         </w:tc>
@@ -4530,132 +4646,26 @@
             </w:pPr>
             <w:r>
               <w:rPr/>
-              <w:t xml:space="preserve">3/12; loại cả 6 lượt có tải</w:t>
-            </w:r>
-          </w:p>
-        </w:tc>
-      </w:tr>
-      <w:tr>
-        <w:trPr>
-          <w:cantSplit/>
-        </w:trPr>
-        <w:tc>
-          <w:tcPr>
-            <w:tcW w:w="4535" w:type="dxa"/>
-          </w:tcPr>
-          <w:p>
-            <w:pPr>
-              <w:pStyle w:val="TableText"/>
-            </w:pPr>
-            <w:r>
-              <w:rPr/>
-              <w:t xml:space="preserve">E3 UART ban đầu</w:t>
-            </w:r>
-          </w:p>
-        </w:tc>
-        <w:tc>
-          <w:tcPr>
-            <w:tcW w:w="4535" w:type="dxa"/>
-          </w:tcPr>
-          <w:p>
-            <w:pPr>
-              <w:pStyle w:val="TableText"/>
-            </w:pPr>
-            <w:r>
-              <w:rPr/>
-              <w:t xml:space="preserve">0/18; lỗi nguồn/clock/thiếu sự kiện có thể chồng nhau</w:t>
-            </w:r>
-          </w:p>
-        </w:tc>
-      </w:tr>
-      <w:tr>
-        <w:trPr>
-          <w:cantSplit/>
-        </w:trPr>
-        <w:tc>
-          <w:tcPr>
-            <w:tcW w:w="4535" w:type="dxa"/>
-          </w:tcPr>
-          <w:p>
-            <w:pPr>
-              <w:pStyle w:val="TableText"/>
-            </w:pPr>
-            <w:r>
-              <w:rPr/>
-              <w:t xml:space="preserve">E4 gốc</w:t>
-            </w:r>
-          </w:p>
-        </w:tc>
-        <w:tc>
-          <w:tcPr>
-            <w:tcW w:w="4535" w:type="dxa"/>
-          </w:tcPr>
-          <w:p>
-            <w:pPr>
-              <w:pStyle w:val="TableText"/>
-            </w:pPr>
-            <w:r>
-              <w:rPr/>
-              <w:t xml:space="preserve">17/25; gồm 5 F5 chưa thực hiện</w:t>
-            </w:r>
-          </w:p>
-        </w:tc>
-      </w:tr>
-      <w:tr>
-        <w:trPr>
-          <w:cantSplit/>
-        </w:trPr>
-        <w:tc>
-          <w:tcPr>
-            <w:tcW w:w="4535" w:type="dxa"/>
-          </w:tcPr>
-          <w:p>
-            <w:pPr>
-              <w:pStyle w:val="TableText"/>
-            </w:pPr>
-            <w:r>
-              <w:rPr/>
-              <w:t xml:space="preserve">F5 riêng</w:t>
-            </w:r>
-          </w:p>
-        </w:tc>
-        <w:tc>
-          <w:tcPr>
-            <w:tcW w:w="4535" w:type="dxa"/>
-          </w:tcPr>
-          <w:p>
-            <w:pPr>
-              <w:pStyle w:val="TableText"/>
-            </w:pPr>
-            <w:r>
-              <w:rPr/>
-              <w:t xml:space="preserve">5/5 chuyển trạng thái cửa sổ ngắn</w:t>
+              <w:t xml:space="preserve">Đã ghi nhận chuyển trạng thái; sụt áp và sai lệch đồng hồ hạn chế kết luận đầu-cuối.</w:t>
             </w:r>
           </w:p>
         </w:tc>
       </w:tr>
     </w:tbl>
     <w:p>
-      <w:pPr/>
-      <w:r>
-        <w:rPr/>
-        <w:t xml:space="preserve">Pi: 6.8.0-1064-raspi, PREEMPT_DYNAMIC, 5 V / 3 A; baseline 4.66–4.92 V. Ondemand/performance khác nhau, không quy chênh lệch riêng IPC. Theo dõi bổ sung: MONOTONIC_RAW ≤1.5 s/mẫu, xác nhận tải, khớp clock ≤5 s. Lịch lệch khoảng 3 ngày; thời lượng dùng clock đơn điệu.</w:t>
-      </w:r>
-    </w:p>
-    <w:p>
       <w:pPr>
         <w:pStyle w:val="Heading2"/>
       </w:pPr>
       <w:r>
         <w:rPr/>
-        <w:t xml:space="preserve">6.3 Đánh thức và inference</w:t>
-      </w:r>
-    </w:p>
-    <w:p>
-      <w:pPr/>
-      <w:r>
-        <w:rPr/>
-        <w:t xml:space="preserve">Cyclictest: CPU 0, timer 1 ms, memory locking, 120 s/lượt, 3 lần/điều kiện; P0 SCHED_OTHER, P1 FIFO priority 50 đã kiểm trên thread.</w:t>
+        <w:t xml:space="preserve">6.3 Đánh thức và suy luận</w:t>
+      </w:r>
+    </w:p>
+    <w:p>
+      <w:pPr/>
+      <w:r>
+        <w:rPr/>
+        <w:t xml:space="preserve">Cyclictest kiểm tra tác vụ được đánh thức trễ bao lâu. Bảng 5 cho thấy ưu tiên thời gian thực giảm P99, nhưng tải nhớ vẫn làm trễ tăng.</w:t>
       </w:r>
     </w:p>
     <w:p>
@@ -4664,920 +4674,7 @@
       </w:pPr>
       <w:r>
         <w:rPr/>
-        <w:t xml:space="preserve">Bảng 5. Cyclictest (µs).</w:t>
-      </w:r>
-    </w:p>
-    <w:tbl>
-      <w:tblPr>
-        <w:tblW w:w="9071" w:type="dxa"/>
-        <w:tblBorders>
-          <w:top w:val="single" w:sz="4" w:color="808080"/>
-          <w:left w:val="single" w:sz="4" w:color="808080"/>
-          <w:bottom w:val="single" w:sz="4" w:color="808080"/>
-          <w:right w:val="single" w:sz="4" w:color="808080"/>
-          <w:insideH w:val="single" w:sz="4" w:color="808080"/>
-          <w:insideV w:val="single" w:sz="4" w:color="808080"/>
-        </w:tblBorders>
-        <w:tblLayout w:type="fixed"/>
-        <w:tblCellMar>
-          <w:top w:w="60" w:type="dxa"/>
-          <w:left w:w="115" w:type="dxa"/>
-          <w:bottom w:w="60" w:type="dxa"/>
-          <w:right w:w="115" w:type="dxa"/>
-        </w:tblCellMar>
-      </w:tblPr>
-      <w:tblGrid>
-        <w:gridCol w:w="1295"/>
-        <w:gridCol w:w="1295"/>
-        <w:gridCol w:w="1295"/>
-        <w:gridCol w:w="1295"/>
-        <w:gridCol w:w="1295"/>
-        <w:gridCol w:w="1295"/>
-        <w:gridCol w:w="1295"/>
-      </w:tblGrid>
-      <w:tr>
-        <w:trPr>
-          <w:cantSplit/>
-          <w:tblHeader/>
-        </w:trPr>
-        <w:tc>
-          <w:tcPr>
-            <w:tcW w:w="1295" w:type="dxa"/>
-            <w:shd w:fill="E8EEF4"/>
-            <w:vAlign w:val="center"/>
-          </w:tcPr>
-          <w:p>
-            <w:pPr>
-              <w:pStyle w:val="TableText"/>
-            </w:pPr>
-            <w:r>
-              <w:rPr>
-                <w:b/>
-              </w:rPr>
-              <w:t xml:space="preserve">Tải</w:t>
-            </w:r>
-          </w:p>
-        </w:tc>
-        <w:tc>
-          <w:tcPr>
-            <w:tcW w:w="1295" w:type="dxa"/>
-            <w:shd w:fill="E8EEF4"/>
-            <w:vAlign w:val="center"/>
-          </w:tcPr>
-          <w:p>
-            <w:pPr>
-              <w:pStyle w:val="TableText"/>
-            </w:pPr>
-            <w:r>
-              <w:rPr>
-                <w:b/>
-              </w:rPr>
-              <w:t xml:space="preserve">P0 P50</w:t>
-            </w:r>
-          </w:p>
-        </w:tc>
-        <w:tc>
-          <w:tcPr>
-            <w:tcW w:w="1295" w:type="dxa"/>
-            <w:shd w:fill="E8EEF4"/>
-            <w:vAlign w:val="center"/>
-          </w:tcPr>
-          <w:p>
-            <w:pPr>
-              <w:pStyle w:val="TableText"/>
-            </w:pPr>
-            <w:r>
-              <w:rPr>
-                <w:b/>
-              </w:rPr>
-              <w:t xml:space="preserve">P0 P99</w:t>
-            </w:r>
-          </w:p>
-        </w:tc>
-        <w:tc>
-          <w:tcPr>
-            <w:tcW w:w="1295" w:type="dxa"/>
-            <w:shd w:fill="E8EEF4"/>
-            <w:vAlign w:val="center"/>
-          </w:tcPr>
-          <w:p>
-            <w:pPr>
-              <w:pStyle w:val="TableText"/>
-            </w:pPr>
-            <w:r>
-              <w:rPr>
-                <w:b/>
-              </w:rPr>
-              <w:t xml:space="preserve">P0 lớn nhất</w:t>
-            </w:r>
-          </w:p>
-        </w:tc>
-        <w:tc>
-          <w:tcPr>
-            <w:tcW w:w="1295" w:type="dxa"/>
-            <w:shd w:fill="E8EEF4"/>
-            <w:vAlign w:val="center"/>
-          </w:tcPr>
-          <w:p>
-            <w:pPr>
-              <w:pStyle w:val="TableText"/>
-            </w:pPr>
-            <w:r>
-              <w:rPr>
-                <w:b/>
-              </w:rPr>
-              <w:t xml:space="preserve">P1 P50</w:t>
-            </w:r>
-          </w:p>
-        </w:tc>
-        <w:tc>
-          <w:tcPr>
-            <w:tcW w:w="1295" w:type="dxa"/>
-            <w:shd w:fill="E8EEF4"/>
-            <w:vAlign w:val="center"/>
-          </w:tcPr>
-          <w:p>
-            <w:pPr>
-              <w:pStyle w:val="TableText"/>
-            </w:pPr>
-            <w:r>
-              <w:rPr>
-                <w:b/>
-              </w:rPr>
-              <w:t xml:space="preserve">P1 P99</w:t>
-            </w:r>
-          </w:p>
-        </w:tc>
-        <w:tc>
-          <w:tcPr>
-            <w:tcW w:w="1295" w:type="dxa"/>
-            <w:shd w:fill="E8EEF4"/>
-            <w:vAlign w:val="center"/>
-          </w:tcPr>
-          <w:p>
-            <w:pPr>
-              <w:pStyle w:val="TableText"/>
-            </w:pPr>
-            <w:r>
-              <w:rPr>
-                <w:b/>
-              </w:rPr>
-              <w:t xml:space="preserve">P1 lớn nhất</w:t>
-            </w:r>
-          </w:p>
-        </w:tc>
-      </w:tr>
-      <w:tr>
-        <w:trPr>
-          <w:cantSplit/>
-        </w:trPr>
-        <w:tc>
-          <w:tcPr>
-            <w:tcW w:w="1295" w:type="dxa"/>
-          </w:tcPr>
-          <w:p>
-            <w:pPr>
-              <w:pStyle w:val="TableText"/>
-            </w:pPr>
-            <w:r>
-              <w:rPr/>
-              <w:t xml:space="preserve">Nhàn rỗi</w:t>
-            </w:r>
-          </w:p>
-        </w:tc>
-        <w:tc>
-          <w:tcPr>
-            <w:tcW w:w="1295" w:type="dxa"/>
-          </w:tcPr>
-          <w:p>
-            <w:pPr>
-              <w:pStyle w:val="TableText"/>
-            </w:pPr>
-            <w:r>
-              <w:rPr/>
-              <w:t xml:space="preserve">53</w:t>
-            </w:r>
-          </w:p>
-        </w:tc>
-        <w:tc>
-          <w:tcPr>
-            <w:tcW w:w="1295" w:type="dxa"/>
-          </w:tcPr>
-          <w:p>
-            <w:pPr>
-              <w:pStyle w:val="TableText"/>
-            </w:pPr>
-            <w:r>
-              <w:rPr/>
-              <w:t xml:space="preserve">57</w:t>
-            </w:r>
-          </w:p>
-        </w:tc>
-        <w:tc>
-          <w:tcPr>
-            <w:tcW w:w="1295" w:type="dxa"/>
-          </w:tcPr>
-          <w:p>
-            <w:pPr>
-              <w:pStyle w:val="TableText"/>
-            </w:pPr>
-            <w:r>
-              <w:rPr/>
-              <w:t xml:space="preserve">2659</w:t>
-            </w:r>
-          </w:p>
-        </w:tc>
-        <w:tc>
-          <w:tcPr>
-            <w:tcW w:w="1295" w:type="dxa"/>
-          </w:tcPr>
-          <w:p>
-            <w:pPr>
-              <w:pStyle w:val="TableText"/>
-            </w:pPr>
-            <w:r>
-              <w:rPr/>
-              <w:t xml:space="preserve">3</w:t>
-            </w:r>
-          </w:p>
-        </w:tc>
-        <w:tc>
-          <w:tcPr>
-            <w:tcW w:w="1295" w:type="dxa"/>
-          </w:tcPr>
-          <w:p>
-            <w:pPr>
-              <w:pStyle w:val="TableText"/>
-            </w:pPr>
-            <w:r>
-              <w:rPr/>
-              <w:t xml:space="preserve">9</w:t>
-            </w:r>
-          </w:p>
-        </w:tc>
-        <w:tc>
-          <w:tcPr>
-            <w:tcW w:w="1295" w:type="dxa"/>
-          </w:tcPr>
-          <w:p>
-            <w:pPr>
-              <w:pStyle w:val="TableText"/>
-            </w:pPr>
-            <w:r>
-              <w:rPr/>
-              <w:t xml:space="preserve">92</w:t>
-            </w:r>
-          </w:p>
-        </w:tc>
-      </w:tr>
-      <w:tr>
-        <w:trPr>
-          <w:cantSplit/>
-        </w:trPr>
-        <w:tc>
-          <w:tcPr>
-            <w:tcW w:w="1295" w:type="dxa"/>
-          </w:tcPr>
-          <w:p>
-            <w:pPr>
-              <w:pStyle w:val="TableText"/>
-            </w:pPr>
-            <w:r>
-              <w:rPr/>
-              <w:t xml:space="preserve">memrate CPU 2–3</w:t>
-            </w:r>
-          </w:p>
-        </w:tc>
-        <w:tc>
-          <w:tcPr>
-            <w:tcW w:w="1295" w:type="dxa"/>
-          </w:tcPr>
-          <w:p>
-            <w:pPr>
-              <w:pStyle w:val="TableText"/>
-            </w:pPr>
-            <w:r>
-              <w:rPr/>
-              <w:t xml:space="preserve">55</w:t>
-            </w:r>
-          </w:p>
-        </w:tc>
-        <w:tc>
-          <w:tcPr>
-            <w:tcW w:w="1295" w:type="dxa"/>
-          </w:tcPr>
-          <w:p>
-            <w:pPr>
-              <w:pStyle w:val="TableText"/>
-            </w:pPr>
-            <w:r>
-              <w:rPr/>
-              <w:t xml:space="preserve">613</w:t>
-            </w:r>
-          </w:p>
-        </w:tc>
-        <w:tc>
-          <w:tcPr>
-            <w:tcW w:w="1295" w:type="dxa"/>
-          </w:tcPr>
-          <w:p>
-            <w:pPr>
-              <w:pStyle w:val="TableText"/>
-            </w:pPr>
-            <w:r>
-              <w:rPr/>
-              <w:t xml:space="preserve">5170</w:t>
-            </w:r>
-          </w:p>
-        </w:tc>
-        <w:tc>
-          <w:tcPr>
-            <w:tcW w:w="1295" w:type="dxa"/>
-          </w:tcPr>
-          <w:p>
-            <w:pPr>
-              <w:pStyle w:val="TableText"/>
-            </w:pPr>
-            <w:r>
-              <w:rPr/>
-              <w:t xml:space="preserve">5</w:t>
-            </w:r>
-          </w:p>
-        </w:tc>
-        <w:tc>
-          <w:tcPr>
-            <w:tcW w:w="1295" w:type="dxa"/>
-          </w:tcPr>
-          <w:p>
-            <w:pPr>
-              <w:pStyle w:val="TableText"/>
-            </w:pPr>
-            <w:r>
-              <w:rPr/>
-              <w:t xml:space="preserve">239</w:t>
-            </w:r>
-          </w:p>
-        </w:tc>
-        <w:tc>
-          <w:tcPr>
-            <w:tcW w:w="1295" w:type="dxa"/>
-          </w:tcPr>
-          <w:p>
-            <w:pPr>
-              <w:pStyle w:val="TableText"/>
-            </w:pPr>
-            <w:r>
-              <w:rPr/>
-              <w:t xml:space="preserve">1094</w:t>
-            </w:r>
-          </w:p>
-        </w:tc>
-      </w:tr>
-    </w:tbl>
-    <w:p>
-      <w:pPr/>
-      <w:r>
-        <w:rPr/>
-        <w:t xml:space="preserve">P1 giảm tail latency (đuôi phân bố trễ), còn ảnh hưởng tải nhớ. P50 P0 chịu timer slack (dung sai timer); không suy sang inference/UART hay băng thông nhớ.</w:t>
-      </w:r>
-    </w:p>
-    <w:p>
-      <w:pPr>
-        <w:pStyle w:val="TableCaption"/>
-      </w:pPr>
-      <w:r>
-        <w:rPr/>
-        <w:t xml:space="preserve">Bảng 6. Thời gian gọi MobileNetV2 (ms).</w:t>
-      </w:r>
-    </w:p>
-    <w:tbl>
-      <w:tblPr>
-        <w:tblW w:w="9071" w:type="dxa"/>
-        <w:tblBorders>
-          <w:top w:val="single" w:sz="4" w:color="808080"/>
-          <w:left w:val="single" w:sz="4" w:color="808080"/>
-          <w:bottom w:val="single" w:sz="4" w:color="808080"/>
-          <w:right w:val="single" w:sz="4" w:color="808080"/>
-          <w:insideH w:val="single" w:sz="4" w:color="808080"/>
-          <w:insideV w:val="single" w:sz="4" w:color="808080"/>
-        </w:tblBorders>
-        <w:tblLayout w:type="fixed"/>
-        <w:tblCellMar>
-          <w:top w:w="60" w:type="dxa"/>
-          <w:left w:w="115" w:type="dxa"/>
-          <w:bottom w:w="60" w:type="dxa"/>
-          <w:right w:w="115" w:type="dxa"/>
-        </w:tblCellMar>
-      </w:tblPr>
-      <w:tblGrid>
-        <w:gridCol w:w="1814"/>
-        <w:gridCol w:w="1814"/>
-        <w:gridCol w:w="1814"/>
-        <w:gridCol w:w="1814"/>
-        <w:gridCol w:w="1814"/>
-      </w:tblGrid>
-      <w:tr>
-        <w:trPr>
-          <w:cantSplit/>
-          <w:tblHeader/>
-        </w:trPr>
-        <w:tc>
-          <w:tcPr>
-            <w:tcW w:w="1814" w:type="dxa"/>
-            <w:shd w:fill="E8EEF4"/>
-            <w:vAlign w:val="center"/>
-          </w:tcPr>
-          <w:p>
-            <w:pPr>
-              <w:pStyle w:val="TableText"/>
-            </w:pPr>
-            <w:r>
-              <w:rPr>
-                <w:b/>
-              </w:rPr>
-              <w:t xml:space="preserve">Tải / luồng ONNX Runtime</w:t>
-            </w:r>
-          </w:p>
-        </w:tc>
-        <w:tc>
-          <w:tcPr>
-            <w:tcW w:w="1814" w:type="dxa"/>
-            <w:shd w:fill="E8EEF4"/>
-            <w:vAlign w:val="center"/>
-          </w:tcPr>
-          <w:p>
-            <w:pPr>
-              <w:pStyle w:val="TableText"/>
-            </w:pPr>
-            <w:r>
-              <w:rPr>
-                <w:b/>
-              </w:rPr>
-              <w:t xml:space="preserve">Lặp hợp lệ</w:t>
-            </w:r>
-          </w:p>
-        </w:tc>
-        <w:tc>
-          <w:tcPr>
-            <w:tcW w:w="1814" w:type="dxa"/>
-            <w:shd w:fill="E8EEF4"/>
-            <w:vAlign w:val="center"/>
-          </w:tcPr>
-          <w:p>
-            <w:pPr>
-              <w:pStyle w:val="TableText"/>
-            </w:pPr>
-            <w:r>
-              <w:rPr>
-                <w:b/>
-              </w:rPr>
-              <w:t xml:space="preserve">P50</w:t>
-            </w:r>
-          </w:p>
-        </w:tc>
-        <w:tc>
-          <w:tcPr>
-            <w:tcW w:w="1814" w:type="dxa"/>
-            <w:shd w:fill="E8EEF4"/>
-            <w:vAlign w:val="center"/>
-          </w:tcPr>
-          <w:p>
-            <w:pPr>
-              <w:pStyle w:val="TableText"/>
-            </w:pPr>
-            <w:r>
-              <w:rPr>
-                <w:b/>
-              </w:rPr>
-              <w:t xml:space="preserve">P99</w:t>
-            </w:r>
-          </w:p>
-        </w:tc>
-        <w:tc>
-          <w:tcPr>
-            <w:tcW w:w="1814" w:type="dxa"/>
-            <w:shd w:fill="E8EEF4"/>
-            <w:vAlign w:val="center"/>
-          </w:tcPr>
-          <w:p>
-            <w:pPr>
-              <w:pStyle w:val="TableText"/>
-            </w:pPr>
-            <w:r>
-              <w:rPr>
-                <w:b/>
-              </w:rPr>
-              <w:t xml:space="preserve">Lớn nhất</w:t>
-            </w:r>
-          </w:p>
-        </w:tc>
-      </w:tr>
-      <w:tr>
-        <w:trPr>
-          <w:cantSplit/>
-        </w:trPr>
-        <w:tc>
-          <w:tcPr>
-            <w:tcW w:w="1814" w:type="dxa"/>
-          </w:tcPr>
-          <w:p>
-            <w:pPr>
-              <w:pStyle w:val="TableText"/>
-            </w:pPr>
-            <w:r>
-              <w:rPr/>
-              <w:t xml:space="preserve">Nhàn rỗi / 1</w:t>
-            </w:r>
-          </w:p>
-        </w:tc>
-        <w:tc>
-          <w:tcPr>
-            <w:tcW w:w="1814" w:type="dxa"/>
-          </w:tcPr>
-          <w:p>
-            <w:pPr>
-              <w:pStyle w:val="TableText"/>
-            </w:pPr>
-            <w:r>
-              <w:rPr/>
-              <w:t xml:space="preserve">3</w:t>
-            </w:r>
-          </w:p>
-        </w:tc>
-        <w:tc>
-          <w:tcPr>
-            <w:tcW w:w="1814" w:type="dxa"/>
-          </w:tcPr>
-          <w:p>
-            <w:pPr>
-              <w:pStyle w:val="TableText"/>
-            </w:pPr>
-            <w:r>
-              <w:rPr/>
-              <w:t xml:space="preserve">44.0</w:t>
-            </w:r>
-          </w:p>
-        </w:tc>
-        <w:tc>
-          <w:tcPr>
-            <w:tcW w:w="1814" w:type="dxa"/>
-          </w:tcPr>
-          <w:p>
-            <w:pPr>
-              <w:pStyle w:val="TableText"/>
-            </w:pPr>
-            <w:r>
-              <w:rPr/>
-              <w:t xml:space="preserve">48.0</w:t>
-            </w:r>
-          </w:p>
-        </w:tc>
-        <w:tc>
-          <w:tcPr>
-            <w:tcW w:w="1814" w:type="dxa"/>
-          </w:tcPr>
-          <w:p>
-            <w:pPr>
-              <w:pStyle w:val="TableText"/>
-            </w:pPr>
-            <w:r>
-              <w:rPr/>
-              <w:t xml:space="preserve">57.0</w:t>
-            </w:r>
-          </w:p>
-        </w:tc>
-      </w:tr>
-      <w:tr>
-        <w:trPr>
-          <w:cantSplit/>
-        </w:trPr>
-        <w:tc>
-          <w:tcPr>
-            <w:tcW w:w="1814" w:type="dxa"/>
-          </w:tcPr>
-          <w:p>
-            <w:pPr>
-              <w:pStyle w:val="TableText"/>
-            </w:pPr>
-            <w:r>
-              <w:rPr/>
-              <w:t xml:space="preserve">Nhàn rỗi / 3</w:t>
-            </w:r>
-          </w:p>
-        </w:tc>
-        <w:tc>
-          <w:tcPr>
-            <w:tcW w:w="1814" w:type="dxa"/>
-          </w:tcPr>
-          <w:p>
-            <w:pPr>
-              <w:pStyle w:val="TableText"/>
-            </w:pPr>
-            <w:r>
-              <w:rPr/>
-              <w:t xml:space="preserve">3</w:t>
-            </w:r>
-          </w:p>
-        </w:tc>
-        <w:tc>
-          <w:tcPr>
-            <w:tcW w:w="1814" w:type="dxa"/>
-          </w:tcPr>
-          <w:p>
-            <w:pPr>
-              <w:pStyle w:val="TableText"/>
-            </w:pPr>
-            <w:r>
-              <w:rPr/>
-              <w:t xml:space="preserve">29.4</w:t>
-            </w:r>
-          </w:p>
-        </w:tc>
-        <w:tc>
-          <w:tcPr>
-            <w:tcW w:w="1814" w:type="dxa"/>
-          </w:tcPr>
-          <w:p>
-            <w:pPr>
-              <w:pStyle w:val="TableText"/>
-            </w:pPr>
-            <w:r>
-              <w:rPr/>
-              <w:t xml:space="preserve">38.5</w:t>
-            </w:r>
-          </w:p>
-        </w:tc>
-        <w:tc>
-          <w:tcPr>
-            <w:tcW w:w="1814" w:type="dxa"/>
-          </w:tcPr>
-          <w:p>
-            <w:pPr>
-              <w:pStyle w:val="TableText"/>
-            </w:pPr>
-            <w:r>
-              <w:rPr/>
-              <w:t xml:space="preserve">52.8</w:t>
-            </w:r>
-          </w:p>
-        </w:tc>
-      </w:tr>
-      <w:tr>
-        <w:trPr>
-          <w:cantSplit/>
-        </w:trPr>
-        <w:tc>
-          <w:tcPr>
-            <w:tcW w:w="1814" w:type="dxa"/>
-          </w:tcPr>
-          <w:p>
-            <w:pPr>
-              <w:pStyle w:val="TableText"/>
-            </w:pPr>
-            <w:r>
-              <w:rPr/>
-              <w:t xml:space="preserve">Nhàn rỗi / 4</w:t>
-            </w:r>
-          </w:p>
-        </w:tc>
-        <w:tc>
-          <w:tcPr>
-            <w:tcW w:w="1814" w:type="dxa"/>
-          </w:tcPr>
-          <w:p>
-            <w:pPr>
-              <w:pStyle w:val="TableText"/>
-            </w:pPr>
-            <w:r>
-              <w:rPr/>
-              <w:t xml:space="preserve">1</w:t>
-            </w:r>
-          </w:p>
-        </w:tc>
-        <w:tc>
-          <w:tcPr>
-            <w:tcW w:w="1814" w:type="dxa"/>
-          </w:tcPr>
-          <w:p>
-            <w:pPr>
-              <w:pStyle w:val="TableText"/>
-            </w:pPr>
-            <w:r>
-              <w:rPr/>
-              <w:t xml:space="preserve">31.4</w:t>
-            </w:r>
-          </w:p>
-        </w:tc>
-        <w:tc>
-          <w:tcPr>
-            <w:tcW w:w="1814" w:type="dxa"/>
-          </w:tcPr>
-          <w:p>
-            <w:pPr>
-              <w:pStyle w:val="TableText"/>
-            </w:pPr>
-            <w:r>
-              <w:rPr/>
-              <w:t xml:space="preserve">70.7</w:t>
-            </w:r>
-          </w:p>
-        </w:tc>
-        <w:tc>
-          <w:tcPr>
-            <w:tcW w:w="1814" w:type="dxa"/>
-          </w:tcPr>
-          <w:p>
-            <w:pPr>
-              <w:pStyle w:val="TableText"/>
-            </w:pPr>
-            <w:r>
-              <w:rPr/>
-              <w:t xml:space="preserve">94.1</w:t>
-            </w:r>
-          </w:p>
-        </w:tc>
-      </w:tr>
-      <w:tr>
-        <w:trPr>
-          <w:cantSplit/>
-        </w:trPr>
-        <w:tc>
-          <w:tcPr>
-            <w:tcW w:w="1814" w:type="dxa"/>
-          </w:tcPr>
-          <w:p>
-            <w:pPr>
-              <w:pStyle w:val="TableText"/>
-            </w:pPr>
-            <w:r>
-              <w:rPr/>
-              <w:t xml:space="preserve">Tải CPU / 1</w:t>
-            </w:r>
-          </w:p>
-        </w:tc>
-        <w:tc>
-          <w:tcPr>
-            <w:tcW w:w="1814" w:type="dxa"/>
-          </w:tcPr>
-          <w:p>
-            <w:pPr>
-              <w:pStyle w:val="TableText"/>
-            </w:pPr>
-            <w:r>
-              <w:rPr/>
-              <w:t xml:space="preserve">3</w:t>
-            </w:r>
-          </w:p>
-        </w:tc>
-        <w:tc>
-          <w:tcPr>
-            <w:tcW w:w="1814" w:type="dxa"/>
-          </w:tcPr>
-          <w:p>
-            <w:pPr>
-              <w:pStyle w:val="TableText"/>
-            </w:pPr>
-            <w:r>
-              <w:rPr/>
-              <w:t xml:space="preserve">45.1</w:t>
-            </w:r>
-          </w:p>
-        </w:tc>
-        <w:tc>
-          <w:tcPr>
-            <w:tcW w:w="1814" w:type="dxa"/>
-          </w:tcPr>
-          <w:p>
-            <w:pPr>
-              <w:pStyle w:val="TableText"/>
-            </w:pPr>
-            <w:r>
-              <w:rPr/>
-              <w:t xml:space="preserve">53.7</w:t>
-            </w:r>
-          </w:p>
-        </w:tc>
-        <w:tc>
-          <w:tcPr>
-            <w:tcW w:w="1814" w:type="dxa"/>
-          </w:tcPr>
-          <w:p>
-            <w:pPr>
-              <w:pStyle w:val="TableText"/>
-            </w:pPr>
-            <w:r>
-              <w:rPr/>
-              <w:t xml:space="preserve">65.5</w:t>
-            </w:r>
-          </w:p>
-        </w:tc>
-      </w:tr>
-      <w:tr>
-        <w:trPr>
-          <w:cantSplit/>
-        </w:trPr>
-        <w:tc>
-          <w:tcPr>
-            <w:tcW w:w="1814" w:type="dxa"/>
-          </w:tcPr>
-          <w:p>
-            <w:pPr>
-              <w:pStyle w:val="TableText"/>
-            </w:pPr>
-            <w:r>
-              <w:rPr/>
-              <w:t xml:space="preserve">Tải CPU / 4</w:t>
-            </w:r>
-          </w:p>
-        </w:tc>
-        <w:tc>
-          <w:tcPr>
-            <w:tcW w:w="1814" w:type="dxa"/>
-          </w:tcPr>
-          <w:p>
-            <w:pPr>
-              <w:pStyle w:val="TableText"/>
-            </w:pPr>
-            <w:r>
-              <w:rPr/>
-              <w:t xml:space="preserve">2</w:t>
-            </w:r>
-          </w:p>
-        </w:tc>
-        <w:tc>
-          <w:tcPr>
-            <w:tcW w:w="1814" w:type="dxa"/>
-          </w:tcPr>
-          <w:p>
-            <w:pPr>
-              <w:pStyle w:val="TableText"/>
-            </w:pPr>
-            <w:r>
-              <w:rPr/>
-              <w:t xml:space="preserve">60.3</w:t>
-            </w:r>
-          </w:p>
-        </w:tc>
-        <w:tc>
-          <w:tcPr>
-            <w:tcW w:w="1814" w:type="dxa"/>
-          </w:tcPr>
-          <w:p>
-            <w:pPr>
-              <w:pStyle w:val="TableText"/>
-            </w:pPr>
-            <w:r>
-              <w:rPr/>
-              <w:t xml:space="preserve">100.5</w:t>
-            </w:r>
-          </w:p>
-        </w:tc>
-        <w:tc>
-          <w:tcPr>
-            <w:tcW w:w="1814" w:type="dxa"/>
-          </w:tcPr>
-          <w:p>
-            <w:pPr>
-              <w:pStyle w:val="TableText"/>
-            </w:pPr>
-            <w:r>
-              <w:rPr/>
-              <w:t xml:space="preserve">150.3</w:t>
-            </w:r>
-          </w:p>
-        </w:tc>
-      </w:tr>
-    </w:tbl>
-    <w:p>
-      <w:pPr/>
-      <w:r>
-        <w:rPr/>
-        <w:t xml:space="preserve">Mỗi lượt: 1000 lời gọi sau 50 lần làm nóng. Lợi ích thêm luồng phụ thuộc tải; số lượt khác nhau.</w:t>
-      </w:r>
-    </w:p>
-    <w:p>
-      <w:pPr>
-        <w:pStyle w:val="Heading2"/>
-      </w:pPr>
-      <w:r>
-        <w:rPr/>
-        <w:t xml:space="preserve">6.4 Pipeline và queue</w:t>
-      </w:r>
-    </w:p>
-    <w:p>
-      <w:pPr/>
-      <w:r>
-        <w:rPr/>
-        <w:t xml:space="preserve">Đầu vào→receiver Pi qua PTY, 3 lần/ô; không phải UART vật lý.</w:t>
-      </w:r>
-    </w:p>
-    <w:p>
-      <w:pPr>
-        <w:pStyle w:val="TableCaption"/>
-      </w:pPr>
-      <w:r>
-        <w:rPr/>
-        <w:t xml:space="preserve">Bảng 7. E1/E2/E3 qua PTY (ms).</w:t>
+        <w:t xml:space="preserve">Bảng 5. Độ trễ đánh thức P99 trước camera, đơn vị µs.</w:t>
       </w:r>
     </w:p>
     <w:tbl>
@@ -5623,7 +4720,7 @@
               <w:rPr>
                 <w:b/>
               </w:rPr>
-              <w:t xml:space="preserve">Phép đo / điều kiện</w:t>
+              <w:t xml:space="preserve">Tải</w:t>
             </w:r>
           </w:p>
         </w:tc>
@@ -5641,7 +4738,7 @@
               <w:rPr>
                 <w:b/>
               </w:rPr>
-              <w:t xml:space="preserve">P50 chuyển giao / AoI trung bình (ms)</w:t>
+              <w:t xml:space="preserve">P0</w:t>
             </w:r>
           </w:p>
         </w:tc>
@@ -5659,383 +4756,101 @@
               <w:rPr>
                 <w:b/>
               </w:rPr>
-              <w:t xml:space="preserve">P99 chuyển giao / AoI đỉnh (ms)</w:t>
-            </w:r>
-          </w:p>
-        </w:tc>
-      </w:tr>
-      <w:tr>
-        <w:trPr>
-          <w:cantSplit/>
-        </w:trPr>
-        <w:tc>
-          <w:tcPr>
-            <w:tcW w:w="3023" w:type="dxa"/>
-          </w:tcPr>
-          <w:p>
-            <w:pPr>
-              <w:pStyle w:val="TableText"/>
-            </w:pPr>
-            <w:r>
-              <w:rPr/>
-              <w:t xml:space="preserve">E1 P0 idle: chuyển giao</w:t>
-            </w:r>
-          </w:p>
-        </w:tc>
-        <w:tc>
-          <w:tcPr>
-            <w:tcW w:w="3023" w:type="dxa"/>
-          </w:tcPr>
-          <w:p>
-            <w:pPr>
-              <w:pStyle w:val="TableText"/>
-            </w:pPr>
-            <w:r>
-              <w:rPr/>
-              <w:t xml:space="preserve">44.37</w:t>
-            </w:r>
-          </w:p>
-        </w:tc>
-        <w:tc>
-          <w:tcPr>
-            <w:tcW w:w="3023" w:type="dxa"/>
-          </w:tcPr>
-          <w:p>
-            <w:pPr>
-              <w:pStyle w:val="TableText"/>
-            </w:pPr>
-            <w:r>
-              <w:rPr/>
-              <w:t xml:space="preserve">48.47</w:t>
-            </w:r>
-          </w:p>
-        </w:tc>
-      </w:tr>
-      <w:tr>
-        <w:trPr>
-          <w:cantSplit/>
-        </w:trPr>
-        <w:tc>
-          <w:tcPr>
-            <w:tcW w:w="3023" w:type="dxa"/>
-          </w:tcPr>
-          <w:p>
-            <w:pPr>
-              <w:pStyle w:val="TableText"/>
-            </w:pPr>
-            <w:r>
-              <w:rPr/>
-              <w:t xml:space="preserve">E1 P0 memrate: chuyển giao</w:t>
-            </w:r>
-          </w:p>
-        </w:tc>
-        <w:tc>
-          <w:tcPr>
-            <w:tcW w:w="3023" w:type="dxa"/>
-          </w:tcPr>
-          <w:p>
-            <w:pPr>
-              <w:pStyle w:val="TableText"/>
-            </w:pPr>
-            <w:r>
-              <w:rPr/>
-              <w:t xml:space="preserve">6626</w:t>
-            </w:r>
-          </w:p>
-        </w:tc>
-        <w:tc>
-          <w:tcPr>
-            <w:tcW w:w="3023" w:type="dxa"/>
-          </w:tcPr>
-          <w:p>
-            <w:pPr>
-              <w:pStyle w:val="TableText"/>
-            </w:pPr>
-            <w:r>
-              <w:rPr/>
-              <w:t xml:space="preserve">13980</w:t>
-            </w:r>
-          </w:p>
-        </w:tc>
-      </w:tr>
-      <w:tr>
-        <w:trPr>
-          <w:cantSplit/>
-        </w:trPr>
-        <w:tc>
-          <w:tcPr>
-            <w:tcW w:w="3023" w:type="dxa"/>
-          </w:tcPr>
-          <w:p>
-            <w:pPr>
-              <w:pStyle w:val="TableText"/>
-            </w:pPr>
-            <w:r>
-              <w:rPr/>
-              <w:t xml:space="preserve">E2 P0 cache: chuyển giao</w:t>
-            </w:r>
-          </w:p>
-        </w:tc>
-        <w:tc>
-          <w:tcPr>
-            <w:tcW w:w="3023" w:type="dxa"/>
-          </w:tcPr>
-          <w:p>
-            <w:pPr>
-              <w:pStyle w:val="TableText"/>
-            </w:pPr>
-            <w:r>
-              <w:rPr/>
-              <w:t xml:space="preserve">66.81</w:t>
-            </w:r>
-          </w:p>
-        </w:tc>
-        <w:tc>
-          <w:tcPr>
-            <w:tcW w:w="3023" w:type="dxa"/>
-          </w:tcPr>
-          <w:p>
-            <w:pPr>
-              <w:pStyle w:val="TableText"/>
-            </w:pPr>
-            <w:r>
-              <w:rPr/>
-              <w:t xml:space="preserve">73.57</w:t>
-            </w:r>
-          </w:p>
-        </w:tc>
-      </w:tr>
-      <w:tr>
-        <w:trPr>
-          <w:cantSplit/>
-        </w:trPr>
-        <w:tc>
-          <w:tcPr>
-            <w:tcW w:w="3023" w:type="dxa"/>
-          </w:tcPr>
-          <w:p>
-            <w:pPr>
-              <w:pStyle w:val="TableText"/>
-            </w:pPr>
-            <w:r>
-              <w:rPr/>
-              <w:t xml:space="preserve">E2 P1 cache: chuyển giao</w:t>
-            </w:r>
-          </w:p>
-        </w:tc>
-        <w:tc>
-          <w:tcPr>
-            <w:tcW w:w="3023" w:type="dxa"/>
-          </w:tcPr>
-          <w:p>
-            <w:pPr>
-              <w:pStyle w:val="TableText"/>
-            </w:pPr>
-            <w:r>
-              <w:rPr/>
-              <w:t xml:space="preserve">70.19</w:t>
-            </w:r>
-          </w:p>
-        </w:tc>
-        <w:tc>
-          <w:tcPr>
-            <w:tcW w:w="3023" w:type="dxa"/>
-          </w:tcPr>
-          <w:p>
-            <w:pPr>
-              <w:pStyle w:val="TableText"/>
-            </w:pPr>
-            <w:r>
-              <w:rPr/>
-              <w:t xml:space="preserve">97.16</w:t>
-            </w:r>
-          </w:p>
-        </w:tc>
-      </w:tr>
-      <w:tr>
-        <w:trPr>
-          <w:cantSplit/>
-        </w:trPr>
-        <w:tc>
-          <w:tcPr>
-            <w:tcW w:w="3023" w:type="dxa"/>
-          </w:tcPr>
-          <w:p>
-            <w:pPr>
-              <w:pStyle w:val="TableText"/>
-            </w:pPr>
-            <w:r>
-              <w:rPr/>
-              <w:t xml:space="preserve">E3 idle FIFO: AoI trung bình / đỉnh</w:t>
-            </w:r>
-          </w:p>
-        </w:tc>
-        <w:tc>
-          <w:tcPr>
-            <w:tcW w:w="3023" w:type="dxa"/>
-          </w:tcPr>
-          <w:p>
-            <w:pPr>
-              <w:pStyle w:val="TableText"/>
-            </w:pPr>
-            <w:r>
-              <w:rPr/>
-              <w:t xml:space="preserve">94.69</w:t>
-            </w:r>
-          </w:p>
-        </w:tc>
-        <w:tc>
-          <w:tcPr>
-            <w:tcW w:w="3023" w:type="dxa"/>
-          </w:tcPr>
-          <w:p>
-            <w:pPr>
-              <w:pStyle w:val="TableText"/>
-            </w:pPr>
-            <w:r>
-              <w:rPr/>
-              <w:t xml:space="preserve">158</w:t>
-            </w:r>
-          </w:p>
-        </w:tc>
-      </w:tr>
-      <w:tr>
-        <w:trPr>
-          <w:cantSplit/>
-        </w:trPr>
-        <w:tc>
-          <w:tcPr>
-            <w:tcW w:w="3023" w:type="dxa"/>
-          </w:tcPr>
-          <w:p>
-            <w:pPr>
-              <w:pStyle w:val="TableText"/>
-            </w:pPr>
-            <w:r>
-              <w:rPr/>
-              <w:t xml:space="preserve">E3 idle latest: AoI trung bình / đỉnh</w:t>
-            </w:r>
-          </w:p>
-        </w:tc>
-        <w:tc>
-          <w:tcPr>
-            <w:tcW w:w="3023" w:type="dxa"/>
-          </w:tcPr>
-          <w:p>
-            <w:pPr>
-              <w:pStyle w:val="TableText"/>
-            </w:pPr>
-            <w:r>
-              <w:rPr/>
-              <w:t xml:space="preserve">94.59</w:t>
-            </w:r>
-          </w:p>
-        </w:tc>
-        <w:tc>
-          <w:tcPr>
-            <w:tcW w:w="3023" w:type="dxa"/>
-          </w:tcPr>
-          <w:p>
-            <w:pPr>
-              <w:pStyle w:val="TableText"/>
-            </w:pPr>
-            <w:r>
-              <w:rPr/>
-              <w:t xml:space="preserve">156</w:t>
-            </w:r>
-          </w:p>
-        </w:tc>
-      </w:tr>
-      <w:tr>
-        <w:trPr>
-          <w:cantSplit/>
-        </w:trPr>
-        <w:tc>
-          <w:tcPr>
-            <w:tcW w:w="3023" w:type="dxa"/>
-          </w:tcPr>
-          <w:p>
-            <w:pPr>
-              <w:pStyle w:val="TableText"/>
-            </w:pPr>
-            <w:r>
-              <w:rPr/>
-              <w:t xml:space="preserve">E3 memrate FIFO: AoI trung bình / đỉnh</w:t>
-            </w:r>
-          </w:p>
-        </w:tc>
-        <w:tc>
-          <w:tcPr>
-            <w:tcW w:w="3023" w:type="dxa"/>
-          </w:tcPr>
-          <w:p>
-            <w:pPr>
-              <w:pStyle w:val="TableText"/>
-            </w:pPr>
-            <w:r>
-              <w:rPr/>
-              <w:t xml:space="preserve">6660</w:t>
-            </w:r>
-          </w:p>
-        </w:tc>
-        <w:tc>
-          <w:tcPr>
-            <w:tcW w:w="3023" w:type="dxa"/>
-          </w:tcPr>
-          <w:p>
-            <w:pPr>
-              <w:pStyle w:val="TableText"/>
-            </w:pPr>
-            <w:r>
-              <w:rPr/>
-              <w:t xml:space="preserve">13660</w:t>
-            </w:r>
-          </w:p>
-        </w:tc>
-      </w:tr>
-      <w:tr>
-        <w:trPr>
-          <w:cantSplit/>
-        </w:trPr>
-        <w:tc>
-          <w:tcPr>
-            <w:tcW w:w="3023" w:type="dxa"/>
-          </w:tcPr>
-          <w:p>
-            <w:pPr>
-              <w:pStyle w:val="TableText"/>
-            </w:pPr>
-            <w:r>
-              <w:rPr/>
-              <w:t xml:space="preserve">E3 memrate latest: AoI trung bình / đỉnh</w:t>
-            </w:r>
-          </w:p>
-        </w:tc>
-        <w:tc>
-          <w:tcPr>
-            <w:tcW w:w="3023" w:type="dxa"/>
-          </w:tcPr>
-          <w:p>
-            <w:pPr>
-              <w:pStyle w:val="TableText"/>
-            </w:pPr>
-            <w:r>
-              <w:rPr/>
-              <w:t xml:space="preserve">6958</w:t>
-            </w:r>
-          </w:p>
-        </w:tc>
-        <w:tc>
-          <w:tcPr>
-            <w:tcW w:w="3023" w:type="dxa"/>
-          </w:tcPr>
-          <w:p>
-            <w:pPr>
-              <w:pStyle w:val="TableText"/>
-            </w:pPr>
-            <w:r>
-              <w:rPr/>
-              <w:t xml:space="preserve">14170</w:t>
+              <w:t xml:space="preserve">P1</w:t>
+            </w:r>
+          </w:p>
+        </w:tc>
+      </w:tr>
+      <w:tr>
+        <w:trPr>
+          <w:cantSplit/>
+        </w:trPr>
+        <w:tc>
+          <w:tcPr>
+            <w:tcW w:w="3023" w:type="dxa"/>
+          </w:tcPr>
+          <w:p>
+            <w:pPr>
+              <w:pStyle w:val="TableText"/>
+            </w:pPr>
+            <w:r>
+              <w:rPr/>
+              <w:t xml:space="preserve">Nhàn rỗi</w:t>
+            </w:r>
+          </w:p>
+        </w:tc>
+        <w:tc>
+          <w:tcPr>
+            <w:tcW w:w="3023" w:type="dxa"/>
+          </w:tcPr>
+          <w:p>
+            <w:pPr>
+              <w:pStyle w:val="TableText"/>
+            </w:pPr>
+            <w:r>
+              <w:rPr/>
+              <w:t xml:space="preserve">57</w:t>
+            </w:r>
+          </w:p>
+        </w:tc>
+        <w:tc>
+          <w:tcPr>
+            <w:tcW w:w="3023" w:type="dxa"/>
+          </w:tcPr>
+          <w:p>
+            <w:pPr>
+              <w:pStyle w:val="TableText"/>
+            </w:pPr>
+            <w:r>
+              <w:rPr/>
+              <w:t xml:space="preserve">9</w:t>
+            </w:r>
+          </w:p>
+        </w:tc>
+      </w:tr>
+      <w:tr>
+        <w:trPr>
+          <w:cantSplit/>
+        </w:trPr>
+        <w:tc>
+          <w:tcPr>
+            <w:tcW w:w="3023" w:type="dxa"/>
+          </w:tcPr>
+          <w:p>
+            <w:pPr>
+              <w:pStyle w:val="TableText"/>
+            </w:pPr>
+            <w:r>
+              <w:rPr/>
+              <w:t xml:space="preserve">Tải băng thông nhớ</w:t>
+            </w:r>
+          </w:p>
+        </w:tc>
+        <w:tc>
+          <w:tcPr>
+            <w:tcW w:w="3023" w:type="dxa"/>
+          </w:tcPr>
+          <w:p>
+            <w:pPr>
+              <w:pStyle w:val="TableText"/>
+            </w:pPr>
+            <w:r>
+              <w:rPr/>
+              <w:t xml:space="preserve">613</w:t>
+            </w:r>
+          </w:p>
+        </w:tc>
+        <w:tc>
+          <w:tcPr>
+            <w:tcW w:w="3023" w:type="dxa"/>
+          </w:tcPr>
+          <w:p>
+            <w:pPr>
+              <w:pStyle w:val="TableText"/>
+            </w:pPr>
+            <w:r>
+              <w:rPr/>
+              <w:t xml:space="preserve">239</w:t>
             </w:r>
           </w:p>
         </w:tc>
@@ -6045,23 +4860,7 @@
       <w:pPr/>
       <w:r>
         <w:rPr/>
-        <w:t xml:space="preserve">E3 thay thế bridge bằng 0: chờ trước inference chưa được giải quyết; E2 cache chưa cải thiện chung. E3b loại đầu vào trước inference; lỗi tách ở Bảng 4. Tỷ lệ thời gian/gói dùng thời lượng/số nhận; latest-value báo số sinh/giao/mất/thay.</w:t>
-      </w:r>
-    </w:p>
-    <w:p>
-      <w:pPr>
-        <w:pStyle w:val="Heading2"/>
-      </w:pPr>
-      <w:r>
-        <w:rPr/>
-        <w:t xml:space="preserve">6.5 UART và lỗi</w:t>
-      </w:r>
-    </w:p>
-    <w:p>
-      <w:pPr/>
-      <w:r>
-        <w:rPr/>
-        <w:t xml:space="preserve">E3 UART: 0/18 hợp lệ, 16/18 cảnh báo nguồn; mọi lượt tải nhớ sai clock. Đo lại 18 lượt đều sụt áp; latest đầu vào/bridge dưới tải: lượt đầu FAILSAFE suốt cửa sổ, sau HOLD 92.15%/91.44%. Chỉ dùng chẩn đoán.</w:t>
+        <w:t xml:space="preserve">Bảng 6 so sánh P99; số lượt hợp lệ giữa các cấu hình khác nhau.</w:t>
       </w:r>
     </w:p>
     <w:p>
@@ -6070,7 +4869,7 @@
       </w:pPr>
       <w:r>
         <w:rPr/>
-        <w:t xml:space="preserve">Bảng 8. MCU chuyển FAILSAFE (ms).</w:t>
+        <w:t xml:space="preserve">Bảng 6. Thời gian gọi MobileNetV2 P99 trước camera, đơn vị ms.</w:t>
       </w:r>
     </w:p>
     <w:tbl>
@@ -6093,11 +4892,9 @@
         </w:tblCellMar>
       </w:tblPr>
       <w:tblGrid>
-        <w:gridCol w:w="1814"/>
-        <w:gridCol w:w="1814"/>
-        <w:gridCol w:w="1814"/>
-        <w:gridCol w:w="1814"/>
-        <w:gridCol w:w="1814"/>
+        <w:gridCol w:w="3023"/>
+        <w:gridCol w:w="3023"/>
+        <w:gridCol w:w="3023"/>
       </w:tblGrid>
       <w:tr>
         <w:trPr>
@@ -6106,7 +4903,7 @@
         </w:trPr>
         <w:tc>
           <w:tcPr>
-            <w:tcW w:w="1814" w:type="dxa"/>
+            <w:tcW w:w="3023" w:type="dxa"/>
             <w:shd w:fill="E8EEF4"/>
             <w:vAlign w:val="center"/>
           </w:tcPr>
@@ -6118,13 +4915,13 @@
               <w:rPr>
                 <w:b/>
               </w:rPr>
-              <w:t xml:space="preserve">Lỗi</w:t>
-            </w:r>
-          </w:p>
-        </w:tc>
-        <w:tc>
-          <w:tcPr>
-            <w:tcW w:w="1814" w:type="dxa"/>
+              <w:t xml:space="preserve">Điều kiện</w:t>
+            </w:r>
+          </w:p>
+        </w:tc>
+        <w:tc>
+          <w:tcPr>
+            <w:tcW w:w="3023" w:type="dxa"/>
             <w:shd w:fill="E8EEF4"/>
             <w:vAlign w:val="center"/>
           </w:tcPr>
@@ -6136,13 +4933,13 @@
               <w:rPr>
                 <w:b/>
               </w:rPr>
-              <w:t xml:space="preserve">Lượt chấp nhận</w:t>
-            </w:r>
-          </w:p>
-        </w:tc>
-        <w:tc>
-          <w:tcPr>
-            <w:tcW w:w="1814" w:type="dxa"/>
+              <w:t xml:space="preserve">1 luồng</w:t>
+            </w:r>
+          </w:p>
+        </w:tc>
+        <w:tc>
+          <w:tcPr>
+            <w:tcW w:w="3023" w:type="dxa"/>
             <w:shd w:fill="E8EEF4"/>
             <w:vAlign w:val="center"/>
           </w:tcPr>
@@ -6154,13 +4951,404 @@
               <w:rPr>
                 <w:b/>
               </w:rPr>
-              <w:t xml:space="preserve">Mốc tham chiếu</w:t>
-            </w:r>
-          </w:p>
-        </w:tc>
-        <w:tc>
-          <w:tcPr>
-            <w:tcW w:w="1814" w:type="dxa"/>
+              <w:t xml:space="preserve">4 luồng</w:t>
+            </w:r>
+          </w:p>
+        </w:tc>
+      </w:tr>
+      <w:tr>
+        <w:trPr>
+          <w:cantSplit/>
+        </w:trPr>
+        <w:tc>
+          <w:tcPr>
+            <w:tcW w:w="3023" w:type="dxa"/>
+          </w:tcPr>
+          <w:p>
+            <w:pPr>
+              <w:pStyle w:val="TableText"/>
+            </w:pPr>
+            <w:r>
+              <w:rPr/>
+              <w:t xml:space="preserve">Nhàn rỗi</w:t>
+            </w:r>
+          </w:p>
+        </w:tc>
+        <w:tc>
+          <w:tcPr>
+            <w:tcW w:w="3023" w:type="dxa"/>
+          </w:tcPr>
+          <w:p>
+            <w:pPr>
+              <w:pStyle w:val="TableText"/>
+            </w:pPr>
+            <w:r>
+              <w:rPr/>
+              <w:t xml:space="preserve">48.0</w:t>
+            </w:r>
+          </w:p>
+        </w:tc>
+        <w:tc>
+          <w:tcPr>
+            <w:tcW w:w="3023" w:type="dxa"/>
+          </w:tcPr>
+          <w:p>
+            <w:pPr>
+              <w:pStyle w:val="TableText"/>
+            </w:pPr>
+            <w:r>
+              <w:rPr/>
+              <w:t xml:space="preserve">70.7</w:t>
+            </w:r>
+          </w:p>
+        </w:tc>
+      </w:tr>
+      <w:tr>
+        <w:trPr>
+          <w:cantSplit/>
+        </w:trPr>
+        <w:tc>
+          <w:tcPr>
+            <w:tcW w:w="3023" w:type="dxa"/>
+          </w:tcPr>
+          <w:p>
+            <w:pPr>
+              <w:pStyle w:val="TableText"/>
+            </w:pPr>
+            <w:r>
+              <w:rPr/>
+              <w:t xml:space="preserve">Tải CPU</w:t>
+            </w:r>
+          </w:p>
+        </w:tc>
+        <w:tc>
+          <w:tcPr>
+            <w:tcW w:w="3023" w:type="dxa"/>
+          </w:tcPr>
+          <w:p>
+            <w:pPr>
+              <w:pStyle w:val="TableText"/>
+            </w:pPr>
+            <w:r>
+              <w:rPr/>
+              <w:t xml:space="preserve">53.7</w:t>
+            </w:r>
+          </w:p>
+        </w:tc>
+        <w:tc>
+          <w:tcPr>
+            <w:tcW w:w="3023" w:type="dxa"/>
+          </w:tcPr>
+          <w:p>
+            <w:pPr>
+              <w:pStyle w:val="TableText"/>
+            </w:pPr>
+            <w:r>
+              <w:rPr/>
+              <w:t xml:space="preserve">100.5</w:t>
+            </w:r>
+          </w:p>
+        </w:tc>
+      </w:tr>
+    </w:tbl>
+    <w:p>
+      <w:pPr>
+        <w:pStyle w:val="Heading2"/>
+      </w:pPr>
+      <w:r>
+        <w:rPr/>
+        <w:t xml:space="preserve">6.4 Vị trí loại dữ liệu cũ</w:t>
+      </w:r>
+    </w:p>
+    <w:p>
+      <w:pPr/>
+      <w:r>
+        <w:rPr/>
+        <w:t xml:space="preserve">Bảng 7 đo từ đầu vào tới bên nhận qua PTY, lặp 3 lần mỗi điều kiện. Khi chỉ đặt latest-value ở bridge, tuổi dữ liệu dưới tải nhớ vẫn lớn. Điều này dẫn tới thử bỏ ảnh cũ trước suy luận ở OS-T4.</w:t>
+      </w:r>
+    </w:p>
+    <w:p>
+      <w:pPr>
+        <w:pStyle w:val="TableCaption"/>
+      </w:pPr>
+      <w:r>
+        <w:rPr/>
+        <w:t xml:space="preserve">Bảng 7. AoI trung bình trước camera khi đổi chính sách tại bridge, đơn vị ms.</w:t>
+      </w:r>
+    </w:p>
+    <w:tbl>
+      <w:tblPr>
+        <w:tblW w:w="9071" w:type="dxa"/>
+        <w:tblBorders>
+          <w:top w:val="single" w:sz="4" w:color="808080"/>
+          <w:left w:val="single" w:sz="4" w:color="808080"/>
+          <w:bottom w:val="single" w:sz="4" w:color="808080"/>
+          <w:right w:val="single" w:sz="4" w:color="808080"/>
+          <w:insideH w:val="single" w:sz="4" w:color="808080"/>
+          <w:insideV w:val="single" w:sz="4" w:color="808080"/>
+        </w:tblBorders>
+        <w:tblLayout w:type="fixed"/>
+        <w:tblCellMar>
+          <w:top w:w="60" w:type="dxa"/>
+          <w:left w:w="115" w:type="dxa"/>
+          <w:bottom w:w="60" w:type="dxa"/>
+          <w:right w:w="115" w:type="dxa"/>
+        </w:tblCellMar>
+      </w:tblPr>
+      <w:tblGrid>
+        <w:gridCol w:w="3023"/>
+        <w:gridCol w:w="3023"/>
+        <w:gridCol w:w="3023"/>
+      </w:tblGrid>
+      <w:tr>
+        <w:trPr>
+          <w:cantSplit/>
+          <w:tblHeader/>
+        </w:trPr>
+        <w:tc>
+          <w:tcPr>
+            <w:tcW w:w="3023" w:type="dxa"/>
+            <w:shd w:fill="E8EEF4"/>
+            <w:vAlign w:val="center"/>
+          </w:tcPr>
+          <w:p>
+            <w:pPr>
+              <w:pStyle w:val="TableText"/>
+            </w:pPr>
+            <w:r>
+              <w:rPr>
+                <w:b/>
+              </w:rPr>
+              <w:t xml:space="preserve">Tải</w:t>
+            </w:r>
+          </w:p>
+        </w:tc>
+        <w:tc>
+          <w:tcPr>
+            <w:tcW w:w="3023" w:type="dxa"/>
+            <w:shd w:fill="E8EEF4"/>
+            <w:vAlign w:val="center"/>
+          </w:tcPr>
+          <w:p>
+            <w:pPr>
+              <w:pStyle w:val="TableText"/>
+            </w:pPr>
+            <w:r>
+              <w:rPr>
+                <w:b/>
+              </w:rPr>
+              <w:t xml:space="preserve">FIFO</w:t>
+            </w:r>
+          </w:p>
+        </w:tc>
+        <w:tc>
+          <w:tcPr>
+            <w:tcW w:w="3023" w:type="dxa"/>
+            <w:shd w:fill="E8EEF4"/>
+            <w:vAlign w:val="center"/>
+          </w:tcPr>
+          <w:p>
+            <w:pPr>
+              <w:pStyle w:val="TableText"/>
+            </w:pPr>
+            <w:r>
+              <w:rPr>
+                <w:b/>
+              </w:rPr>
+              <w:t xml:space="preserve">Latest-value</w:t>
+            </w:r>
+          </w:p>
+        </w:tc>
+      </w:tr>
+      <w:tr>
+        <w:trPr>
+          <w:cantSplit/>
+        </w:trPr>
+        <w:tc>
+          <w:tcPr>
+            <w:tcW w:w="3023" w:type="dxa"/>
+          </w:tcPr>
+          <w:p>
+            <w:pPr>
+              <w:pStyle w:val="TableText"/>
+            </w:pPr>
+            <w:r>
+              <w:rPr/>
+              <w:t xml:space="preserve">Nhàn rỗi</w:t>
+            </w:r>
+          </w:p>
+        </w:tc>
+        <w:tc>
+          <w:tcPr>
+            <w:tcW w:w="3023" w:type="dxa"/>
+          </w:tcPr>
+          <w:p>
+            <w:pPr>
+              <w:pStyle w:val="TableText"/>
+            </w:pPr>
+            <w:r>
+              <w:rPr/>
+              <w:t xml:space="preserve">94.69</w:t>
+            </w:r>
+          </w:p>
+        </w:tc>
+        <w:tc>
+          <w:tcPr>
+            <w:tcW w:w="3023" w:type="dxa"/>
+          </w:tcPr>
+          <w:p>
+            <w:pPr>
+              <w:pStyle w:val="TableText"/>
+            </w:pPr>
+            <w:r>
+              <w:rPr/>
+              <w:t xml:space="preserve">94.59</w:t>
+            </w:r>
+          </w:p>
+        </w:tc>
+      </w:tr>
+      <w:tr>
+        <w:trPr>
+          <w:cantSplit/>
+        </w:trPr>
+        <w:tc>
+          <w:tcPr>
+            <w:tcW w:w="3023" w:type="dxa"/>
+          </w:tcPr>
+          <w:p>
+            <w:pPr>
+              <w:pStyle w:val="TableText"/>
+            </w:pPr>
+            <w:r>
+              <w:rPr/>
+              <w:t xml:space="preserve">Tải băng thông nhớ</w:t>
+            </w:r>
+          </w:p>
+        </w:tc>
+        <w:tc>
+          <w:tcPr>
+            <w:tcW w:w="3023" w:type="dxa"/>
+          </w:tcPr>
+          <w:p>
+            <w:pPr>
+              <w:pStyle w:val="TableText"/>
+            </w:pPr>
+            <w:r>
+              <w:rPr/>
+              <w:t xml:space="preserve">6660</w:t>
+            </w:r>
+          </w:p>
+        </w:tc>
+        <w:tc>
+          <w:tcPr>
+            <w:tcW w:w="3023" w:type="dxa"/>
+          </w:tcPr>
+          <w:p>
+            <w:pPr>
+              <w:pStyle w:val="TableText"/>
+            </w:pPr>
+            <w:r>
+              <w:rPr/>
+              <w:t xml:space="preserve">6958</w:t>
+            </w:r>
+          </w:p>
+        </w:tc>
+      </w:tr>
+    </w:tbl>
+    <w:p>
+      <w:pPr>
+        <w:pStyle w:val="Heading2"/>
+      </w:pPr>
+      <w:r>
+        <w:rPr/>
+        <w:t xml:space="preserve">6.5 UART và phản ứng khi lỗi</w:t>
+      </w:r>
+    </w:p>
+    <w:p>
+      <w:pPr/>
+      <w:r>
+        <w:rPr/>
+        <w:t xml:space="preserve">Các lượt UART cũ có sụt áp, sai lệch đồng hồ hoặc thiếu bản ghi, nên chỉ dùng chẩn đoán. Bảng 8 giữ phản ứng khi chủ động dừng bridge hoặc suy luận để kiểm tra hai đường giám sát riêng. Mỗi tình huống có 5/5 lượt được chấp nhận trong cửa sổ quan sát ngắn.</w:t>
+      </w:r>
+    </w:p>
+    <w:p>
+      <w:pPr>
+        <w:pStyle w:val="TableCaption"/>
+      </w:pPr>
+      <w:r>
+        <w:rPr/>
+        <w:t xml:space="preserve">Bảng 8. Thời gian MCU chuyển FAILSAFE, đơn vị ms.</w:t>
+      </w:r>
+    </w:p>
+    <w:tbl>
+      <w:tblPr>
+        <w:tblW w:w="9071" w:type="dxa"/>
+        <w:tblBorders>
+          <w:top w:val="single" w:sz="4" w:color="808080"/>
+          <w:left w:val="single" w:sz="4" w:color="808080"/>
+          <w:bottom w:val="single" w:sz="4" w:color="808080"/>
+          <w:right w:val="single" w:sz="4" w:color="808080"/>
+          <w:insideH w:val="single" w:sz="4" w:color="808080"/>
+          <w:insideV w:val="single" w:sz="4" w:color="808080"/>
+        </w:tblBorders>
+        <w:tblLayout w:type="fixed"/>
+        <w:tblCellMar>
+          <w:top w:w="60" w:type="dxa"/>
+          <w:left w:w="115" w:type="dxa"/>
+          <w:bottom w:w="60" w:type="dxa"/>
+          <w:right w:w="115" w:type="dxa"/>
+        </w:tblCellMar>
+      </w:tblPr>
+      <w:tblGrid>
+        <w:gridCol w:w="2267"/>
+        <w:gridCol w:w="2267"/>
+        <w:gridCol w:w="2267"/>
+        <w:gridCol w:w="2267"/>
+      </w:tblGrid>
+      <w:tr>
+        <w:trPr>
+          <w:cantSplit/>
+          <w:tblHeader/>
+        </w:trPr>
+        <w:tc>
+          <w:tcPr>
+            <w:tcW w:w="2267" w:type="dxa"/>
+            <w:shd w:fill="E8EEF4"/>
+            <w:vAlign w:val="center"/>
+          </w:tcPr>
+          <w:p>
+            <w:pPr>
+              <w:pStyle w:val="TableText"/>
+            </w:pPr>
+            <w:r>
+              <w:rPr>
+                <w:b/>
+              </w:rPr>
+              <w:t xml:space="preserve">Tình huống</w:t>
+            </w:r>
+          </w:p>
+        </w:tc>
+        <w:tc>
+          <w:tcPr>
+            <w:tcW w:w="2267" w:type="dxa"/>
+            <w:shd w:fill="E8EEF4"/>
+            <w:vAlign w:val="center"/>
+          </w:tcPr>
+          <w:p>
+            <w:pPr>
+              <w:pStyle w:val="TableText"/>
+            </w:pPr>
+            <w:r>
+              <w:rPr>
+                <w:b/>
+              </w:rPr>
+              <w:t xml:space="preserve">Tính từ</w:t>
+            </w:r>
+          </w:p>
+        </w:tc>
+        <w:tc>
+          <w:tcPr>
+            <w:tcW w:w="2267" w:type="dxa"/>
             <w:shd w:fill="E8EEF4"/>
             <w:vAlign w:val="center"/>
           </w:tcPr>
@@ -6178,7 +5366,7 @@
         </w:tc>
         <w:tc>
           <w:tcPr>
-            <w:tcW w:w="1814" w:type="dxa"/>
+            <w:tcW w:w="2267" w:type="dxa"/>
             <w:shd w:fill="E8EEF4"/>
             <w:vAlign w:val="center"/>
           </w:tcPr>
@@ -6201,49 +5389,35 @@
         </w:trPr>
         <w:tc>
           <w:tcPr>
-            <w:tcW w:w="1814" w:type="dxa"/>
-          </w:tcPr>
-          <w:p>
-            <w:pPr>
-              <w:pStyle w:val="TableText"/>
-            </w:pPr>
-            <w:r>
-              <w:rPr/>
-              <w:t xml:space="preserve">F1 kết thúc bridge</w:t>
-            </w:r>
-          </w:p>
-        </w:tc>
-        <w:tc>
-          <w:tcPr>
-            <w:tcW w:w="1814" w:type="dxa"/>
-          </w:tcPr>
-          <w:p>
-            <w:pPr>
-              <w:pStyle w:val="TableText"/>
-            </w:pPr>
-            <w:r>
-              <w:rPr/>
-              <w:t xml:space="preserve">5/5</w:t>
-            </w:r>
-          </w:p>
-        </w:tc>
-        <w:tc>
-          <w:tcPr>
-            <w:tcW w:w="1814" w:type="dxa"/>
-          </w:tcPr>
-          <w:p>
-            <w:pPr>
-              <w:pStyle w:val="TableText"/>
-            </w:pPr>
-            <w:r>
-              <w:rPr/>
-              <w:t xml:space="preserve">Heartbeat cuối</w:t>
-            </w:r>
-          </w:p>
-        </w:tc>
-        <w:tc>
-          <w:tcPr>
-            <w:tcW w:w="1814" w:type="dxa"/>
+            <w:tcW w:w="2267" w:type="dxa"/>
+          </w:tcPr>
+          <w:p>
+            <w:pPr>
+              <w:pStyle w:val="TableText"/>
+            </w:pPr>
+            <w:r>
+              <w:rPr/>
+              <w:t xml:space="preserve">Kết thúc bridge</w:t>
+            </w:r>
+          </w:p>
+        </w:tc>
+        <w:tc>
+          <w:tcPr>
+            <w:tcW w:w="2267" w:type="dxa"/>
+          </w:tcPr>
+          <w:p>
+            <w:pPr>
+              <w:pStyle w:val="TableText"/>
+            </w:pPr>
+            <w:r>
+              <w:rPr/>
+              <w:t xml:space="preserve">Tín hiệu còn hoạt động cuối</w:t>
+            </w:r>
+          </w:p>
+        </w:tc>
+        <w:tc>
+          <w:tcPr>
+            <w:tcW w:w="2267" w:type="dxa"/>
           </w:tcPr>
           <w:p>
             <w:pPr>
@@ -6257,7 +5431,7 @@
         </w:tc>
         <w:tc>
           <w:tcPr>
-            <w:tcW w:w="1814" w:type="dxa"/>
+            <w:tcW w:w="2267" w:type="dxa"/>
           </w:tcPr>
           <w:p>
             <w:pPr>
@@ -6276,49 +5450,35 @@
         </w:trPr>
         <w:tc>
           <w:tcPr>
-            <w:tcW w:w="1814" w:type="dxa"/>
-          </w:tcPr>
-          <w:p>
-            <w:pPr>
-              <w:pStyle w:val="TableText"/>
-            </w:pPr>
-            <w:r>
-              <w:rPr/>
-              <w:t xml:space="preserve">F2 SIGSTOP bridge</w:t>
-            </w:r>
-          </w:p>
-        </w:tc>
-        <w:tc>
-          <w:tcPr>
-            <w:tcW w:w="1814" w:type="dxa"/>
-          </w:tcPr>
-          <w:p>
-            <w:pPr>
-              <w:pStyle w:val="TableText"/>
-            </w:pPr>
-            <w:r>
-              <w:rPr/>
-              <w:t xml:space="preserve">5/5</w:t>
-            </w:r>
-          </w:p>
-        </w:tc>
-        <w:tc>
-          <w:tcPr>
-            <w:tcW w:w="1814" w:type="dxa"/>
-          </w:tcPr>
-          <w:p>
-            <w:pPr>
-              <w:pStyle w:val="TableText"/>
-            </w:pPr>
-            <w:r>
-              <w:rPr/>
-              <w:t xml:space="preserve">Heartbeat cuối</w:t>
-            </w:r>
-          </w:p>
-        </w:tc>
-        <w:tc>
-          <w:tcPr>
-            <w:tcW w:w="1814" w:type="dxa"/>
+            <w:tcW w:w="2267" w:type="dxa"/>
+          </w:tcPr>
+          <w:p>
+            <w:pPr>
+              <w:pStyle w:val="TableText"/>
+            </w:pPr>
+            <w:r>
+              <w:rPr/>
+              <w:t xml:space="preserve">Tạm dừng bridge</w:t>
+            </w:r>
+          </w:p>
+        </w:tc>
+        <w:tc>
+          <w:tcPr>
+            <w:tcW w:w="2267" w:type="dxa"/>
+          </w:tcPr>
+          <w:p>
+            <w:pPr>
+              <w:pStyle w:val="TableText"/>
+            </w:pPr>
+            <w:r>
+              <w:rPr/>
+              <w:t xml:space="preserve">Tín hiệu còn hoạt động cuối</w:t>
+            </w:r>
+          </w:p>
+        </w:tc>
+        <w:tc>
+          <w:tcPr>
+            <w:tcW w:w="2267" w:type="dxa"/>
           </w:tcPr>
           <w:p>
             <w:pPr>
@@ -6332,7 +5492,7 @@
         </w:tc>
         <w:tc>
           <w:tcPr>
-            <w:tcW w:w="1814" w:type="dxa"/>
+            <w:tcW w:w="2267" w:type="dxa"/>
           </w:tcPr>
           <w:p>
             <w:pPr>
@@ -6351,49 +5511,35 @@
         </w:trPr>
         <w:tc>
           <w:tcPr>
-            <w:tcW w:w="1814" w:type="dxa"/>
-          </w:tcPr>
-          <w:p>
-            <w:pPr>
-              <w:pStyle w:val="TableText"/>
-            </w:pPr>
-            <w:r>
-              <w:rPr/>
-              <w:t xml:space="preserve">F3 SIGSTOP inference</w:t>
-            </w:r>
-          </w:p>
-        </w:tc>
-        <w:tc>
-          <w:tcPr>
-            <w:tcW w:w="1814" w:type="dxa"/>
-          </w:tcPr>
-          <w:p>
-            <w:pPr>
-              <w:pStyle w:val="TableText"/>
-            </w:pPr>
-            <w:r>
-              <w:rPr/>
-              <w:t xml:space="preserve">5/5</w:t>
-            </w:r>
-          </w:p>
-        </w:tc>
-        <w:tc>
-          <w:tcPr>
-            <w:tcW w:w="1814" w:type="dxa"/>
-          </w:tcPr>
-          <w:p>
-            <w:pPr>
-              <w:pStyle w:val="TableText"/>
-            </w:pPr>
-            <w:r>
-              <w:rPr/>
-              <w:t xml:space="preserve">Inference cuối</w:t>
-            </w:r>
-          </w:p>
-        </w:tc>
-        <w:tc>
-          <w:tcPr>
-            <w:tcW w:w="1814" w:type="dxa"/>
+            <w:tcW w:w="2267" w:type="dxa"/>
+          </w:tcPr>
+          <w:p>
+            <w:pPr>
+              <w:pStyle w:val="TableText"/>
+            </w:pPr>
+            <w:r>
+              <w:rPr/>
+              <w:t xml:space="preserve">Tạm dừng suy luận</w:t>
+            </w:r>
+          </w:p>
+        </w:tc>
+        <w:tc>
+          <w:tcPr>
+            <w:tcW w:w="2267" w:type="dxa"/>
+          </w:tcPr>
+          <w:p>
+            <w:pPr>
+              <w:pStyle w:val="TableText"/>
+            </w:pPr>
+            <w:r>
+              <w:rPr/>
+              <w:t xml:space="preserve">Kết quả cuối</w:t>
+            </w:r>
+          </w:p>
+        </w:tc>
+        <w:tc>
+          <w:tcPr>
+            <w:tcW w:w="2267" w:type="dxa"/>
           </w:tcPr>
           <w:p>
             <w:pPr>
@@ -6407,7 +5553,7 @@
         </w:tc>
         <w:tc>
           <w:tcPr>
-            <w:tcW w:w="1814" w:type="dxa"/>
+            <w:tcW w:w="2267" w:type="dxa"/>
           </w:tcPr>
           <w:p>
             <w:pPr>
@@ -6426,49 +5572,35 @@
         </w:trPr>
         <w:tc>
           <w:tcPr>
-            <w:tcW w:w="1814" w:type="dxa"/>
-          </w:tcPr>
-          <w:p>
-            <w:pPr>
-              <w:pStyle w:val="TableText"/>
-            </w:pPr>
-            <w:r>
-              <w:rPr/>
-              <w:t xml:space="preserve">F5 ngừng inference, HB còn</w:t>
-            </w:r>
-          </w:p>
-        </w:tc>
-        <w:tc>
-          <w:tcPr>
-            <w:tcW w:w="1814" w:type="dxa"/>
-          </w:tcPr>
-          <w:p>
-            <w:pPr>
-              <w:pStyle w:val="TableText"/>
-            </w:pPr>
-            <w:r>
-              <w:rPr/>
-              <w:t xml:space="preserve">5/5</w:t>
-            </w:r>
-          </w:p>
-        </w:tc>
-        <w:tc>
-          <w:tcPr>
-            <w:tcW w:w="1814" w:type="dxa"/>
-          </w:tcPr>
-          <w:p>
-            <w:pPr>
-              <w:pStyle w:val="TableText"/>
-            </w:pPr>
-            <w:r>
-              <w:rPr/>
-              <w:t xml:space="preserve">Inference cuối</w:t>
-            </w:r>
-          </w:p>
-        </w:tc>
-        <w:tc>
-          <w:tcPr>
-            <w:tcW w:w="1814" w:type="dxa"/>
+            <w:tcW w:w="2267" w:type="dxa"/>
+          </w:tcPr>
+          <w:p>
+            <w:pPr>
+              <w:pStyle w:val="TableText"/>
+            </w:pPr>
+            <w:r>
+              <w:rPr/>
+              <w:t xml:space="preserve">Ngừng suy luận, bridge vẫn báo hoạt động</w:t>
+            </w:r>
+          </w:p>
+        </w:tc>
+        <w:tc>
+          <w:tcPr>
+            <w:tcW w:w="2267" w:type="dxa"/>
+          </w:tcPr>
+          <w:p>
+            <w:pPr>
+              <w:pStyle w:val="TableText"/>
+            </w:pPr>
+            <w:r>
+              <w:rPr/>
+              <w:t xml:space="preserve">Kết quả cuối</w:t>
+            </w:r>
+          </w:p>
+        </w:tc>
+        <w:tc>
+          <w:tcPr>
+            <w:tcW w:w="2267" w:type="dxa"/>
           </w:tcPr>
           <w:p>
             <w:pPr>
@@ -6482,7 +5614,7 @@
         </w:tc>
         <w:tc>
           <w:tcPr>
-            <w:tcW w:w="1814" w:type="dxa"/>
+            <w:tcW w:w="2267" w:type="dxa"/>
           </w:tcPr>
           <w:p>
             <w:pPr>
@@ -6500,14 +5632,7 @@
       <w:pPr/>
       <w:r>
         <w:rPr/>
-        <w:t xml:space="preserve">Ngưỡng heartbeat/HOLD/FAILSAFE: 100/200/500 ms. Khác mốc: không gộp latency. Tuổi lúc gửi và dự phòng 5 ms giải thích khoảng sau nhận dưới 500 ms; HOLD khác heartbeat timeout.</w:t>
-      </w:r>
-    </w:p>
-    <w:p>
-      <w:pPr/>
-      <w:r>
-        <w:rPr/>
-        <w:t xml:space="preserve">GPIO: F1 86.938–95.541 ms; F2 86.947–98.676 ms (gồm lượt kiểm tra); F4 82.852–91.302 ms. Có 10/15 lần khớp heartbeat trong 0.07 ms; 5 lần có frame sau heartbeat cuối được chấp nhận.</w:t>
+        <w:t xml:space="preserve">Ngưỡng mất hoạt động là 100 ms; ngưỡng HOLD/FAILSAFE theo tuổi là 200/500 ms. Hai loại lỗi dùng mốc tham chiếu khác nhau nên không gộp độ trễ. Tuổi lúc gửi và dự phòng truyền 5 ms giải thích vì sao khoảng sau nhận có thể dưới 500 ms; các số đo này chưa xác lập giới hạn phản ứng lớn nhất.</w:t>
       </w:r>
     </w:p>
     <w:p>
@@ -6532,7 +5657,21 @@
       <w:pPr/>
       <w:r>
         <w:rPr/>
-        <w:t xml:space="preserve">RQ1/RQ2: tải nhớ ảnh hưởng tail latency; priority chưa cô lập tài nguyên. Memory locking, affinity (ràng buộc CPU) và priority cần thử loại trừ riêng. RQ3: bỏ đầu vào trước inference tác động đoạn tuổi khác với bỏ kết quả tại bridge. RQ4: log MCU/GPIO cho thấy phản ứng, chưa xác lập cận trên. Trạng thái và nguyên nhân OS-T3/OS-T4 FAIL được giữ ở Bảng 3.</w:t>
+        <w:t xml:space="preserve">Tải bộ nhớ làm tăng mạnh thời gian xử lý, trong khi ưu tiên CPU chưa cô lập được tài nguyên dùng chung. Cần thử riêng từng thay đổi về độ ưu tiên, gắn lõi và giữ trang nhớ để biết yếu tố nào có tác dụng.</w:t>
+      </w:r>
+    </w:p>
+    <w:p>
+      <w:pPr/>
+      <w:r>
+        <w:rPr/>
+        <w:t xml:space="preserve">Bỏ ảnh cũ trước suy luận làm giảm tuổi dữ liệu ở bên nhận; bỏ kết quả tại bridge chỉ tác động tới phần chờ truyền. Tuy nhiên, khi bản thân suy luận quá chậm, latest-value vẫn không giữ được dữ liệu dưới ngưỡng tuổi.</w:t>
+      </w:r>
+    </w:p>
+    <w:p>
+      <w:pPr/>
+      <w:r>
+        <w:rPr/>
+        <w:t xml:space="preserve">Các phép thử lỗi ghi nhận STM32 chuyển trạng thái khi bridge hoặc suy luận dừng. Chúng chưa xác lập thời gian phản ứng lớn nhất trong mọi tình huống.</w:t>
       </w:r>
     </w:p>
     <w:p>
@@ -6548,14 +5687,21 @@
       <w:pPr/>
       <w:r>
         <w:rPr/>
-        <w:t xml:space="preserve">Sụt áp, khác biệt governor (chế độ điều chỉnh tần số) và số luồng hạn chế so sánh. Cyclictest có tải thiếu xác nhận tải hoạt động liên tục; pipeline lịch sử thiếu theo dõi toàn cửa sổ. Mẫu điện áp định kỳ có thể bỏ lỡ nhiễu ngắn; cờ nguồn cũ phải tách khỏi cảnh báo trong lượt. Nhiều mẫu tương quan không thay được lần chạy độc lập.</w:t>
-      </w:r>
-    </w:p>
-    <w:p>
-      <w:pPr/>
-      <w:r>
-        <w:rPr/>
-        <w:t xml:space="preserve">Ánh xạ clock phụ thuộc echo và độ mới phép khớp. Task FIFO khi tiêm lỗi có thể làm bridge thiếu CPU, gián đoạn quan sát; thiếu STATE_EVENT chưa chứng minh MCU luôn FRESH. Nhóm không tự điền tỷ lệ thời gian. Bằng chứng chưa xác nhận an toàn robot, stack dài hạn, DMA không giới hạn hoặc watchdog độc lập. GPIO thấp là quy ước mô phỏng; tắt động cơ có thể làm robot mất cân bằng.</w:t>
+        <w:t xml:space="preserve">Sụt áp, khác biệt chế độ điều chỉnh tần số và số luồng hạn chế khả năng so sánh các lượt cũ. Một số lượt thiếu bằng chứng tải hoạt động liên tục hoặc thiếu theo dõi toàn thời gian. Đo điện áp định kỳ có thể bỏ lỡ nhiễu ngắn; nhiều mẫu trong một lượt không thay thế được các lần chạy độc lập.</w:t>
+      </w:r>
+    </w:p>
+    <w:p>
+      <w:pPr/>
+      <w:r>
+        <w:rPr/>
+        <w:t xml:space="preserve">Đối chiếu đồng hồ phụ thuộc trao đổi phản hồi và độ mới của phép khớp. Khi tiêm lỗi, công việc ưu tiên cao có thể khiến bridge thiếu CPU và làm gián đoạn ghi nhận trạng thái. Thiếu bản ghi không chứng minh MCU luôn ở FRESH, nên nhóm không tự điền tỷ lệ thời gian cho khoảng thiếu.</w:t>
+      </w:r>
+    </w:p>
+    <w:p>
+      <w:pPr/>
+      <w:r>
+        <w:rPr/>
+        <w:t xml:space="preserve">Bằng chứng hiện có chưa xác nhận an toàn robot, mức dùng ngăn xếp dài hạn hoặc khả năng nhận DMA khi tải kéo dài. Với robot thật, tắt động cơ có thể gây mất cân bằng và cần chính sách riêng.</w:t>
       </w:r>
     </w:p>
     <w:p>
@@ -6580,7 +5726,7 @@
       <w:pPr/>
       <w:r>
         <w:rPr/>
-        <w:t xml:space="preserve">Bảng 9 ưu tiên OS-T3/T4 và UART. Lưu cấu hình, lệnh, log thô, tóm tắt; metadata (thông tin mô tả) phân biệt Pi 4 GB hiện tại/8 GB lịch sử. Không đổi ngưỡng sau xem dữ liệu; hoàn tất dự kiến 30/11/2026.</w:t>
+        <w:t xml:space="preserve">Nhóm lưu cấu hình và dữ liệu gốc để có thể lặp lại phép đo, không đổi ngưỡng sau khi xem kết quả. Mốc hoàn tất dự kiến là 30/11/2026.</w:t>
       </w:r>
     </w:p>
     <w:p>
@@ -6589,7 +5735,7 @@
       </w:pPr>
       <w:r>
         <w:rPr/>
-        <w:t xml:space="preserve">Bảng 9. Kế hoạch kiểm thử và hoàn thiện cuối kỳ (dự kiến).</w:t>
+        <w:t xml:space="preserve">Bảng 9. Kế hoạch kiểm thử và hoàn thiện cuối kỳ.</w:t>
       </w:r>
     </w:p>
     <w:tbl>
@@ -6685,7 +5831,7 @@
             </w:pPr>
             <w:r>
               <w:rPr/>
-              <w:t xml:space="preserve">Củng cố T1/T2; bổ sung lượt và cyclictest max cho T3; ghi queue length (độ dài queue), chạy mixed (tải hỗn hợp) cho T4</w:t>
+              <w:t xml:space="preserve">Củng cố OS-T1/T2; bổ sung lượt và độ trễ đánh thức lớn nhất cho OS-T3; đo độ dài hàng đợi, thêm tải hỗn hợp cho OS-T4.</w:t>
             </w:r>
           </w:p>
         </w:tc>
@@ -6718,7 +5864,7 @@
             </w:pPr>
             <w:r>
               <w:rPr/>
-              <w:t xml:space="preserve">OS-T5: UART 921600 baud theo runbook; 10.000 frame hợp lệ, chèn CRC sai/cụt/sai version; không nhận frame lỗi, RTT P99 &lt; 5 ms</w:t>
+              <w:t xml:space="preserve">OS-T5: UART 921600 baud; 10.000 khung hợp lệ, chèn khung lỗi; không nhận khung lỗi, RTT P99 &lt; 5 ms.</w:t>
             </w:r>
           </w:p>
         </w:tc>
@@ -6751,7 +5897,7 @@
             </w:pPr>
             <w:r>
               <w:rPr/>
-              <w:t xml:space="preserve">OS-T6: kill bridge, SIGSTOP inference, FIFO CPU hog, dữ liệu cũ nhưng HB còn; 10 lần mỗi lỗi; đối chiếu LED/MCU, latch và rearm; chạy bình thường 30 phút</w:t>
+              <w:t xml:space="preserve">OS-T6: dừng bridge, suy luận hoặc gây chiếm CPU; 10 lần mỗi lỗi; kiểm LED, chốt lỗi và tái kích hoạt; chạy bình thường 30 phút.</w:t>
             </w:r>
           </w:p>
         </w:tc>
@@ -6784,7 +5930,7 @@
             </w:pPr>
             <w:r>
               <w:rPr/>
-              <w:t xml:space="preserve">OS-T7 mở rộng sau T5/T6: task MPU6050 200 Hz khi UART rảnh, dồn frame tốt và frame lỗi; mục tiêu jitter P99 &lt; 100 µs, không lỡ mẫu</w:t>
+              <w:t xml:space="preserve">OS-T7 sau OS-T5/T6: lấy mẫu MPU6050 200 Hz khi UART rảnh và dồn khung; biến thiên P99 &lt; 100 µs, không lỡ mẫu.</w:t>
             </w:r>
           </w:p>
         </w:tc>
@@ -6817,7 +5963,7 @@
             </w:pPr>
             <w:r>
               <w:rPr/>
-              <w:t xml:space="preserve">OS-T8: rà soát kịch bản mở rộng trong phạm vi UART; không triển khai CAN</w:t>
+              <w:t xml:space="preserve">OS-T8: rà soát kịch bản mở rộng trong phạm vi UART.</w:t>
             </w:r>
           </w:p>
         </w:tc>
@@ -6850,7 +5996,7 @@
             </w:pPr>
             <w:r>
               <w:rPr/>
-              <w:t xml:space="preserve">Bổ sung phép đo thiếu; tổng hợp PASS/FAIL, bất định; hoàn thiện báo cáo, slide và demo camera → inference → UART → LED</w:t>
+              <w:t xml:space="preserve">Bổ sung phép đo thiếu; tổng hợp kết quả và bất định; hoàn thiện báo cáo, slide, trình diễn camera → suy luận → UART → LED.</w:t>
             </w:r>
           </w:p>
         </w:tc>
@@ -6862,14 +6008,21 @@
       </w:pPr>
       <w:r>
         <w:rPr/>
-        <w:t xml:space="preserve">8.2 Điều kiện phép đo và bench</w:t>
-      </w:r>
-    </w:p>
-    <w:p>
-      <w:pPr/>
-      <w:r>
-        <w:rPr/>
-        <w:t xml:space="preserve">Mặc định ba lượt năm phút; mục tiêu năm lượt hợp lệ, trừ kịch bản riêng. Kiểm throttle 0x0 trước/sau, governor performance, metadata, tải toàn cửa sổ. OS-T2 đối chiếu log với 1.000 warm-up (lượt làm nóng), 5.000 inference/số luồng. Đổi firmware cần sao lưu image (ảnh firmware), kiểm hash (mã băm) và read-back (đọc lại) theo runbook (hướng dẫn thao tác). UART dùng 921600 baud thay 115200 của bảng cũ.</w:t>
+        <w:t xml:space="preserve">8.2 Điều kiện phép đo và bàn thử</w:t>
+      </w:r>
+    </w:p>
+    <w:p>
+      <w:pPr/>
+      <w:r>
+        <w:rPr/>
+        <w:t xml:space="preserve">Mặc định đo ba lượt, mỗi lượt năm phút, hướng tới năm lượt hợp lệ trừ kịch bản riêng. Cần giữ chế độ tần số performance, xác nhận không bị giới hạn do nguồn hoặc nhiệt và theo dõi tải suốt lượt. Hồ sơ phép đo phân biệt Pi 4 GB hiện tại với Pi 8 GB trong dữ liệu cũ.</w:t>
+      </w:r>
+    </w:p>
+    <w:p>
+      <w:pPr/>
+      <w:r>
+        <w:rPr/>
+        <w:t xml:space="preserve">OS-T2 giữ 1.000 lần làm nóng và 5.000 mẫu mỗi số luồng. Khi đổi firmware, cần sao lưu, kiểm tra bản nạp và đọc lại theo hướng dẫn thao tác.</w:t>
       </w:r>
     </w:p>
     <w:p>
@@ -6885,7 +6038,7 @@
       <w:pPr/>
       <w:r>
         <w:rPr/>
-        <w:t xml:space="preserve">Nền tảng cho phép khảo sát workload Linux biến thiên và giám sát FreeRTOS qua UART. OS-T1/OS-T2 PASS; OS-T3/OS-T4 còn FAIL theo Bảng 3. Kết quả nhấn mạnh giới hạn của ưu tiên CPU và vai trò vị trí loại dữ liệu cũ. Supervisor cần kiểm cả liveness lẫn freshness. Nhóm sẽ bổ sung số lượt, cyclictest max, bằng chứng queue và kiểm chứng UART có MCU trước khi mở rộng kết luận.</w:t>
+        <w:t xml:space="preserve">Nền tảng dùng tải suy luận trên Linux và giám sát FreeRTOS qua UART để khảo sát độ trễ và tuổi dữ liệu. OS-T1/OS-T2 PASS; OS-T3/OS-T4 còn FAIL theo Bảng 3. Kết quả cho thấy giới hạn của ưu tiên CPU và vai trò của việc bỏ ảnh cũ trước suy luận. Khối giám sát cần kiểm cả tình trạng hoạt động lẫn độ mới. Nhóm sẽ bổ sung số lượt, độ dài hàng đợi và phép đo UART có MCU trước khi mở rộng kết luận.</w:t>
       </w:r>
     </w:p>
     <w:p>

</xml_diff>